<commit_message>
docs: client communication, requirement changes, design and development — revision 1.1
- EM26-27 Client Communication Record (new Word document) and log rev 1.1: every
  client and internal meeting Aug 2025 → Aug 2026 with feedback, decision, actions,
  requirements affected (FR/NFR) and where the meeting is recorded (EM26-19 / EM26-28)
- EM26-30 Requirement Change Record rev 1.1: reason, requester, meeting record,
  impact, decision, implementation (commit — version), verification; requirements
  added from internal reviews; requests not yet accepted
- EM26-31 Design and Development Record rev 1.1: design inputs from the FR/NFR
  registers; options evaluated and decisions (conversation, DoD FMR retrieval,
  hotspot, transcript accuracy, LLM speed, Silent Assistant, Boardroom, Document
  Studio) with the meeting where each was decided
Issued for approval. Public copy: clients as Client A–E.

Co-Authored-By: Claude Opus 5.5 <noreply@anthropic.com>
</commit_message>
<xml_diff>
--- a/docs/EchoMind_Audit_2026-10-14_Project2/05_Changes_to_Requirements/EM26-30_Requirement_Change_Record.docx
+++ b/docs/EchoMind_Audit_2026-10-14_Project2/05_Changes_to_Requirements/EM26-30_Requirement_Change_Record.docx
@@ -301,7 +301,7 @@
                 <w:sz w:val="17"/>
                 <w:szCs w:val="17"/>
               </w:rPr>
-              <w:t xml:space="preserve">1.0</w:t>
+              <w:t xml:space="preserve">1.1</w:t>
             </w:r>
           </w:p>
         </w:tc>
@@ -421,7 +421,7 @@
                 <w:sz w:val="17"/>
                 <w:szCs w:val="17"/>
               </w:rPr>
-              <w:t xml:space="preserve">APPROVED — 2026-10-14 (AR-2026-006)</w:t>
+              <w:t xml:space="preserve">Rev 1.1 issued for approval; rev 1.0 approved 2026-10-14 (AR-2026-006)</w:t>
             </w:r>
           </w:p>
         </w:tc>
@@ -632,7 +632,7 @@
                 <w:sz w:val="17"/>
                 <w:szCs w:val="17"/>
               </w:rPr>
-              <w:t xml:space="preserve">Prepared by</w:t>
+              <w:t xml:space="preserve">Registers</w:t>
             </w:r>
           </w:p>
         </w:tc>
@@ -661,7 +661,7 @@
                 <w:sz w:val="17"/>
                 <w:szCs w:val="17"/>
               </w:rPr>
-              <w:t xml:space="preserve">Richard Watson Stephen Amudha (Lead Engineer) — 2026-10-14</w:t>
+              <w:t xml:space="preserve">EM26-20 (functional), EM26-21 (non-functional)</w:t>
             </w:r>
           </w:p>
         </w:tc>
@@ -692,7 +692,7 @@
                 <w:sz w:val="17"/>
                 <w:szCs w:val="17"/>
               </w:rPr>
-              <w:t xml:space="preserve">Reviewed by</w:t>
+              <w:t xml:space="preserve">Prepared by</w:t>
             </w:r>
           </w:p>
         </w:tc>
@@ -721,7 +721,7 @@
                 <w:sz w:val="17"/>
                 <w:szCs w:val="17"/>
               </w:rPr>
-              <w:t xml:space="preserve">Alexander Peter (EchoMind Project Lead) — 2026-10-14</w:t>
+              <w:t xml:space="preserve">Richard Watson Stephen Amudha (Lead Engineer) — 2026-10-14</w:t>
             </w:r>
           </w:p>
         </w:tc>
@@ -752,7 +752,7 @@
                 <w:sz w:val="17"/>
                 <w:szCs w:val="17"/>
               </w:rPr>
-              <w:t xml:space="preserve">Quality assurance</w:t>
+              <w:t xml:space="preserve">Reviewed by</w:t>
             </w:r>
           </w:p>
         </w:tc>
@@ -781,7 +781,7 @@
                 <w:sz w:val="17"/>
                 <w:szCs w:val="17"/>
               </w:rPr>
-              <w:t xml:space="preserve">Sheryl Nazareth (QA / MR) — 2026-10-14</w:t>
+              <w:t xml:space="preserve">Alexander Peter (EchoMind Project Lead) — rev 1.1 to confirm</w:t>
             </w:r>
           </w:p>
         </w:tc>
@@ -812,6 +812,66 @@
                 <w:sz w:val="17"/>
                 <w:szCs w:val="17"/>
               </w:rPr>
+              <w:t xml:space="preserve">Quality assurance</w:t>
+            </w:r>
+          </w:p>
+        </w:tc>
+        <w:tc>
+          <w:tcPr>
+            <w:tcW w:type="dxa" w:w="9360"/>
+            <w:tcBorders>
+              <w:top w:val="single" w:color="BFC7D5" w:sz="4"/>
+              <w:left w:val="single" w:color="BFC7D5" w:sz="4"/>
+              <w:bottom w:val="single" w:color="BFC7D5" w:sz="4"/>
+              <w:right w:val="single" w:color="BFC7D5" w:sz="4"/>
+            </w:tcBorders>
+            <w:tcMar>
+              <w:top w:type="dxa" w:w="60"/>
+              <w:left w:type="dxa" w:w="90"/>
+              <w:bottom w:type="dxa" w:w="60"/>
+              <w:right w:type="dxa" w:w="90"/>
+            </w:tcMar>
+          </w:tcPr>
+          <w:p>
+            <w:r>
+              <w:rPr>
+                <w:b w:val="false"/>
+                <w:bCs w:val="false"/>
+                <w:color w:val="222222"/>
+                <w:sz w:val="17"/>
+                <w:szCs w:val="17"/>
+              </w:rPr>
+              <w:t xml:space="preserve">Sheryl Nazareth (QA / MR) — rev 1.1 to confirm</w:t>
+            </w:r>
+          </w:p>
+        </w:tc>
+      </w:tr>
+      <w:tr>
+        <w:tc>
+          <w:tcPr>
+            <w:tcW w:type="dxa" w:w="3600"/>
+            <w:tcBorders>
+              <w:top w:val="single" w:color="BFC7D5" w:sz="4"/>
+              <w:left w:val="single" w:color="BFC7D5" w:sz="4"/>
+              <w:bottom w:val="single" w:color="BFC7D5" w:sz="4"/>
+              <w:right w:val="single" w:color="BFC7D5" w:sz="4"/>
+            </w:tcBorders>
+            <w:tcMar>
+              <w:top w:type="dxa" w:w="60"/>
+              <w:left w:type="dxa" w:w="90"/>
+              <w:bottom w:type="dxa" w:w="60"/>
+              <w:right w:type="dxa" w:w="90"/>
+            </w:tcMar>
+          </w:tcPr>
+          <w:p>
+            <w:r>
+              <w:rPr>
+                <w:b w:val="false"/>
+                <w:bCs w:val="false"/>
+                <w:color w:val="222222"/>
+                <w:sz w:val="17"/>
+                <w:szCs w:val="17"/>
+              </w:rPr>
               <w:t xml:space="preserve">Approved by</w:t>
             </w:r>
           </w:p>
@@ -841,7 +901,7 @@
                 <w:sz w:val="17"/>
                 <w:szCs w:val="17"/>
               </w:rPr>
-              <w:t xml:space="preserve">Anita Johan (Managing Director) — 2026-10-14</w:t>
+              <w:t xml:space="preserve">Anita Johan (Managing Director) — rev 1.1 to confirm</w:t>
             </w:r>
           </w:p>
         </w:tc>
@@ -860,7 +920,7 @@
         <w:spacing w:after="100"/>
       </w:pPr>
       <w:r>
-        <w:t xml:space="preserve">Every change to the agreed requirements: what changed, why, who asked, the review that decided it, how it was implemented and verified.</w:t>
+        <w:t xml:space="preserve">Every change to the agreed requirements — what changed, why, who asked, the meeting where it was decided and where that meeting is recorded, the impact, how it was implemented and how it was verified.</w:t>
       </w:r>
     </w:p>
     <w:p>
@@ -884,14 +944,18 @@
         </w:tblBorders>
       </w:tblPr>
       <w:tblGrid>
-        <w:gridCol w:w="932"/>
-        <w:gridCol w:w="932"/>
-        <w:gridCol w:w="1212"/>
-        <w:gridCol w:w="3543"/>
-        <w:gridCol w:w="1491"/>
-        <w:gridCol w:w="1025"/>
-        <w:gridCol w:w="2237"/>
-        <w:gridCol w:w="1588"/>
+        <w:gridCol w:w="950"/>
+        <w:gridCol w:w="750"/>
+        <w:gridCol w:w="1050"/>
+        <w:gridCol w:w="1751"/>
+        <w:gridCol w:w="1050"/>
+        <w:gridCol w:w="1050"/>
+        <w:gridCol w:w="1351"/>
+        <w:gridCol w:w="1000"/>
+        <w:gridCol w:w="850"/>
+        <w:gridCol w:w="1200"/>
+        <w:gridCol w:w="1000"/>
+        <w:gridCol w:w="958"/>
       </w:tblGrid>
       <w:tr>
         <w:trPr>
@@ -899,7 +963,7 @@
         </w:trPr>
         <w:tc>
           <w:tcPr>
-            <w:tcW w:type="dxa" w:w="932"/>
+            <w:tcW w:type="dxa" w:w="950"/>
             <w:tcBorders>
               <w:top w:val="single" w:color="BFC7D5" w:sz="4"/>
               <w:left w:val="single" w:color="BFC7D5" w:sz="4"/>
@@ -929,7 +993,7 @@
         </w:tc>
         <w:tc>
           <w:tcPr>
-            <w:tcW w:type="dxa" w:w="932"/>
+            <w:tcW w:type="dxa" w:w="750"/>
             <w:tcBorders>
               <w:top w:val="single" w:color="BFC7D5" w:sz="4"/>
               <w:left w:val="single" w:color="BFC7D5" w:sz="4"/>
@@ -959,7 +1023,7 @@
         </w:tc>
         <w:tc>
           <w:tcPr>
-            <w:tcW w:type="dxa" w:w="1212"/>
+            <w:tcW w:type="dxa" w:w="1050"/>
             <w:tcBorders>
               <w:top w:val="single" w:color="BFC7D5" w:sz="4"/>
               <w:left w:val="single" w:color="BFC7D5" w:sz="4"/>
@@ -989,7 +1053,7 @@
         </w:tc>
         <w:tc>
           <w:tcPr>
-            <w:tcW w:type="dxa" w:w="3543"/>
+            <w:tcW w:type="dxa" w:w="1751"/>
             <w:tcBorders>
               <w:top w:val="single" w:color="BFC7D5" w:sz="4"/>
               <w:left w:val="single" w:color="BFC7D5" w:sz="4"/>
@@ -1019,7 +1083,7 @@
         </w:tc>
         <w:tc>
           <w:tcPr>
-            <w:tcW w:type="dxa" w:w="1491"/>
+            <w:tcW w:type="dxa" w:w="1050"/>
             <w:tcBorders>
               <w:top w:val="single" w:color="BFC7D5" w:sz="4"/>
               <w:left w:val="single" w:color="BFC7D5" w:sz="4"/>
@@ -1043,13 +1107,13 @@
                 <w:sz w:val="17"/>
                 <w:szCs w:val="17"/>
               </w:rPr>
-              <w:t xml:space="preserve">Requested by</w:t>
-            </w:r>
-          </w:p>
-        </w:tc>
-        <w:tc>
-          <w:tcPr>
-            <w:tcW w:type="dxa" w:w="1025"/>
+              <w:t xml:space="preserve">Reason</w:t>
+            </w:r>
+          </w:p>
+        </w:tc>
+        <w:tc>
+          <w:tcPr>
+            <w:tcW w:type="dxa" w:w="1050"/>
             <w:tcBorders>
               <w:top w:val="single" w:color="BFC7D5" w:sz="4"/>
               <w:left w:val="single" w:color="BFC7D5" w:sz="4"/>
@@ -1073,13 +1137,13 @@
                 <w:sz w:val="17"/>
                 <w:szCs w:val="17"/>
               </w:rPr>
-              <w:t xml:space="preserve">Decided in</w:t>
-            </w:r>
-          </w:p>
-        </w:tc>
-        <w:tc>
-          <w:tcPr>
-            <w:tcW w:type="dxa" w:w="2237"/>
+              <w:t xml:space="preserve">Requested by</w:t>
+            </w:r>
+          </w:p>
+        </w:tc>
+        <w:tc>
+          <w:tcPr>
+            <w:tcW w:type="dxa" w:w="1351"/>
             <w:tcBorders>
               <w:top w:val="single" w:color="BFC7D5" w:sz="4"/>
               <w:left w:val="single" w:color="BFC7D5" w:sz="4"/>
@@ -1103,13 +1167,13 @@
                 <w:sz w:val="17"/>
                 <w:szCs w:val="17"/>
               </w:rPr>
-              <w:t xml:space="preserve">Implemented</w:t>
-            </w:r>
-          </w:p>
-        </w:tc>
-        <w:tc>
-          <w:tcPr>
-            <w:tcW w:type="dxa" w:w="1588"/>
+              <w:t xml:space="preserve">Meeting recorded in</w:t>
+            </w:r>
+          </w:p>
+        </w:tc>
+        <w:tc>
+          <w:tcPr>
+            <w:tcW w:type="dxa" w:w="1000"/>
             <w:tcBorders>
               <w:top w:val="single" w:color="BFC7D5" w:sz="4"/>
               <w:left w:val="single" w:color="BFC7D5" w:sz="4"/>
@@ -1133,7 +1197,127 @@
                 <w:sz w:val="17"/>
                 <w:szCs w:val="17"/>
               </w:rPr>
+              <w:t xml:space="preserve">Impact</w:t>
+            </w:r>
+          </w:p>
+        </w:tc>
+        <w:tc>
+          <w:tcPr>
+            <w:tcW w:type="dxa" w:w="850"/>
+            <w:tcBorders>
+              <w:top w:val="single" w:color="BFC7D5" w:sz="4"/>
+              <w:left w:val="single" w:color="BFC7D5" w:sz="4"/>
+              <w:bottom w:val="single" w:color="BFC7D5" w:sz="4"/>
+              <w:right w:val="single" w:color="BFC7D5" w:sz="4"/>
+            </w:tcBorders>
+            <w:shd w:fill="1F3A5F" w:color="auto" w:val="clear"/>
+            <w:tcMar>
+              <w:top w:type="dxa" w:w="60"/>
+              <w:left w:type="dxa" w:w="90"/>
+              <w:bottom w:type="dxa" w:w="60"/>
+              <w:right w:type="dxa" w:w="90"/>
+            </w:tcMar>
+          </w:tcPr>
+          <w:p>
+            <w:r>
+              <w:rPr>
+                <w:b/>
+                <w:bCs/>
+                <w:color w:val="FFFFFF"/>
+                <w:sz w:val="17"/>
+                <w:szCs w:val="17"/>
+              </w:rPr>
+              <w:t xml:space="preserve">Decision</w:t>
+            </w:r>
+          </w:p>
+        </w:tc>
+        <w:tc>
+          <w:tcPr>
+            <w:tcW w:type="dxa" w:w="1200"/>
+            <w:tcBorders>
+              <w:top w:val="single" w:color="BFC7D5" w:sz="4"/>
+              <w:left w:val="single" w:color="BFC7D5" w:sz="4"/>
+              <w:bottom w:val="single" w:color="BFC7D5" w:sz="4"/>
+              <w:right w:val="single" w:color="BFC7D5" w:sz="4"/>
+            </w:tcBorders>
+            <w:shd w:fill="1F3A5F" w:color="auto" w:val="clear"/>
+            <w:tcMar>
+              <w:top w:type="dxa" w:w="60"/>
+              <w:left w:type="dxa" w:w="90"/>
+              <w:bottom w:type="dxa" w:w="60"/>
+              <w:right w:type="dxa" w:w="90"/>
+            </w:tcMar>
+          </w:tcPr>
+          <w:p>
+            <w:r>
+              <w:rPr>
+                <w:b/>
+                <w:bCs/>
+                <w:color w:val="FFFFFF"/>
+                <w:sz w:val="17"/>
+                <w:szCs w:val="17"/>
+              </w:rPr>
+              <w:t xml:space="preserve">Implemented (commit — version)</w:t>
+            </w:r>
+          </w:p>
+        </w:tc>
+        <w:tc>
+          <w:tcPr>
+            <w:tcW w:type="dxa" w:w="1000"/>
+            <w:tcBorders>
+              <w:top w:val="single" w:color="BFC7D5" w:sz="4"/>
+              <w:left w:val="single" w:color="BFC7D5" w:sz="4"/>
+              <w:bottom w:val="single" w:color="BFC7D5" w:sz="4"/>
+              <w:right w:val="single" w:color="BFC7D5" w:sz="4"/>
+            </w:tcBorders>
+            <w:shd w:fill="1F3A5F" w:color="auto" w:val="clear"/>
+            <w:tcMar>
+              <w:top w:type="dxa" w:w="60"/>
+              <w:left w:type="dxa" w:w="90"/>
+              <w:bottom w:type="dxa" w:w="60"/>
+              <w:right w:type="dxa" w:w="90"/>
+            </w:tcMar>
+          </w:tcPr>
+          <w:p>
+            <w:r>
+              <w:rPr>
+                <w:b/>
+                <w:bCs/>
+                <w:color w:val="FFFFFF"/>
+                <w:sz w:val="17"/>
+                <w:szCs w:val="17"/>
+              </w:rPr>
               <w:t xml:space="preserve">Verified</w:t>
+            </w:r>
+          </w:p>
+        </w:tc>
+        <w:tc>
+          <w:tcPr>
+            <w:tcW w:type="dxa" w:w="958"/>
+            <w:tcBorders>
+              <w:top w:val="single" w:color="BFC7D5" w:sz="4"/>
+              <w:left w:val="single" w:color="BFC7D5" w:sz="4"/>
+              <w:bottom w:val="single" w:color="BFC7D5" w:sz="4"/>
+              <w:right w:val="single" w:color="BFC7D5" w:sz="4"/>
+            </w:tcBorders>
+            <w:shd w:fill="1F3A5F" w:color="auto" w:val="clear"/>
+            <w:tcMar>
+              <w:top w:type="dxa" w:w="60"/>
+              <w:left w:type="dxa" w:w="90"/>
+              <w:bottom w:type="dxa" w:w="60"/>
+              <w:right w:type="dxa" w:w="90"/>
+            </w:tcMar>
+          </w:tcPr>
+          <w:p>
+            <w:r>
+              <w:rPr>
+                <w:b/>
+                <w:bCs/>
+                <w:color w:val="FFFFFF"/>
+                <w:sz w:val="17"/>
+                <w:szCs w:val="17"/>
+              </w:rPr>
+              <w:t xml:space="preserve">Status</w:t>
             </w:r>
           </w:p>
         </w:tc>
@@ -1141,7 +1325,7 @@
       <w:tr>
         <w:tc>
           <w:tcPr>
-            <w:tcW w:type="dxa" w:w="932"/>
+            <w:tcW w:type="dxa" w:w="950"/>
             <w:tcBorders>
               <w:top w:val="single" w:color="BFC7D5" w:sz="4"/>
               <w:left w:val="single" w:color="BFC7D5" w:sz="4"/>
@@ -1170,7 +1354,7 @@
         </w:tc>
         <w:tc>
           <w:tcPr>
-            <w:tcW w:type="dxa" w:w="932"/>
+            <w:tcW w:type="dxa" w:w="750"/>
             <w:tcBorders>
               <w:top w:val="single" w:color="BFC7D5" w:sz="4"/>
               <w:left w:val="single" w:color="BFC7D5" w:sz="4"/>
@@ -1199,175 +1383,291 @@
         </w:tc>
         <w:tc>
           <w:tcPr>
-            <w:tcW w:type="dxa" w:w="1212"/>
-            <w:tcBorders>
-              <w:top w:val="single" w:color="BFC7D5" w:sz="4"/>
-              <w:left w:val="single" w:color="BFC7D5" w:sz="4"/>
-              <w:bottom w:val="single" w:color="BFC7D5" w:sz="4"/>
-              <w:right w:val="single" w:color="BFC7D5" w:sz="4"/>
-            </w:tcBorders>
-            <w:tcMar>
-              <w:top w:type="dxa" w:w="60"/>
-              <w:left w:type="dxa" w:w="90"/>
-              <w:bottom w:type="dxa" w:w="60"/>
-              <w:right w:type="dxa" w:w="90"/>
-            </w:tcMar>
-          </w:tcPr>
-          <w:p>
-            <w:r>
-              <w:rPr>
-                <w:b w:val="false"/>
-                <w:bCs w:val="false"/>
-                <w:color w:val="222222"/>
-                <w:sz w:val="17"/>
-                <w:szCs w:val="17"/>
-              </w:rPr>
-              <w:t xml:space="preserve">FR-2025-01…04</w:t>
-            </w:r>
-          </w:p>
-        </w:tc>
-        <w:tc>
-          <w:tcPr>
-            <w:tcW w:type="dxa" w:w="3543"/>
-            <w:tcBorders>
-              <w:top w:val="single" w:color="BFC7D5" w:sz="4"/>
-              <w:left w:val="single" w:color="BFC7D5" w:sz="4"/>
-              <w:bottom w:val="single" w:color="BFC7D5" w:sz="4"/>
-              <w:right w:val="single" w:color="BFC7D5" w:sz="4"/>
-            </w:tcBorders>
-            <w:tcMar>
-              <w:top w:type="dxa" w:w="60"/>
-              <w:left w:type="dxa" w:w="90"/>
-              <w:bottom w:type="dxa" w:w="60"/>
-              <w:right w:type="dxa" w:w="90"/>
-            </w:tcMar>
-          </w:tcPr>
-          <w:p>
-            <w:r>
-              <w:rPr>
-                <w:b w:val="false"/>
-                <w:bCs w:val="false"/>
-                <w:color w:val="222222"/>
-                <w:sz w:val="17"/>
-                <w:szCs w:val="17"/>
-              </w:rPr>
-              <w:t xml:space="preserve">Requirements fixed in the signed SOW (offline on-premises system, BYOA pilot)</w:t>
-            </w:r>
-          </w:p>
-        </w:tc>
-        <w:tc>
-          <w:tcPr>
-            <w:tcW w:type="dxa" w:w="1491"/>
-            <w:tcBorders>
-              <w:top w:val="single" w:color="BFC7D5" w:sz="4"/>
-              <w:left w:val="single" w:color="BFC7D5" w:sz="4"/>
-              <w:bottom w:val="single" w:color="BFC7D5" w:sz="4"/>
-              <w:right w:val="single" w:color="BFC7D5" w:sz="4"/>
-            </w:tcBorders>
-            <w:tcMar>
-              <w:top w:type="dxa" w:w="60"/>
-              <w:left w:type="dxa" w:w="90"/>
-              <w:bottom w:type="dxa" w:w="60"/>
-              <w:right w:type="dxa" w:w="90"/>
-            </w:tcMar>
-          </w:tcPr>
-          <w:p>
-            <w:r>
-              <w:rPr>
-                <w:b w:val="false"/>
-                <w:bCs w:val="false"/>
-                <w:color w:val="222222"/>
-                <w:sz w:val="17"/>
-                <w:szCs w:val="17"/>
-              </w:rPr>
-              <w:t xml:space="preserve">2025 university pilot customer; AJACE</w:t>
-            </w:r>
-          </w:p>
-        </w:tc>
-        <w:tc>
-          <w:tcPr>
-            <w:tcW w:type="dxa" w:w="1025"/>
-            <w:tcBorders>
-              <w:top w:val="single" w:color="BFC7D5" w:sz="4"/>
-              <w:left w:val="single" w:color="BFC7D5" w:sz="4"/>
-              <w:bottom w:val="single" w:color="BFC7D5" w:sz="4"/>
-              <w:right w:val="single" w:color="BFC7D5" w:sz="4"/>
-            </w:tcBorders>
-            <w:tcMar>
-              <w:top w:type="dxa" w:w="60"/>
-              <w:left w:type="dxa" w:w="90"/>
-              <w:bottom w:type="dxa" w:w="60"/>
-              <w:right w:type="dxa" w:w="90"/>
-            </w:tcMar>
-          </w:tcPr>
-          <w:p>
-            <w:r>
-              <w:rPr>
-                <w:b w:val="false"/>
-                <w:bCs w:val="false"/>
-                <w:color w:val="222222"/>
-                <w:sz w:val="17"/>
-                <w:szCs w:val="17"/>
-              </w:rPr>
-              <w:t xml:space="preserve">DR-2025-09</w:t>
-            </w:r>
-          </w:p>
-        </w:tc>
-        <w:tc>
-          <w:tcPr>
-            <w:tcW w:type="dxa" w:w="2237"/>
-            <w:tcBorders>
-              <w:top w:val="single" w:color="BFC7D5" w:sz="4"/>
-              <w:left w:val="single" w:color="BFC7D5" w:sz="4"/>
-              <w:bottom w:val="single" w:color="BFC7D5" w:sz="4"/>
-              <w:right w:val="single" w:color="BFC7D5" w:sz="4"/>
-            </w:tcBorders>
-            <w:tcMar>
-              <w:top w:type="dxa" w:w="60"/>
-              <w:left w:type="dxa" w:w="90"/>
-              <w:bottom w:type="dxa" w:w="60"/>
-              <w:right w:type="dxa" w:w="90"/>
-            </w:tcMar>
-          </w:tcPr>
-          <w:p>
-            <w:r>
-              <w:rPr>
-                <w:b w:val="false"/>
-                <w:bCs w:val="false"/>
-                <w:color w:val="222222"/>
-                <w:sz w:val="17"/>
-                <w:szCs w:val="17"/>
-              </w:rPr>
-              <w:t xml:space="preserve">SOW signed 2025-08-05</w:t>
-            </w:r>
-          </w:p>
-        </w:tc>
-        <w:tc>
-          <w:tcPr>
-            <w:tcW w:type="dxa" w:w="1588"/>
-            <w:tcBorders>
-              <w:top w:val="single" w:color="BFC7D5" w:sz="4"/>
-              <w:left w:val="single" w:color="BFC7D5" w:sz="4"/>
-              <w:bottom w:val="single" w:color="BFC7D5" w:sz="4"/>
-              <w:right w:val="single" w:color="BFC7D5" w:sz="4"/>
-            </w:tcBorders>
-            <w:tcMar>
-              <w:top w:type="dxa" w:w="60"/>
-              <w:left w:type="dxa" w:w="90"/>
-              <w:bottom w:type="dxa" w:w="60"/>
-              <w:right w:type="dxa" w:w="90"/>
-            </w:tcMar>
-          </w:tcPr>
-          <w:p>
-            <w:r>
-              <w:rPr>
-                <w:b w:val="false"/>
-                <w:bCs w:val="false"/>
-                <w:color w:val="222222"/>
-                <w:sz w:val="17"/>
-                <w:szCs w:val="17"/>
-              </w:rPr>
-              <w:t xml:space="preserve">Acceptance test on delivery (2025-09)</w:t>
+            <w:tcW w:type="dxa" w:w="1050"/>
+            <w:tcBorders>
+              <w:top w:val="single" w:color="BFC7D5" w:sz="4"/>
+              <w:left w:val="single" w:color="BFC7D5" w:sz="4"/>
+              <w:bottom w:val="single" w:color="BFC7D5" w:sz="4"/>
+              <w:right w:val="single" w:color="BFC7D5" w:sz="4"/>
+            </w:tcBorders>
+            <w:tcMar>
+              <w:top w:type="dxa" w:w="60"/>
+              <w:left w:type="dxa" w:w="90"/>
+              <w:bottom w:type="dxa" w:w="60"/>
+              <w:right w:type="dxa" w:w="90"/>
+            </w:tcMar>
+          </w:tcPr>
+          <w:p>
+            <w:r>
+              <w:rPr>
+                <w:b w:val="false"/>
+                <w:bCs w:val="false"/>
+                <w:color w:val="222222"/>
+                <w:sz w:val="17"/>
+                <w:szCs w:val="17"/>
+              </w:rPr>
+              <w:t xml:space="preserve">FR-2025-01 … 05</w:t>
+            </w:r>
+          </w:p>
+        </w:tc>
+        <w:tc>
+          <w:tcPr>
+            <w:tcW w:type="dxa" w:w="1751"/>
+            <w:tcBorders>
+              <w:top w:val="single" w:color="BFC7D5" w:sz="4"/>
+              <w:left w:val="single" w:color="BFC7D5" w:sz="4"/>
+              <w:bottom w:val="single" w:color="BFC7D5" w:sz="4"/>
+              <w:right w:val="single" w:color="BFC7D5" w:sz="4"/>
+            </w:tcBorders>
+            <w:tcMar>
+              <w:top w:type="dxa" w:w="60"/>
+              <w:left w:type="dxa" w:w="90"/>
+              <w:bottom w:type="dxa" w:w="60"/>
+              <w:right w:type="dxa" w:w="90"/>
+            </w:tcMar>
+          </w:tcPr>
+          <w:p>
+            <w:r>
+              <w:rPr>
+                <w:b w:val="false"/>
+                <w:bCs w:val="false"/>
+                <w:color w:val="222222"/>
+                <w:sz w:val="17"/>
+                <w:szCs w:val="17"/>
+              </w:rPr>
+              <w:t xml:space="preserve">Requirements fixed in the signed SOW: offline on-premises system, BYOA pilot</w:t>
+            </w:r>
+          </w:p>
+        </w:tc>
+        <w:tc>
+          <w:tcPr>
+            <w:tcW w:type="dxa" w:w="1050"/>
+            <w:tcBorders>
+              <w:top w:val="single" w:color="BFC7D5" w:sz="4"/>
+              <w:left w:val="single" w:color="BFC7D5" w:sz="4"/>
+              <w:bottom w:val="single" w:color="BFC7D5" w:sz="4"/>
+              <w:right w:val="single" w:color="BFC7D5" w:sz="4"/>
+            </w:tcBorders>
+            <w:tcMar>
+              <w:top w:type="dxa" w:w="60"/>
+              <w:left w:type="dxa" w:w="90"/>
+              <w:bottom w:type="dxa" w:w="60"/>
+              <w:right w:type="dxa" w:w="90"/>
+            </w:tcMar>
+          </w:tcPr>
+          <w:p>
+            <w:r>
+              <w:rPr>
+                <w:b w:val="false"/>
+                <w:bCs w:val="false"/>
+                <w:color w:val="222222"/>
+                <w:sz w:val="17"/>
+                <w:szCs w:val="17"/>
+              </w:rPr>
+              <w:t xml:space="preserve">Contract</w:t>
+            </w:r>
+          </w:p>
+        </w:tc>
+        <w:tc>
+          <w:tcPr>
+            <w:tcW w:type="dxa" w:w="1050"/>
+            <w:tcBorders>
+              <w:top w:val="single" w:color="BFC7D5" w:sz="4"/>
+              <w:left w:val="single" w:color="BFC7D5" w:sz="4"/>
+              <w:bottom w:val="single" w:color="BFC7D5" w:sz="4"/>
+              <w:right w:val="single" w:color="BFC7D5" w:sz="4"/>
+            </w:tcBorders>
+            <w:tcMar>
+              <w:top w:type="dxa" w:w="60"/>
+              <w:left w:type="dxa" w:w="90"/>
+              <w:bottom w:type="dxa" w:w="60"/>
+              <w:right w:type="dxa" w:w="90"/>
+            </w:tcMar>
+          </w:tcPr>
+          <w:p>
+            <w:r>
+              <w:rPr>
+                <w:b w:val="false"/>
+                <w:bCs w:val="false"/>
+                <w:color w:val="222222"/>
+                <w:sz w:val="17"/>
+                <w:szCs w:val="17"/>
+              </w:rPr>
+              <w:t xml:space="preserve">2025 university pilot customer</w:t>
+            </w:r>
+          </w:p>
+        </w:tc>
+        <w:tc>
+          <w:tcPr>
+            <w:tcW w:type="dxa" w:w="1351"/>
+            <w:tcBorders>
+              <w:top w:val="single" w:color="BFC7D5" w:sz="4"/>
+              <w:left w:val="single" w:color="BFC7D5" w:sz="4"/>
+              <w:bottom w:val="single" w:color="BFC7D5" w:sz="4"/>
+              <w:right w:val="single" w:color="BFC7D5" w:sz="4"/>
+            </w:tcBorders>
+            <w:tcMar>
+              <w:top w:type="dxa" w:w="60"/>
+              <w:left w:type="dxa" w:w="90"/>
+              <w:bottom w:type="dxa" w:w="60"/>
+              <w:right w:type="dxa" w:w="90"/>
+            </w:tcMar>
+          </w:tcPr>
+          <w:p>
+            <w:r>
+              <w:rPr>
+                <w:b w:val="false"/>
+                <w:bCs w:val="false"/>
+                <w:color w:val="222222"/>
+                <w:sz w:val="17"/>
+                <w:szCs w:val="17"/>
+              </w:rPr>
+              <w:t xml:space="preserve">EM26-28 CON-2025-01; review record DR-2025-09</w:t>
+            </w:r>
+          </w:p>
+        </w:tc>
+        <w:tc>
+          <w:tcPr>
+            <w:tcW w:type="dxa" w:w="1000"/>
+            <w:tcBorders>
+              <w:top w:val="single" w:color="BFC7D5" w:sz="4"/>
+              <w:left w:val="single" w:color="BFC7D5" w:sz="4"/>
+              <w:bottom w:val="single" w:color="BFC7D5" w:sz="4"/>
+              <w:right w:val="single" w:color="BFC7D5" w:sz="4"/>
+            </w:tcBorders>
+            <w:tcMar>
+              <w:top w:type="dxa" w:w="60"/>
+              <w:left w:type="dxa" w:w="90"/>
+              <w:bottom w:type="dxa" w:w="60"/>
+              <w:right w:type="dxa" w:w="90"/>
+            </w:tcMar>
+          </w:tcPr>
+          <w:p>
+            <w:r>
+              <w:rPr>
+                <w:b w:val="false"/>
+                <w:bCs w:val="false"/>
+                <w:color w:val="222222"/>
+                <w:sz w:val="17"/>
+                <w:szCs w:val="17"/>
+              </w:rPr>
+              <w:t xml:space="preserve">Baseline for the 2025 appliance</w:t>
+            </w:r>
+          </w:p>
+        </w:tc>
+        <w:tc>
+          <w:tcPr>
+            <w:tcW w:type="dxa" w:w="850"/>
+            <w:tcBorders>
+              <w:top w:val="single" w:color="BFC7D5" w:sz="4"/>
+              <w:left w:val="single" w:color="BFC7D5" w:sz="4"/>
+              <w:bottom w:val="single" w:color="BFC7D5" w:sz="4"/>
+              <w:right w:val="single" w:color="BFC7D5" w:sz="4"/>
+            </w:tcBorders>
+            <w:tcMar>
+              <w:top w:type="dxa" w:w="60"/>
+              <w:left w:type="dxa" w:w="90"/>
+              <w:bottom w:type="dxa" w:w="60"/>
+              <w:right w:type="dxa" w:w="90"/>
+            </w:tcMar>
+          </w:tcPr>
+          <w:p>
+            <w:r>
+              <w:rPr>
+                <w:b w:val="false"/>
+                <w:bCs w:val="false"/>
+                <w:color w:val="222222"/>
+                <w:sz w:val="17"/>
+                <w:szCs w:val="17"/>
+              </w:rPr>
+              <w:t xml:space="preserve">Accepted</w:t>
+            </w:r>
+          </w:p>
+        </w:tc>
+        <w:tc>
+          <w:tcPr>
+            <w:tcW w:type="dxa" w:w="1200"/>
+            <w:tcBorders>
+              <w:top w:val="single" w:color="BFC7D5" w:sz="4"/>
+              <w:left w:val="single" w:color="BFC7D5" w:sz="4"/>
+              <w:bottom w:val="single" w:color="BFC7D5" w:sz="4"/>
+              <w:right w:val="single" w:color="BFC7D5" w:sz="4"/>
+            </w:tcBorders>
+            <w:tcMar>
+              <w:top w:type="dxa" w:w="60"/>
+              <w:left w:type="dxa" w:w="90"/>
+              <w:bottom w:type="dxa" w:w="60"/>
+              <w:right w:type="dxa" w:w="90"/>
+            </w:tcMar>
+          </w:tcPr>
+          <w:p>
+            <w:r>
+              <w:rPr>
+                <w:b w:val="false"/>
+                <w:bCs w:val="false"/>
+                <w:color w:val="222222"/>
+                <w:sz w:val="17"/>
+                <w:szCs w:val="17"/>
+              </w:rPr>
+              <w:t xml:space="preserve">Delivered Sep 2025</w:t>
+            </w:r>
+          </w:p>
+        </w:tc>
+        <w:tc>
+          <w:tcPr>
+            <w:tcW w:type="dxa" w:w="1000"/>
+            <w:tcBorders>
+              <w:top w:val="single" w:color="BFC7D5" w:sz="4"/>
+              <w:left w:val="single" w:color="BFC7D5" w:sz="4"/>
+              <w:bottom w:val="single" w:color="BFC7D5" w:sz="4"/>
+              <w:right w:val="single" w:color="BFC7D5" w:sz="4"/>
+            </w:tcBorders>
+            <w:tcMar>
+              <w:top w:type="dxa" w:w="60"/>
+              <w:left w:type="dxa" w:w="90"/>
+              <w:bottom w:type="dxa" w:w="60"/>
+              <w:right w:type="dxa" w:w="90"/>
+            </w:tcMar>
+          </w:tcPr>
+          <w:p>
+            <w:r>
+              <w:rPr>
+                <w:b w:val="false"/>
+                <w:bCs w:val="false"/>
+                <w:color w:val="222222"/>
+                <w:sz w:val="17"/>
+                <w:szCs w:val="17"/>
+              </w:rPr>
+              <w:t xml:space="preserve">Acceptance test on delivery</w:t>
+            </w:r>
+          </w:p>
+        </w:tc>
+        <w:tc>
+          <w:tcPr>
+            <w:tcW w:type="dxa" w:w="958"/>
+            <w:tcBorders>
+              <w:top w:val="single" w:color="BFC7D5" w:sz="4"/>
+              <w:left w:val="single" w:color="BFC7D5" w:sz="4"/>
+              <w:bottom w:val="single" w:color="BFC7D5" w:sz="4"/>
+              <w:right w:val="single" w:color="BFC7D5" w:sz="4"/>
+            </w:tcBorders>
+            <w:tcMar>
+              <w:top w:type="dxa" w:w="60"/>
+              <w:left w:type="dxa" w:w="90"/>
+              <w:bottom w:type="dxa" w:w="60"/>
+              <w:right w:type="dxa" w:w="90"/>
+            </w:tcMar>
+          </w:tcPr>
+          <w:p>
+            <w:r>
+              <w:rPr>
+                <w:b w:val="false"/>
+                <w:bCs w:val="false"/>
+                <w:color w:val="222222"/>
+                <w:sz w:val="17"/>
+                <w:szCs w:val="17"/>
+              </w:rPr>
+              <w:t xml:space="preserve">Closed</w:t>
             </w:r>
           </w:p>
         </w:tc>
@@ -1375,7 +1675,7 @@
       <w:tr>
         <w:tc>
           <w:tcPr>
-            <w:tcW w:type="dxa" w:w="932"/>
+            <w:tcW w:type="dxa" w:w="950"/>
             <w:tcBorders>
               <w:top w:val="single" w:color="BFC7D5" w:sz="4"/>
               <w:left w:val="single" w:color="BFC7D5" w:sz="4"/>
@@ -1404,7 +1704,7 @@
         </w:tc>
         <w:tc>
           <w:tcPr>
-            <w:tcW w:type="dxa" w:w="932"/>
+            <w:tcW w:type="dxa" w:w="750"/>
             <w:tcBorders>
               <w:top w:val="single" w:color="BFC7D5" w:sz="4"/>
               <w:left w:val="single" w:color="BFC7D5" w:sz="4"/>
@@ -1433,65 +1733,94 @@
         </w:tc>
         <w:tc>
           <w:tcPr>
-            <w:tcW w:type="dxa" w:w="1212"/>
-            <w:tcBorders>
-              <w:top w:val="single" w:color="BFC7D5" w:sz="4"/>
-              <w:left w:val="single" w:color="BFC7D5" w:sz="4"/>
-              <w:bottom w:val="single" w:color="BFC7D5" w:sz="4"/>
-              <w:right w:val="single" w:color="BFC7D5" w:sz="4"/>
-            </w:tcBorders>
-            <w:tcMar>
-              <w:top w:type="dxa" w:w="60"/>
-              <w:left w:type="dxa" w:w="90"/>
-              <w:bottom w:type="dxa" w:w="60"/>
-              <w:right w:type="dxa" w:w="90"/>
-            </w:tcMar>
-          </w:tcPr>
-          <w:p>
-            <w:r>
-              <w:rPr>
-                <w:b w:val="false"/>
-                <w:bCs w:val="false"/>
-                <w:color w:val="222222"/>
-                <w:sz w:val="17"/>
-                <w:szCs w:val="17"/>
-              </w:rPr>
-              <w:t xml:space="preserve">FR-PL-01</w:t>
-            </w:r>
-          </w:p>
-        </w:tc>
-        <w:tc>
-          <w:tcPr>
-            <w:tcW w:type="dxa" w:w="3543"/>
-            <w:tcBorders>
-              <w:top w:val="single" w:color="BFC7D5" w:sz="4"/>
-              <w:left w:val="single" w:color="BFC7D5" w:sz="4"/>
-              <w:bottom w:val="single" w:color="BFC7D5" w:sz="4"/>
-              <w:right w:val="single" w:color="BFC7D5" w:sz="4"/>
-            </w:tcBorders>
-            <w:tcMar>
-              <w:top w:type="dxa" w:w="60"/>
-              <w:left w:type="dxa" w:w="90"/>
-              <w:bottom w:type="dxa" w:w="60"/>
-              <w:right w:type="dxa" w:w="90"/>
-            </w:tcMar>
-          </w:tcPr>
-          <w:p>
-            <w:r>
-              <w:rPr>
-                <w:b w:val="false"/>
-                <w:bCs w:val="false"/>
-                <w:color w:val="222222"/>
-                <w:sz w:val="17"/>
-                <w:szCs w:val="17"/>
-              </w:rPr>
-              <w:t xml:space="preserve">Platform changed from a single RTX 4090 PC to a DGX Spark</w:t>
-            </w:r>
-          </w:p>
-        </w:tc>
-        <w:tc>
-          <w:tcPr>
-            <w:tcW w:type="dxa" w:w="1491"/>
+            <w:tcW w:type="dxa" w:w="1050"/>
+            <w:tcBorders>
+              <w:top w:val="single" w:color="BFC7D5" w:sz="4"/>
+              <w:left w:val="single" w:color="BFC7D5" w:sz="4"/>
+              <w:bottom w:val="single" w:color="BFC7D5" w:sz="4"/>
+              <w:right w:val="single" w:color="BFC7D5" w:sz="4"/>
+            </w:tcBorders>
+            <w:tcMar>
+              <w:top w:type="dxa" w:w="60"/>
+              <w:left w:type="dxa" w:w="90"/>
+              <w:bottom w:type="dxa" w:w="60"/>
+              <w:right w:type="dxa" w:w="90"/>
+            </w:tcMar>
+          </w:tcPr>
+          <w:p>
+            <w:r>
+              <w:rPr>
+                <w:b w:val="false"/>
+                <w:bCs w:val="false"/>
+                <w:color w:val="222222"/>
+                <w:sz w:val="17"/>
+                <w:szCs w:val="17"/>
+              </w:rPr>
+              <w:t xml:space="preserve">FR-PL-01; NFR-D01</w:t>
+            </w:r>
+          </w:p>
+        </w:tc>
+        <w:tc>
+          <w:tcPr>
+            <w:tcW w:type="dxa" w:w="1751"/>
+            <w:tcBorders>
+              <w:top w:val="single" w:color="BFC7D5" w:sz="4"/>
+              <w:left w:val="single" w:color="BFC7D5" w:sz="4"/>
+              <w:bottom w:val="single" w:color="BFC7D5" w:sz="4"/>
+              <w:right w:val="single" w:color="BFC7D5" w:sz="4"/>
+            </w:tcBorders>
+            <w:tcMar>
+              <w:top w:type="dxa" w:w="60"/>
+              <w:left w:type="dxa" w:w="90"/>
+              <w:bottom w:type="dxa" w:w="60"/>
+              <w:right w:type="dxa" w:w="90"/>
+            </w:tcMar>
+          </w:tcPr>
+          <w:p>
+            <w:r>
+              <w:rPr>
+                <w:b w:val="false"/>
+                <w:bCs w:val="false"/>
+                <w:color w:val="222222"/>
+                <w:sz w:val="17"/>
+                <w:szCs w:val="17"/>
+              </w:rPr>
+              <w:t xml:space="preserve">Platform changed from a single RTX 4090 PC to the DGX Spark</w:t>
+            </w:r>
+          </w:p>
+        </w:tc>
+        <w:tc>
+          <w:tcPr>
+            <w:tcW w:type="dxa" w:w="1050"/>
+            <w:tcBorders>
+              <w:top w:val="single" w:color="BFC7D5" w:sz="4"/>
+              <w:left w:val="single" w:color="BFC7D5" w:sz="4"/>
+              <w:bottom w:val="single" w:color="BFC7D5" w:sz="4"/>
+              <w:right w:val="single" w:color="BFC7D5" w:sz="4"/>
+            </w:tcBorders>
+            <w:tcMar>
+              <w:top w:type="dxa" w:w="60"/>
+              <w:left w:type="dxa" w:w="90"/>
+              <w:bottom w:type="dxa" w:w="60"/>
+              <w:right w:type="dxa" w:w="90"/>
+            </w:tcMar>
+          </w:tcPr>
+          <w:p>
+            <w:r>
+              <w:rPr>
+                <w:b w:val="false"/>
+                <w:bCs w:val="false"/>
+                <w:color w:val="222222"/>
+                <w:sz w:val="17"/>
+                <w:szCs w:val="17"/>
+              </w:rPr>
+              <w:t xml:space="preserve">Capacity and portability</w:t>
+            </w:r>
+          </w:p>
+        </w:tc>
+        <w:tc>
+          <w:tcPr>
+            <w:tcW w:type="dxa" w:w="1050"/>
             <w:tcBorders>
               <w:top w:val="single" w:color="BFC7D5" w:sz="4"/>
               <w:left w:val="single" w:color="BFC7D5" w:sz="4"/>
@@ -1520,65 +1849,123 @@
         </w:tc>
         <w:tc>
           <w:tcPr>
-            <w:tcW w:type="dxa" w:w="1025"/>
-            <w:tcBorders>
-              <w:top w:val="single" w:color="BFC7D5" w:sz="4"/>
-              <w:left w:val="single" w:color="BFC7D5" w:sz="4"/>
-              <w:bottom w:val="single" w:color="BFC7D5" w:sz="4"/>
-              <w:right w:val="single" w:color="BFC7D5" w:sz="4"/>
-            </w:tcBorders>
-            <w:tcMar>
-              <w:top w:type="dxa" w:w="60"/>
-              <w:left w:type="dxa" w:w="90"/>
-              <w:bottom w:type="dxa" w:w="60"/>
-              <w:right w:type="dxa" w:w="90"/>
-            </w:tcMar>
-          </w:tcPr>
-          <w:p>
-            <w:r>
-              <w:rPr>
-                <w:b w:val="false"/>
-                <w:bCs w:val="false"/>
-                <w:color w:val="222222"/>
-                <w:sz w:val="17"/>
-                <w:szCs w:val="17"/>
-              </w:rPr>
-              <w:t xml:space="preserve">CR-2026-01</w:t>
-            </w:r>
-          </w:p>
-        </w:tc>
-        <w:tc>
-          <w:tcPr>
-            <w:tcW w:type="dxa" w:w="2237"/>
-            <w:tcBorders>
-              <w:top w:val="single" w:color="BFC7D5" w:sz="4"/>
-              <w:left w:val="single" w:color="BFC7D5" w:sz="4"/>
-              <w:bottom w:val="single" w:color="BFC7D5" w:sz="4"/>
-              <w:right w:val="single" w:color="BFC7D5" w:sz="4"/>
-            </w:tcBorders>
-            <w:tcMar>
-              <w:top w:type="dxa" w:w="60"/>
-              <w:left w:type="dxa" w:w="90"/>
-              <w:bottom w:type="dxa" w:w="60"/>
-              <w:right w:type="dxa" w:w="90"/>
-            </w:tcMar>
-          </w:tcPr>
-          <w:p>
-            <w:r>
-              <w:rPr>
-                <w:b w:val="false"/>
-                <w:bCs w:val="false"/>
-                <w:color w:val="222222"/>
-                <w:sz w:val="17"/>
-                <w:szCs w:val="17"/>
-              </w:rPr>
-              <w:t xml:space="preserve">4b90b36, c751d79 (2026-02-05)</w:t>
-            </w:r>
-          </w:p>
-        </w:tc>
-        <w:tc>
-          <w:tcPr>
-            <w:tcW w:type="dxa" w:w="1588"/>
+            <w:tcW w:type="dxa" w:w="1351"/>
+            <w:tcBorders>
+              <w:top w:val="single" w:color="BFC7D5" w:sz="4"/>
+              <w:left w:val="single" w:color="BFC7D5" w:sz="4"/>
+              <w:bottom w:val="single" w:color="BFC7D5" w:sz="4"/>
+              <w:right w:val="single" w:color="BFC7D5" w:sz="4"/>
+            </w:tcBorders>
+            <w:tcMar>
+              <w:top w:type="dxa" w:w="60"/>
+              <w:left w:type="dxa" w:w="90"/>
+              <w:bottom w:type="dxa" w:w="60"/>
+              <w:right w:type="dxa" w:w="90"/>
+            </w:tcMar>
+          </w:tcPr>
+          <w:p>
+            <w:r>
+              <w:rPr>
+                <w:b w:val="false"/>
+                <w:bCs w:val="false"/>
+                <w:color w:val="222222"/>
+                <w:sz w:val="17"/>
+                <w:szCs w:val="17"/>
+              </w:rPr>
+              <w:t xml:space="preserve">EM26-19 review log › CR-2026-01; review record CR-2026-01</w:t>
+            </w:r>
+          </w:p>
+        </w:tc>
+        <w:tc>
+          <w:tcPr>
+            <w:tcW w:type="dxa" w:w="1000"/>
+            <w:tcBorders>
+              <w:top w:val="single" w:color="BFC7D5" w:sz="4"/>
+              <w:left w:val="single" w:color="BFC7D5" w:sz="4"/>
+              <w:bottom w:val="single" w:color="BFC7D5" w:sz="4"/>
+              <w:right w:val="single" w:color="BFC7D5" w:sz="4"/>
+            </w:tcBorders>
+            <w:tcMar>
+              <w:top w:type="dxa" w:w="60"/>
+              <w:left w:type="dxa" w:w="90"/>
+              <w:bottom w:type="dxa" w:w="60"/>
+              <w:right w:type="dxa" w:w="90"/>
+            </w:tcMar>
+          </w:tcPr>
+          <w:p>
+            <w:r>
+              <w:rPr>
+                <w:b w:val="false"/>
+                <w:bCs w:val="false"/>
+                <w:color w:val="222222"/>
+                <w:sz w:val="17"/>
+                <w:szCs w:val="17"/>
+              </w:rPr>
+              <w:t xml:space="preserve">All services ported; new platform</w:t>
+            </w:r>
+          </w:p>
+        </w:tc>
+        <w:tc>
+          <w:tcPr>
+            <w:tcW w:type="dxa" w:w="850"/>
+            <w:tcBorders>
+              <w:top w:val="single" w:color="BFC7D5" w:sz="4"/>
+              <w:left w:val="single" w:color="BFC7D5" w:sz="4"/>
+              <w:bottom w:val="single" w:color="BFC7D5" w:sz="4"/>
+              <w:right w:val="single" w:color="BFC7D5" w:sz="4"/>
+            </w:tcBorders>
+            <w:tcMar>
+              <w:top w:type="dxa" w:w="60"/>
+              <w:left w:type="dxa" w:w="90"/>
+              <w:bottom w:type="dxa" w:w="60"/>
+              <w:right w:type="dxa" w:w="90"/>
+            </w:tcMar>
+          </w:tcPr>
+          <w:p>
+            <w:r>
+              <w:rPr>
+                <w:b w:val="false"/>
+                <w:bCs w:val="false"/>
+                <w:color w:val="222222"/>
+                <w:sz w:val="17"/>
+                <w:szCs w:val="17"/>
+              </w:rPr>
+              <w:t xml:space="preserve">Accepted</w:t>
+            </w:r>
+          </w:p>
+        </w:tc>
+        <w:tc>
+          <w:tcPr>
+            <w:tcW w:type="dxa" w:w="1200"/>
+            <w:tcBorders>
+              <w:top w:val="single" w:color="BFC7D5" w:sz="4"/>
+              <w:left w:val="single" w:color="BFC7D5" w:sz="4"/>
+              <w:bottom w:val="single" w:color="BFC7D5" w:sz="4"/>
+              <w:right w:val="single" w:color="BFC7D5" w:sz="4"/>
+            </w:tcBorders>
+            <w:tcMar>
+              <w:top w:type="dxa" w:w="60"/>
+              <w:left w:type="dxa" w:w="90"/>
+              <w:bottom w:type="dxa" w:w="60"/>
+              <w:right w:type="dxa" w:w="90"/>
+            </w:tcMar>
+          </w:tcPr>
+          <w:p>
+            <w:r>
+              <w:rPr>
+                <w:b w:val="false"/>
+                <w:bCs w:val="false"/>
+                <w:color w:val="222222"/>
+                <w:sz w:val="17"/>
+                <w:szCs w:val="17"/>
+              </w:rPr>
+              <w:t xml:space="preserve">4b90b36, c751d79 — v1.0.0</w:t>
+            </w:r>
+          </w:p>
+        </w:tc>
+        <w:tc>
+          <w:tcPr>
+            <w:tcW w:type="dxa" w:w="1000"/>
             <w:tcBorders>
               <w:top w:val="single" w:color="BFC7D5" w:sz="4"/>
               <w:left w:val="single" w:color="BFC7D5" w:sz="4"/>
@@ -1602,6 +1989,35 @@
                 <w:szCs w:val="17"/>
               </w:rPr>
               <w:t xml:space="preserve">TC-EM-OPS-105</w:t>
+            </w:r>
+          </w:p>
+        </w:tc>
+        <w:tc>
+          <w:tcPr>
+            <w:tcW w:type="dxa" w:w="958"/>
+            <w:tcBorders>
+              <w:top w:val="single" w:color="BFC7D5" w:sz="4"/>
+              <w:left w:val="single" w:color="BFC7D5" w:sz="4"/>
+              <w:bottom w:val="single" w:color="BFC7D5" w:sz="4"/>
+              <w:right w:val="single" w:color="BFC7D5" w:sz="4"/>
+            </w:tcBorders>
+            <w:tcMar>
+              <w:top w:type="dxa" w:w="60"/>
+              <w:left w:type="dxa" w:w="90"/>
+              <w:bottom w:type="dxa" w:w="60"/>
+              <w:right w:type="dxa" w:w="90"/>
+            </w:tcMar>
+          </w:tcPr>
+          <w:p>
+            <w:r>
+              <w:rPr>
+                <w:b w:val="false"/>
+                <w:bCs w:val="false"/>
+                <w:color w:val="222222"/>
+                <w:sz w:val="17"/>
+                <w:szCs w:val="17"/>
+              </w:rPr>
+              <w:t xml:space="preserve">Closed</w:t>
             </w:r>
           </w:p>
         </w:tc>
@@ -1609,7 +2025,7 @@
       <w:tr>
         <w:tc>
           <w:tcPr>
-            <w:tcW w:type="dxa" w:w="932"/>
+            <w:tcW w:type="dxa" w:w="950"/>
             <w:tcBorders>
               <w:top w:val="single" w:color="BFC7D5" w:sz="4"/>
               <w:left w:val="single" w:color="BFC7D5" w:sz="4"/>
@@ -1638,7 +2054,7 @@
         </w:tc>
         <w:tc>
           <w:tcPr>
-            <w:tcW w:type="dxa" w:w="932"/>
+            <w:tcW w:type="dxa" w:w="750"/>
             <w:tcBorders>
               <w:top w:val="single" w:color="BFC7D5" w:sz="4"/>
               <w:left w:val="single" w:color="BFC7D5" w:sz="4"/>
@@ -1667,152 +2083,239 @@
         </w:tc>
         <w:tc>
           <w:tcPr>
-            <w:tcW w:type="dxa" w:w="1212"/>
-            <w:tcBorders>
-              <w:top w:val="single" w:color="BFC7D5" w:sz="4"/>
-              <w:left w:val="single" w:color="BFC7D5" w:sz="4"/>
-              <w:bottom w:val="single" w:color="BFC7D5" w:sz="4"/>
-              <w:right w:val="single" w:color="BFC7D5" w:sz="4"/>
-            </w:tcBorders>
-            <w:tcMar>
-              <w:top w:type="dxa" w:w="60"/>
-              <w:left w:type="dxa" w:w="90"/>
-              <w:bottom w:type="dxa" w:w="60"/>
-              <w:right w:type="dxa" w:w="90"/>
-            </w:tcMar>
-          </w:tcPr>
-          <w:p>
-            <w:r>
-              <w:rPr>
-                <w:b w:val="false"/>
-                <w:bCs w:val="false"/>
-                <w:color w:val="222222"/>
-                <w:sz w:val="17"/>
-                <w:szCs w:val="17"/>
-              </w:rPr>
-              <w:t xml:space="preserve">FR-VC-01</w:t>
-            </w:r>
-          </w:p>
-        </w:tc>
-        <w:tc>
-          <w:tcPr>
-            <w:tcW w:type="dxa" w:w="3543"/>
-            <w:tcBorders>
-              <w:top w:val="single" w:color="BFC7D5" w:sz="4"/>
-              <w:left w:val="single" w:color="BFC7D5" w:sz="4"/>
-              <w:bottom w:val="single" w:color="BFC7D5" w:sz="4"/>
-              <w:right w:val="single" w:color="BFC7D5" w:sz="4"/>
-            </w:tcBorders>
-            <w:tcMar>
-              <w:top w:type="dxa" w:w="60"/>
-              <w:left w:type="dxa" w:w="90"/>
-              <w:bottom w:type="dxa" w:w="60"/>
-              <w:right w:type="dxa" w:w="90"/>
-            </w:tcMar>
-          </w:tcPr>
-          <w:p>
-            <w:r>
-              <w:rPr>
-                <w:b w:val="false"/>
-                <w:bCs w:val="false"/>
-                <w:color w:val="222222"/>
-                <w:sz w:val="17"/>
-                <w:szCs w:val="17"/>
-              </w:rPr>
-              <w:t xml:space="preserve">Conversation must be natural and fast — Unmute stack replaced by PersonaPlex</w:t>
-            </w:r>
-          </w:p>
-        </w:tc>
-        <w:tc>
-          <w:tcPr>
-            <w:tcW w:type="dxa" w:w="1491"/>
-            <w:tcBorders>
-              <w:top w:val="single" w:color="BFC7D5" w:sz="4"/>
-              <w:left w:val="single" w:color="BFC7D5" w:sz="4"/>
-              <w:bottom w:val="single" w:color="BFC7D5" w:sz="4"/>
-              <w:right w:val="single" w:color="BFC7D5" w:sz="4"/>
-            </w:tcBorders>
-            <w:tcMar>
-              <w:top w:type="dxa" w:w="60"/>
-              <w:left w:type="dxa" w:w="90"/>
-              <w:bottom w:type="dxa" w:w="60"/>
-              <w:right w:type="dxa" w:w="90"/>
-            </w:tcMar>
-          </w:tcPr>
-          <w:p>
-            <w:r>
-              <w:rPr>
-                <w:b w:val="false"/>
-                <w:bCs w:val="false"/>
-                <w:color w:val="222222"/>
-                <w:sz w:val="17"/>
-                <w:szCs w:val="17"/>
-              </w:rPr>
-              <w:t xml:space="preserve">Clients A and B</w:t>
-            </w:r>
-          </w:p>
-        </w:tc>
-        <w:tc>
-          <w:tcPr>
-            <w:tcW w:type="dxa" w:w="1025"/>
-            <w:tcBorders>
-              <w:top w:val="single" w:color="BFC7D5" w:sz="4"/>
-              <w:left w:val="single" w:color="BFC7D5" w:sz="4"/>
-              <w:bottom w:val="single" w:color="BFC7D5" w:sz="4"/>
-              <w:right w:val="single" w:color="BFC7D5" w:sz="4"/>
-            </w:tcBorders>
-            <w:tcMar>
-              <w:top w:type="dxa" w:w="60"/>
-              <w:left w:type="dxa" w:w="90"/>
-              <w:bottom w:type="dxa" w:w="60"/>
-              <w:right w:type="dxa" w:w="90"/>
-            </w:tcMar>
-          </w:tcPr>
-          <w:p>
-            <w:r>
-              <w:rPr>
-                <w:b w:val="false"/>
-                <w:bCs w:val="false"/>
-                <w:color w:val="222222"/>
-                <w:sz w:val="17"/>
-                <w:szCs w:val="17"/>
-              </w:rPr>
-              <w:t xml:space="preserve">CR-2026-03</w:t>
-            </w:r>
-          </w:p>
-        </w:tc>
-        <w:tc>
-          <w:tcPr>
-            <w:tcW w:type="dxa" w:w="2237"/>
-            <w:tcBorders>
-              <w:top w:val="single" w:color="BFC7D5" w:sz="4"/>
-              <w:left w:val="single" w:color="BFC7D5" w:sz="4"/>
-              <w:bottom w:val="single" w:color="BFC7D5" w:sz="4"/>
-              <w:right w:val="single" w:color="BFC7D5" w:sz="4"/>
-            </w:tcBorders>
-            <w:tcMar>
-              <w:top w:type="dxa" w:w="60"/>
-              <w:left w:type="dxa" w:w="90"/>
-              <w:bottom w:type="dxa" w:w="60"/>
-              <w:right w:type="dxa" w:w="90"/>
-            </w:tcMar>
-          </w:tcPr>
-          <w:p>
-            <w:r>
-              <w:rPr>
-                <w:b w:val="false"/>
-                <w:bCs w:val="false"/>
-                <w:color w:val="222222"/>
-                <w:sz w:val="17"/>
-                <w:szCs w:val="17"/>
-              </w:rPr>
-              <w:t xml:space="preserve">Trial (QASC 2026 paper)</w:t>
-            </w:r>
-          </w:p>
-        </w:tc>
-        <w:tc>
-          <w:tcPr>
-            <w:tcW w:type="dxa" w:w="1588"/>
+            <w:tcW w:type="dxa" w:w="1050"/>
+            <w:tcBorders>
+              <w:top w:val="single" w:color="BFC7D5" w:sz="4"/>
+              <w:left w:val="single" w:color="BFC7D5" w:sz="4"/>
+              <w:bottom w:val="single" w:color="BFC7D5" w:sz="4"/>
+              <w:right w:val="single" w:color="BFC7D5" w:sz="4"/>
+            </w:tcBorders>
+            <w:tcMar>
+              <w:top w:type="dxa" w:w="60"/>
+              <w:left w:type="dxa" w:w="90"/>
+              <w:bottom w:type="dxa" w:w="60"/>
+              <w:right w:type="dxa" w:w="90"/>
+            </w:tcMar>
+          </w:tcPr>
+          <w:p>
+            <w:r>
+              <w:rPr>
+                <w:b w:val="false"/>
+                <w:bCs w:val="false"/>
+                <w:color w:val="222222"/>
+                <w:sz w:val="17"/>
+                <w:szCs w:val="17"/>
+              </w:rPr>
+              <w:t xml:space="preserve">FR-VC-01; NFR-P04, NFR-P07</w:t>
+            </w:r>
+          </w:p>
+        </w:tc>
+        <w:tc>
+          <w:tcPr>
+            <w:tcW w:type="dxa" w:w="1751"/>
+            <w:tcBorders>
+              <w:top w:val="single" w:color="BFC7D5" w:sz="4"/>
+              <w:left w:val="single" w:color="BFC7D5" w:sz="4"/>
+              <w:bottom w:val="single" w:color="BFC7D5" w:sz="4"/>
+              <w:right w:val="single" w:color="BFC7D5" w:sz="4"/>
+            </w:tcBorders>
+            <w:tcMar>
+              <w:top w:type="dxa" w:w="60"/>
+              <w:left w:type="dxa" w:w="90"/>
+              <w:bottom w:type="dxa" w:w="60"/>
+              <w:right w:type="dxa" w:w="90"/>
+            </w:tcMar>
+          </w:tcPr>
+          <w:p>
+            <w:r>
+              <w:rPr>
+                <w:b w:val="false"/>
+                <w:bCs w:val="false"/>
+                <w:color w:val="222222"/>
+                <w:sz w:val="17"/>
+                <w:szCs w:val="17"/>
+              </w:rPr>
+              <w:t xml:space="preserve">Conversation engine: Kyutai Unmute → NVIDIA PersonaPlex</w:t>
+            </w:r>
+          </w:p>
+        </w:tc>
+        <w:tc>
+          <w:tcPr>
+            <w:tcW w:type="dxa" w:w="1050"/>
+            <w:tcBorders>
+              <w:top w:val="single" w:color="BFC7D5" w:sz="4"/>
+              <w:left w:val="single" w:color="BFC7D5" w:sz="4"/>
+              <w:bottom w:val="single" w:color="BFC7D5" w:sz="4"/>
+              <w:right w:val="single" w:color="BFC7D5" w:sz="4"/>
+            </w:tcBorders>
+            <w:tcMar>
+              <w:top w:type="dxa" w:w="60"/>
+              <w:left w:type="dxa" w:w="90"/>
+              <w:bottom w:type="dxa" w:w="60"/>
+              <w:right w:type="dxa" w:w="90"/>
+            </w:tcMar>
+          </w:tcPr>
+          <w:p>
+            <w:r>
+              <w:rPr>
+                <w:b w:val="false"/>
+                <w:bCs w:val="false"/>
+                <w:color w:val="222222"/>
+                <w:sz w:val="17"/>
+                <w:szCs w:val="17"/>
+              </w:rPr>
+              <w:t xml:space="preserve">Client feedback: not natural, too slow</w:t>
+            </w:r>
+          </w:p>
+        </w:tc>
+        <w:tc>
+          <w:tcPr>
+            <w:tcW w:type="dxa" w:w="1050"/>
+            <w:tcBorders>
+              <w:top w:val="single" w:color="BFC7D5" w:sz="4"/>
+              <w:left w:val="single" w:color="BFC7D5" w:sz="4"/>
+              <w:bottom w:val="single" w:color="BFC7D5" w:sz="4"/>
+              <w:right w:val="single" w:color="BFC7D5" w:sz="4"/>
+            </w:tcBorders>
+            <w:tcMar>
+              <w:top w:type="dxa" w:w="60"/>
+              <w:left w:type="dxa" w:w="90"/>
+              <w:bottom w:type="dxa" w:w="60"/>
+              <w:right w:type="dxa" w:w="90"/>
+            </w:tcMar>
+          </w:tcPr>
+          <w:p>
+            <w:r>
+              <w:rPr>
+                <w:b w:val="false"/>
+                <w:bCs w:val="false"/>
+                <w:color w:val="222222"/>
+                <w:sz w:val="17"/>
+                <w:szCs w:val="17"/>
+              </w:rPr>
+              <w:t xml:space="preserve">Client A; Client B (Bahrain)</w:t>
+            </w:r>
+          </w:p>
+        </w:tc>
+        <w:tc>
+          <w:tcPr>
+            <w:tcW w:type="dxa" w:w="1351"/>
+            <w:tcBorders>
+              <w:top w:val="single" w:color="BFC7D5" w:sz="4"/>
+              <w:left w:val="single" w:color="BFC7D5" w:sz="4"/>
+              <w:bottom w:val="single" w:color="BFC7D5" w:sz="4"/>
+              <w:right w:val="single" w:color="BFC7D5" w:sz="4"/>
+            </w:tcBorders>
+            <w:tcMar>
+              <w:top w:type="dxa" w:w="60"/>
+              <w:left w:type="dxa" w:w="90"/>
+              <w:bottom w:type="dxa" w:w="60"/>
+              <w:right w:type="dxa" w:w="90"/>
+            </w:tcMar>
+          </w:tcPr>
+          <w:p>
+            <w:r>
+              <w:rPr>
+                <w:b w:val="false"/>
+                <w:bCs w:val="false"/>
+                <w:color w:val="222222"/>
+                <w:sz w:val="17"/>
+                <w:szCs w:val="17"/>
+              </w:rPr>
+              <w:t xml:space="preserve">EM26-19 review log › CR-2026-03; review record CR-2026-03</w:t>
+            </w:r>
+          </w:p>
+        </w:tc>
+        <w:tc>
+          <w:tcPr>
+            <w:tcW w:type="dxa" w:w="1000"/>
+            <w:tcBorders>
+              <w:top w:val="single" w:color="BFC7D5" w:sz="4"/>
+              <w:left w:val="single" w:color="BFC7D5" w:sz="4"/>
+              <w:bottom w:val="single" w:color="BFC7D5" w:sz="4"/>
+              <w:right w:val="single" w:color="BFC7D5" w:sz="4"/>
+            </w:tcBorders>
+            <w:tcMar>
+              <w:top w:type="dxa" w:w="60"/>
+              <w:left w:type="dxa" w:w="90"/>
+              <w:bottom w:type="dxa" w:w="60"/>
+              <w:right w:type="dxa" w:w="90"/>
+            </w:tcMar>
+          </w:tcPr>
+          <w:p>
+            <w:r>
+              <w:rPr>
+                <w:b w:val="false"/>
+                <w:bCs w:val="false"/>
+                <w:color w:val="222222"/>
+                <w:sz w:val="17"/>
+                <w:szCs w:val="17"/>
+              </w:rPr>
+              <w:t xml:space="preserve">Voice engine replaced</w:t>
+            </w:r>
+          </w:p>
+        </w:tc>
+        <w:tc>
+          <w:tcPr>
+            <w:tcW w:type="dxa" w:w="850"/>
+            <w:tcBorders>
+              <w:top w:val="single" w:color="BFC7D5" w:sz="4"/>
+              <w:left w:val="single" w:color="BFC7D5" w:sz="4"/>
+              <w:bottom w:val="single" w:color="BFC7D5" w:sz="4"/>
+              <w:right w:val="single" w:color="BFC7D5" w:sz="4"/>
+            </w:tcBorders>
+            <w:tcMar>
+              <w:top w:type="dxa" w:w="60"/>
+              <w:left w:type="dxa" w:w="90"/>
+              <w:bottom w:type="dxa" w:w="60"/>
+              <w:right w:type="dxa" w:w="90"/>
+            </w:tcMar>
+          </w:tcPr>
+          <w:p>
+            <w:r>
+              <w:rPr>
+                <w:b w:val="false"/>
+                <w:bCs w:val="false"/>
+                <w:color w:val="222222"/>
+                <w:sz w:val="17"/>
+                <w:szCs w:val="17"/>
+              </w:rPr>
+              <w:t xml:space="preserve">Accepted</w:t>
+            </w:r>
+          </w:p>
+        </w:tc>
+        <w:tc>
+          <w:tcPr>
+            <w:tcW w:type="dxa" w:w="1200"/>
+            <w:tcBorders>
+              <w:top w:val="single" w:color="BFC7D5" w:sz="4"/>
+              <w:left w:val="single" w:color="BFC7D5" w:sz="4"/>
+              <w:bottom w:val="single" w:color="BFC7D5" w:sz="4"/>
+              <w:right w:val="single" w:color="BFC7D5" w:sz="4"/>
+            </w:tcBorders>
+            <w:tcMar>
+              <w:top w:type="dxa" w:w="60"/>
+              <w:left w:type="dxa" w:w="90"/>
+              <w:bottom w:type="dxa" w:w="60"/>
+              <w:right w:type="dxa" w:w="90"/>
+            </w:tcMar>
+          </w:tcPr>
+          <w:p>
+            <w:r>
+              <w:rPr>
+                <w:b w:val="false"/>
+                <w:bCs w:val="false"/>
+                <w:color w:val="222222"/>
+                <w:sz w:val="17"/>
+                <w:szCs w:val="17"/>
+              </w:rPr>
+              <w:t xml:space="preserve">Trial (compared in the QASC 2026 paper)</w:t>
+            </w:r>
+          </w:p>
+        </w:tc>
+        <w:tc>
+          <w:tcPr>
+            <w:tcW w:type="dxa" w:w="1000"/>
             <w:tcBorders>
               <w:top w:val="single" w:color="BFC7D5" w:sz="4"/>
               <w:left w:val="single" w:color="BFC7D5" w:sz="4"/>
@@ -1836,6 +2339,35 @@
                 <w:szCs w:val="17"/>
               </w:rPr>
               <w:t xml:space="preserve">Client review CR-2026-04</w:t>
+            </w:r>
+          </w:p>
+        </w:tc>
+        <w:tc>
+          <w:tcPr>
+            <w:tcW w:type="dxa" w:w="958"/>
+            <w:tcBorders>
+              <w:top w:val="single" w:color="BFC7D5" w:sz="4"/>
+              <w:left w:val="single" w:color="BFC7D5" w:sz="4"/>
+              <w:bottom w:val="single" w:color="BFC7D5" w:sz="4"/>
+              <w:right w:val="single" w:color="BFC7D5" w:sz="4"/>
+            </w:tcBorders>
+            <w:tcMar>
+              <w:top w:type="dxa" w:w="60"/>
+              <w:left w:type="dxa" w:w="90"/>
+              <w:bottom w:type="dxa" w:w="60"/>
+              <w:right w:type="dxa" w:w="90"/>
+            </w:tcMar>
+          </w:tcPr>
+          <w:p>
+            <w:r>
+              <w:rPr>
+                <w:b w:val="false"/>
+                <w:bCs w:val="false"/>
+                <w:color w:val="222222"/>
+                <w:sz w:val="17"/>
+                <w:szCs w:val="17"/>
+              </w:rPr>
+              <w:t xml:space="preserve">Superseded by RC-2026-03</w:t>
             </w:r>
           </w:p>
         </w:tc>
@@ -1843,7 +2375,7 @@
       <w:tr>
         <w:tc>
           <w:tcPr>
-            <w:tcW w:type="dxa" w:w="932"/>
+            <w:tcW w:type="dxa" w:w="950"/>
             <w:tcBorders>
               <w:top w:val="single" w:color="BFC7D5" w:sz="4"/>
               <w:left w:val="single" w:color="BFC7D5" w:sz="4"/>
@@ -1872,7 +2404,7 @@
         </w:tc>
         <w:tc>
           <w:tcPr>
-            <w:tcW w:type="dxa" w:w="932"/>
+            <w:tcW w:type="dxa" w:w="750"/>
             <w:tcBorders>
               <w:top w:val="single" w:color="BFC7D5" w:sz="4"/>
               <w:left w:val="single" w:color="BFC7D5" w:sz="4"/>
@@ -1901,175 +2433,291 @@
         </w:tc>
         <w:tc>
           <w:tcPr>
-            <w:tcW w:type="dxa" w:w="1212"/>
-            <w:tcBorders>
-              <w:top w:val="single" w:color="BFC7D5" w:sz="4"/>
-              <w:left w:val="single" w:color="BFC7D5" w:sz="4"/>
-              <w:bottom w:val="single" w:color="BFC7D5" w:sz="4"/>
-              <w:right w:val="single" w:color="BFC7D5" w:sz="4"/>
-            </w:tcBorders>
-            <w:tcMar>
-              <w:top w:type="dxa" w:w="60"/>
-              <w:left w:type="dxa" w:w="90"/>
-              <w:bottom w:type="dxa" w:w="60"/>
-              <w:right w:type="dxa" w:w="90"/>
-            </w:tcMar>
-          </w:tcPr>
-          <w:p>
-            <w:r>
-              <w:rPr>
-                <w:b w:val="false"/>
-                <w:bCs w:val="false"/>
-                <w:color w:val="222222"/>
-                <w:sz w:val="17"/>
-                <w:szCs w:val="17"/>
-              </w:rPr>
-              <w:t xml:space="preserve">FR-VC-01</w:t>
-            </w:r>
-          </w:p>
-        </w:tc>
-        <w:tc>
-          <w:tcPr>
-            <w:tcW w:type="dxa" w:w="3543"/>
-            <w:tcBorders>
-              <w:top w:val="single" w:color="BFC7D5" w:sz="4"/>
-              <w:left w:val="single" w:color="BFC7D5" w:sz="4"/>
-              <w:bottom w:val="single" w:color="BFC7D5" w:sz="4"/>
-              <w:right w:val="single" w:color="BFC7D5" w:sz="4"/>
-            </w:tcBorders>
-            <w:tcMar>
-              <w:top w:type="dxa" w:w="60"/>
-              <w:left w:type="dxa" w:w="90"/>
-              <w:bottom w:type="dxa" w:w="60"/>
-              <w:right w:type="dxa" w:w="90"/>
-            </w:tcMar>
-          </w:tcPr>
-          <w:p>
-            <w:r>
-              <w:rPr>
-                <w:b w:val="false"/>
-                <w:bCs w:val="false"/>
-                <w:color w:val="222222"/>
-                <w:sz w:val="17"/>
-                <w:szCs w:val="17"/>
-              </w:rPr>
-              <w:t xml:space="preserve">Conversation must use the customer's large knowledge base — own dual-loop architecture</w:t>
-            </w:r>
-          </w:p>
-        </w:tc>
-        <w:tc>
-          <w:tcPr>
-            <w:tcW w:type="dxa" w:w="1491"/>
-            <w:tcBorders>
-              <w:top w:val="single" w:color="BFC7D5" w:sz="4"/>
-              <w:left w:val="single" w:color="BFC7D5" w:sz="4"/>
-              <w:bottom w:val="single" w:color="BFC7D5" w:sz="4"/>
-              <w:right w:val="single" w:color="BFC7D5" w:sz="4"/>
-            </w:tcBorders>
-            <w:tcMar>
-              <w:top w:type="dxa" w:w="60"/>
-              <w:left w:type="dxa" w:w="90"/>
-              <w:bottom w:type="dxa" w:w="60"/>
-              <w:right w:type="dxa" w:w="90"/>
-            </w:tcMar>
-          </w:tcPr>
-          <w:p>
-            <w:r>
-              <w:rPr>
-                <w:b w:val="false"/>
-                <w:bCs w:val="false"/>
-                <w:color w:val="222222"/>
-                <w:sz w:val="17"/>
-                <w:szCs w:val="17"/>
-              </w:rPr>
-              <w:t xml:space="preserve">Clients A and B</w:t>
-            </w:r>
-          </w:p>
-        </w:tc>
-        <w:tc>
-          <w:tcPr>
-            <w:tcW w:type="dxa" w:w="1025"/>
-            <w:tcBorders>
-              <w:top w:val="single" w:color="BFC7D5" w:sz="4"/>
-              <w:left w:val="single" w:color="BFC7D5" w:sz="4"/>
-              <w:bottom w:val="single" w:color="BFC7D5" w:sz="4"/>
-              <w:right w:val="single" w:color="BFC7D5" w:sz="4"/>
-            </w:tcBorders>
-            <w:tcMar>
-              <w:top w:type="dxa" w:w="60"/>
-              <w:left w:type="dxa" w:w="90"/>
-              <w:bottom w:type="dxa" w:w="60"/>
-              <w:right w:type="dxa" w:w="90"/>
-            </w:tcMar>
-          </w:tcPr>
-          <w:p>
-            <w:r>
-              <w:rPr>
-                <w:b w:val="false"/>
-                <w:bCs w:val="false"/>
-                <w:color w:val="222222"/>
-                <w:sz w:val="17"/>
-                <w:szCs w:val="17"/>
-              </w:rPr>
-              <w:t xml:space="preserve">CR-2026-04</w:t>
-            </w:r>
-          </w:p>
-        </w:tc>
-        <w:tc>
-          <w:tcPr>
-            <w:tcW w:type="dxa" w:w="2237"/>
-            <w:tcBorders>
-              <w:top w:val="single" w:color="BFC7D5" w:sz="4"/>
-              <w:left w:val="single" w:color="BFC7D5" w:sz="4"/>
-              <w:bottom w:val="single" w:color="BFC7D5" w:sz="4"/>
-              <w:right w:val="single" w:color="BFC7D5" w:sz="4"/>
-            </w:tcBorders>
-            <w:tcMar>
-              <w:top w:type="dxa" w:w="60"/>
-              <w:left w:type="dxa" w:w="90"/>
-              <w:bottom w:type="dxa" w:w="60"/>
-              <w:right w:type="dxa" w:w="90"/>
-            </w:tcMar>
-          </w:tcPr>
-          <w:p>
-            <w:r>
-              <w:rPr>
-                <w:b w:val="false"/>
-                <w:bCs w:val="false"/>
-                <w:color w:val="222222"/>
-                <w:sz w:val="17"/>
-                <w:szCs w:val="17"/>
-              </w:rPr>
-              <w:t xml:space="preserve">ddc0aa3, d89aeda (2026-04-08)</w:t>
-            </w:r>
-          </w:p>
-        </w:tc>
-        <w:tc>
-          <w:tcPr>
-            <w:tcW w:type="dxa" w:w="1588"/>
-            <w:tcBorders>
-              <w:top w:val="single" w:color="BFC7D5" w:sz="4"/>
-              <w:left w:val="single" w:color="BFC7D5" w:sz="4"/>
-              <w:bottom w:val="single" w:color="BFC7D5" w:sz="4"/>
-              <w:right w:val="single" w:color="BFC7D5" w:sz="4"/>
-            </w:tcBorders>
-            <w:tcMar>
-              <w:top w:type="dxa" w:w="60"/>
-              <w:left w:type="dxa" w:w="90"/>
-              <w:bottom w:type="dxa" w:w="60"/>
-              <w:right w:type="dxa" w:w="90"/>
-            </w:tcMar>
-          </w:tcPr>
-          <w:p>
-            <w:r>
-              <w:rPr>
-                <w:b w:val="false"/>
-                <w:bCs w:val="false"/>
-                <w:color w:val="222222"/>
-                <w:sz w:val="17"/>
-                <w:szCs w:val="17"/>
-              </w:rPr>
-              <w:t xml:space="preserve">Research harness E4/E7 (2026-08-07)</w:t>
+            <w:tcW w:type="dxa" w:w="1050"/>
+            <w:tcBorders>
+              <w:top w:val="single" w:color="BFC7D5" w:sz="4"/>
+              <w:left w:val="single" w:color="BFC7D5" w:sz="4"/>
+              <w:bottom w:val="single" w:color="BFC7D5" w:sz="4"/>
+              <w:right w:val="single" w:color="BFC7D5" w:sz="4"/>
+            </w:tcBorders>
+            <w:tcMar>
+              <w:top w:type="dxa" w:w="60"/>
+              <w:left w:type="dxa" w:w="90"/>
+              <w:bottom w:type="dxa" w:w="60"/>
+              <w:right w:type="dxa" w:w="90"/>
+            </w:tcMar>
+          </w:tcPr>
+          <w:p>
+            <w:r>
+              <w:rPr>
+                <w:b w:val="false"/>
+                <w:bCs w:val="false"/>
+                <w:color w:val="222222"/>
+                <w:sz w:val="17"/>
+                <w:szCs w:val="17"/>
+              </w:rPr>
+              <w:t xml:space="preserve">FR-VC-01, FR-VC-02; NFR-P04</w:t>
+            </w:r>
+          </w:p>
+        </w:tc>
+        <w:tc>
+          <w:tcPr>
+            <w:tcW w:type="dxa" w:w="1751"/>
+            <w:tcBorders>
+              <w:top w:val="single" w:color="BFC7D5" w:sz="4"/>
+              <w:left w:val="single" w:color="BFC7D5" w:sz="4"/>
+              <w:bottom w:val="single" w:color="BFC7D5" w:sz="4"/>
+              <w:right w:val="single" w:color="BFC7D5" w:sz="4"/>
+            </w:tcBorders>
+            <w:tcMar>
+              <w:top w:type="dxa" w:w="60"/>
+              <w:left w:type="dxa" w:w="90"/>
+              <w:bottom w:type="dxa" w:w="60"/>
+              <w:right w:type="dxa" w:w="90"/>
+            </w:tcMar>
+          </w:tcPr>
+          <w:p>
+            <w:r>
+              <w:rPr>
+                <w:b w:val="false"/>
+                <w:bCs w:val="false"/>
+                <w:color w:val="222222"/>
+                <w:sz w:val="17"/>
+                <w:szCs w:val="17"/>
+              </w:rPr>
+              <w:t xml:space="preserve">Conversation engine: PersonaPlex → own dual-loop flow grounded in the client's knowledge base</w:t>
+            </w:r>
+          </w:p>
+        </w:tc>
+        <w:tc>
+          <w:tcPr>
+            <w:tcW w:type="dxa" w:w="1050"/>
+            <w:tcBorders>
+              <w:top w:val="single" w:color="BFC7D5" w:sz="4"/>
+              <w:left w:val="single" w:color="BFC7D5" w:sz="4"/>
+              <w:bottom w:val="single" w:color="BFC7D5" w:sz="4"/>
+              <w:right w:val="single" w:color="BFC7D5" w:sz="4"/>
+            </w:tcBorders>
+            <w:tcMar>
+              <w:top w:type="dxa" w:w="60"/>
+              <w:left w:type="dxa" w:w="90"/>
+              <w:bottom w:type="dxa" w:w="60"/>
+              <w:right w:type="dxa" w:w="90"/>
+            </w:tcMar>
+          </w:tcPr>
+          <w:p>
+            <w:r>
+              <w:rPr>
+                <w:b w:val="false"/>
+                <w:bCs w:val="false"/>
+                <w:color w:val="222222"/>
+                <w:sz w:val="17"/>
+                <w:szCs w:val="17"/>
+              </w:rPr>
+              <w:t xml:space="preserve">Client feedback: must use the client's large data</w:t>
+            </w:r>
+          </w:p>
+        </w:tc>
+        <w:tc>
+          <w:tcPr>
+            <w:tcW w:type="dxa" w:w="1050"/>
+            <w:tcBorders>
+              <w:top w:val="single" w:color="BFC7D5" w:sz="4"/>
+              <w:left w:val="single" w:color="BFC7D5" w:sz="4"/>
+              <w:bottom w:val="single" w:color="BFC7D5" w:sz="4"/>
+              <w:right w:val="single" w:color="BFC7D5" w:sz="4"/>
+            </w:tcBorders>
+            <w:tcMar>
+              <w:top w:type="dxa" w:w="60"/>
+              <w:left w:type="dxa" w:w="90"/>
+              <w:bottom w:type="dxa" w:w="60"/>
+              <w:right w:type="dxa" w:w="90"/>
+            </w:tcMar>
+          </w:tcPr>
+          <w:p>
+            <w:r>
+              <w:rPr>
+                <w:b w:val="false"/>
+                <w:bCs w:val="false"/>
+                <w:color w:val="222222"/>
+                <w:sz w:val="17"/>
+                <w:szCs w:val="17"/>
+              </w:rPr>
+              <w:t xml:space="preserve">Client A; Client B (Bahrain)</w:t>
+            </w:r>
+          </w:p>
+        </w:tc>
+        <w:tc>
+          <w:tcPr>
+            <w:tcW w:type="dxa" w:w="1351"/>
+            <w:tcBorders>
+              <w:top w:val="single" w:color="BFC7D5" w:sz="4"/>
+              <w:left w:val="single" w:color="BFC7D5" w:sz="4"/>
+              <w:bottom w:val="single" w:color="BFC7D5" w:sz="4"/>
+              <w:right w:val="single" w:color="BFC7D5" w:sz="4"/>
+            </w:tcBorders>
+            <w:tcMar>
+              <w:top w:type="dxa" w:w="60"/>
+              <w:left w:type="dxa" w:w="90"/>
+              <w:bottom w:type="dxa" w:w="60"/>
+              <w:right w:type="dxa" w:w="90"/>
+            </w:tcMar>
+          </w:tcPr>
+          <w:p>
+            <w:r>
+              <w:rPr>
+                <w:b w:val="false"/>
+                <w:bCs w:val="false"/>
+                <w:color w:val="222222"/>
+                <w:sz w:val="17"/>
+                <w:szCs w:val="17"/>
+              </w:rPr>
+              <w:t xml:space="preserve">EM26-19 review log › CR-2026-04; review record CR-2026-04</w:t>
+            </w:r>
+          </w:p>
+        </w:tc>
+        <w:tc>
+          <w:tcPr>
+            <w:tcW w:type="dxa" w:w="1000"/>
+            <w:tcBorders>
+              <w:top w:val="single" w:color="BFC7D5" w:sz="4"/>
+              <w:left w:val="single" w:color="BFC7D5" w:sz="4"/>
+              <w:bottom w:val="single" w:color="BFC7D5" w:sz="4"/>
+              <w:right w:val="single" w:color="BFC7D5" w:sz="4"/>
+            </w:tcBorders>
+            <w:tcMar>
+              <w:top w:type="dxa" w:w="60"/>
+              <w:left w:type="dxa" w:w="90"/>
+              <w:bottom w:type="dxa" w:w="60"/>
+              <w:right w:type="dxa" w:w="90"/>
+            </w:tcMar>
+          </w:tcPr>
+          <w:p>
+            <w:r>
+              <w:rPr>
+                <w:b w:val="false"/>
+                <w:bCs w:val="false"/>
+                <w:color w:val="222222"/>
+                <w:sz w:val="17"/>
+                <w:szCs w:val="17"/>
+              </w:rPr>
+              <w:t xml:space="preserve">New voice architecture; Nemotron speech recognition</w:t>
+            </w:r>
+          </w:p>
+        </w:tc>
+        <w:tc>
+          <w:tcPr>
+            <w:tcW w:type="dxa" w:w="850"/>
+            <w:tcBorders>
+              <w:top w:val="single" w:color="BFC7D5" w:sz="4"/>
+              <w:left w:val="single" w:color="BFC7D5" w:sz="4"/>
+              <w:bottom w:val="single" w:color="BFC7D5" w:sz="4"/>
+              <w:right w:val="single" w:color="BFC7D5" w:sz="4"/>
+            </w:tcBorders>
+            <w:tcMar>
+              <w:top w:type="dxa" w:w="60"/>
+              <w:left w:type="dxa" w:w="90"/>
+              <w:bottom w:type="dxa" w:w="60"/>
+              <w:right w:type="dxa" w:w="90"/>
+            </w:tcMar>
+          </w:tcPr>
+          <w:p>
+            <w:r>
+              <w:rPr>
+                <w:b w:val="false"/>
+                <w:bCs w:val="false"/>
+                <w:color w:val="222222"/>
+                <w:sz w:val="17"/>
+                <w:szCs w:val="17"/>
+              </w:rPr>
+              <w:t xml:space="preserve">Accepted</w:t>
+            </w:r>
+          </w:p>
+        </w:tc>
+        <w:tc>
+          <w:tcPr>
+            <w:tcW w:type="dxa" w:w="1200"/>
+            <w:tcBorders>
+              <w:top w:val="single" w:color="BFC7D5" w:sz="4"/>
+              <w:left w:val="single" w:color="BFC7D5" w:sz="4"/>
+              <w:bottom w:val="single" w:color="BFC7D5" w:sz="4"/>
+              <w:right w:val="single" w:color="BFC7D5" w:sz="4"/>
+            </w:tcBorders>
+            <w:tcMar>
+              <w:top w:type="dxa" w:w="60"/>
+              <w:left w:type="dxa" w:w="90"/>
+              <w:bottom w:type="dxa" w:w="60"/>
+              <w:right w:type="dxa" w:w="90"/>
+            </w:tcMar>
+          </w:tcPr>
+          <w:p>
+            <w:r>
+              <w:rPr>
+                <w:b w:val="false"/>
+                <w:bCs w:val="false"/>
+                <w:color w:val="222222"/>
+                <w:sz w:val="17"/>
+                <w:szCs w:val="17"/>
+              </w:rPr>
+              <w:t xml:space="preserve">ddc0aa3, d89aeda — v1.1.0</w:t>
+            </w:r>
+          </w:p>
+        </w:tc>
+        <w:tc>
+          <w:tcPr>
+            <w:tcW w:type="dxa" w:w="1000"/>
+            <w:tcBorders>
+              <w:top w:val="single" w:color="BFC7D5" w:sz="4"/>
+              <w:left w:val="single" w:color="BFC7D5" w:sz="4"/>
+              <w:bottom w:val="single" w:color="BFC7D5" w:sz="4"/>
+              <w:right w:val="single" w:color="BFC7D5" w:sz="4"/>
+            </w:tcBorders>
+            <w:tcMar>
+              <w:top w:type="dxa" w:w="60"/>
+              <w:left w:type="dxa" w:w="90"/>
+              <w:bottom w:type="dxa" w:w="60"/>
+              <w:right w:type="dxa" w:w="90"/>
+            </w:tcMar>
+          </w:tcPr>
+          <w:p>
+            <w:r>
+              <w:rPr>
+                <w:b w:val="false"/>
+                <w:bCs w:val="false"/>
+                <w:color w:val="222222"/>
+                <w:sz w:val="17"/>
+                <w:szCs w:val="17"/>
+              </w:rPr>
+              <w:t xml:space="preserve">Research harness E4/E7: 636 ms median</w:t>
+            </w:r>
+          </w:p>
+        </w:tc>
+        <w:tc>
+          <w:tcPr>
+            <w:tcW w:type="dxa" w:w="958"/>
+            <w:tcBorders>
+              <w:top w:val="single" w:color="BFC7D5" w:sz="4"/>
+              <w:left w:val="single" w:color="BFC7D5" w:sz="4"/>
+              <w:bottom w:val="single" w:color="BFC7D5" w:sz="4"/>
+              <w:right w:val="single" w:color="BFC7D5" w:sz="4"/>
+            </w:tcBorders>
+            <w:tcMar>
+              <w:top w:type="dxa" w:w="60"/>
+              <w:left w:type="dxa" w:w="90"/>
+              <w:bottom w:type="dxa" w:w="60"/>
+              <w:right w:type="dxa" w:w="90"/>
+            </w:tcMar>
+          </w:tcPr>
+          <w:p>
+            <w:r>
+              <w:rPr>
+                <w:b w:val="false"/>
+                <w:bCs w:val="false"/>
+                <w:color w:val="222222"/>
+                <w:sz w:val="17"/>
+                <w:szCs w:val="17"/>
+              </w:rPr>
+              <w:t xml:space="preserve">Closed</w:t>
             </w:r>
           </w:p>
         </w:tc>
@@ -2077,7 +2725,7 @@
       <w:tr>
         <w:tc>
           <w:tcPr>
-            <w:tcW w:type="dxa" w:w="932"/>
+            <w:tcW w:type="dxa" w:w="950"/>
             <w:tcBorders>
               <w:top w:val="single" w:color="BFC7D5" w:sz="4"/>
               <w:left w:val="single" w:color="BFC7D5" w:sz="4"/>
@@ -2106,7 +2754,7 @@
         </w:tc>
         <w:tc>
           <w:tcPr>
-            <w:tcW w:type="dxa" w:w="932"/>
+            <w:tcW w:type="dxa" w:w="750"/>
             <w:tcBorders>
               <w:top w:val="single" w:color="BFC7D5" w:sz="4"/>
               <w:left w:val="single" w:color="BFC7D5" w:sz="4"/>
@@ -2135,175 +2783,291 @@
         </w:tc>
         <w:tc>
           <w:tcPr>
-            <w:tcW w:type="dxa" w:w="1212"/>
-            <w:tcBorders>
-              <w:top w:val="single" w:color="BFC7D5" w:sz="4"/>
-              <w:left w:val="single" w:color="BFC7D5" w:sz="4"/>
-              <w:bottom w:val="single" w:color="BFC7D5" w:sz="4"/>
-              <w:right w:val="single" w:color="BFC7D5" w:sz="4"/>
-            </w:tcBorders>
-            <w:tcMar>
-              <w:top w:type="dxa" w:w="60"/>
-              <w:left w:type="dxa" w:w="90"/>
-              <w:bottom w:type="dxa" w:w="60"/>
-              <w:right w:type="dxa" w:w="90"/>
-            </w:tcMar>
-          </w:tcPr>
-          <w:p>
-            <w:r>
-              <w:rPr>
-                <w:b w:val="false"/>
-                <w:bCs w:val="false"/>
-                <w:color w:val="222222"/>
-                <w:sz w:val="17"/>
-                <w:szCs w:val="17"/>
-              </w:rPr>
-              <w:t xml:space="preserve">FR-KC-04</w:t>
-            </w:r>
-          </w:p>
-        </w:tc>
-        <w:tc>
-          <w:tcPr>
-            <w:tcW w:type="dxa" w:w="3543"/>
-            <w:tcBorders>
-              <w:top w:val="single" w:color="BFC7D5" w:sz="4"/>
-              <w:left w:val="single" w:color="BFC7D5" w:sz="4"/>
-              <w:bottom w:val="single" w:color="BFC7D5" w:sz="4"/>
-              <w:right w:val="single" w:color="BFC7D5" w:sz="4"/>
-            </w:tcBorders>
-            <w:tcMar>
-              <w:top w:type="dxa" w:w="60"/>
-              <w:left w:type="dxa" w:w="90"/>
-              <w:bottom w:type="dxa" w:w="60"/>
-              <w:right w:type="dxa" w:w="90"/>
-            </w:tcMar>
-          </w:tcPr>
-          <w:p>
-            <w:r>
-              <w:rPr>
-                <w:b w:val="false"/>
-                <w:bCs w:val="false"/>
-                <w:color w:val="222222"/>
-                <w:sz w:val="17"/>
-                <w:szCs w:val="17"/>
-              </w:rPr>
-              <w:t xml:space="preserve">DoD FMR retrieval: BookRAG and PageIndex tried; section-based retrieval kept; BookRAG switched off as it measured worse (43/52 vs 50/52)</w:t>
-            </w:r>
-          </w:p>
-        </w:tc>
-        <w:tc>
-          <w:tcPr>
-            <w:tcW w:type="dxa" w:w="1491"/>
-            <w:tcBorders>
-              <w:top w:val="single" w:color="BFC7D5" w:sz="4"/>
-              <w:left w:val="single" w:color="BFC7D5" w:sz="4"/>
-              <w:bottom w:val="single" w:color="BFC7D5" w:sz="4"/>
-              <w:right w:val="single" w:color="BFC7D5" w:sz="4"/>
-            </w:tcBorders>
-            <w:tcMar>
-              <w:top w:type="dxa" w:w="60"/>
-              <w:left w:type="dxa" w:w="90"/>
-              <w:bottom w:type="dxa" w:w="60"/>
-              <w:right w:type="dxa" w:w="90"/>
-            </w:tcMar>
-          </w:tcPr>
-          <w:p>
-            <w:r>
-              <w:rPr>
-                <w:b w:val="false"/>
-                <w:bCs w:val="false"/>
-                <w:color w:val="222222"/>
-                <w:sz w:val="17"/>
-                <w:szCs w:val="17"/>
-              </w:rPr>
-              <w:t xml:space="preserve">EchoMind team</w:t>
-            </w:r>
-          </w:p>
-        </w:tc>
-        <w:tc>
-          <w:tcPr>
-            <w:tcW w:type="dxa" w:w="1025"/>
-            <w:tcBorders>
-              <w:top w:val="single" w:color="BFC7D5" w:sz="4"/>
-              <w:left w:val="single" w:color="BFC7D5" w:sz="4"/>
-              <w:bottom w:val="single" w:color="BFC7D5" w:sz="4"/>
-              <w:right w:val="single" w:color="BFC7D5" w:sz="4"/>
-            </w:tcBorders>
-            <w:tcMar>
-              <w:top w:type="dxa" w:w="60"/>
-              <w:left w:type="dxa" w:w="90"/>
-              <w:bottom w:type="dxa" w:w="60"/>
-              <w:right w:type="dxa" w:w="90"/>
-            </w:tcMar>
-          </w:tcPr>
-          <w:p>
-            <w:r>
-              <w:rPr>
-                <w:b w:val="false"/>
-                <w:bCs w:val="false"/>
-                <w:color w:val="222222"/>
-                <w:sz w:val="17"/>
-                <w:szCs w:val="17"/>
-              </w:rPr>
-              <w:t xml:space="preserve">CR-2026-02</w:t>
-            </w:r>
-          </w:p>
-        </w:tc>
-        <w:tc>
-          <w:tcPr>
-            <w:tcW w:type="dxa" w:w="2237"/>
-            <w:tcBorders>
-              <w:top w:val="single" w:color="BFC7D5" w:sz="4"/>
-              <w:left w:val="single" w:color="BFC7D5" w:sz="4"/>
-              <w:bottom w:val="single" w:color="BFC7D5" w:sz="4"/>
-              <w:right w:val="single" w:color="BFC7D5" w:sz="4"/>
-            </w:tcBorders>
-            <w:tcMar>
-              <w:top w:type="dxa" w:w="60"/>
-              <w:left w:type="dxa" w:w="90"/>
-              <w:bottom w:type="dxa" w:w="60"/>
-              <w:right w:type="dxa" w:w="90"/>
-            </w:tcMar>
-          </w:tcPr>
-          <w:p>
-            <w:r>
-              <w:rPr>
-                <w:b w:val="false"/>
-                <w:bCs w:val="false"/>
-                <w:color w:val="222222"/>
-                <w:sz w:val="17"/>
-                <w:szCs w:val="17"/>
-              </w:rPr>
-              <w:t xml:space="preserve">18715c7 (2026-03-05); 2decb99 (2026-07-30)</w:t>
-            </w:r>
-          </w:p>
-        </w:tc>
-        <w:tc>
-          <w:tcPr>
-            <w:tcW w:type="dxa" w:w="1588"/>
-            <w:tcBorders>
-              <w:top w:val="single" w:color="BFC7D5" w:sz="4"/>
-              <w:left w:val="single" w:color="BFC7D5" w:sz="4"/>
-              <w:bottom w:val="single" w:color="BFC7D5" w:sz="4"/>
-              <w:right w:val="single" w:color="BFC7D5" w:sz="4"/>
-            </w:tcBorders>
-            <w:tcMar>
-              <w:top w:type="dxa" w:w="60"/>
-              <w:left w:type="dxa" w:w="90"/>
-              <w:bottom w:type="dxa" w:w="60"/>
-              <w:right w:type="dxa" w:w="90"/>
-            </w:tcMar>
-          </w:tcPr>
-          <w:p>
-            <w:r>
-              <w:rPr>
-                <w:b w:val="false"/>
-                <w:bCs w:val="false"/>
-                <w:color w:val="222222"/>
-                <w:sz w:val="17"/>
-                <w:szCs w:val="17"/>
-              </w:rPr>
-              <w:t xml:space="preserve">Golden suite 50/52 (2026-07-30)</w:t>
+            <w:tcW w:type="dxa" w:w="1050"/>
+            <w:tcBorders>
+              <w:top w:val="single" w:color="BFC7D5" w:sz="4"/>
+              <w:left w:val="single" w:color="BFC7D5" w:sz="4"/>
+              <w:bottom w:val="single" w:color="BFC7D5" w:sz="4"/>
+              <w:right w:val="single" w:color="BFC7D5" w:sz="4"/>
+            </w:tcBorders>
+            <w:tcMar>
+              <w:top w:type="dxa" w:w="60"/>
+              <w:left w:type="dxa" w:w="90"/>
+              <w:bottom w:type="dxa" w:w="60"/>
+              <w:right w:type="dxa" w:w="90"/>
+            </w:tcMar>
+          </w:tcPr>
+          <w:p>
+            <w:r>
+              <w:rPr>
+                <w:b w:val="false"/>
+                <w:bCs w:val="false"/>
+                <w:color w:val="222222"/>
+                <w:sz w:val="17"/>
+                <w:szCs w:val="17"/>
+              </w:rPr>
+              <w:t xml:space="preserve">FR-KC-04; NFR-Q01 … Q05</w:t>
+            </w:r>
+          </w:p>
+        </w:tc>
+        <w:tc>
+          <w:tcPr>
+            <w:tcW w:type="dxa" w:w="1751"/>
+            <w:tcBorders>
+              <w:top w:val="single" w:color="BFC7D5" w:sz="4"/>
+              <w:left w:val="single" w:color="BFC7D5" w:sz="4"/>
+              <w:bottom w:val="single" w:color="BFC7D5" w:sz="4"/>
+              <w:right w:val="single" w:color="BFC7D5" w:sz="4"/>
+            </w:tcBorders>
+            <w:tcMar>
+              <w:top w:type="dxa" w:w="60"/>
+              <w:left w:type="dxa" w:w="90"/>
+              <w:bottom w:type="dxa" w:w="60"/>
+              <w:right w:type="dxa" w:w="90"/>
+            </w:tcMar>
+          </w:tcPr>
+          <w:p>
+            <w:r>
+              <w:rPr>
+                <w:b w:val="false"/>
+                <w:bCs w:val="false"/>
+                <w:color w:val="222222"/>
+                <w:sz w:val="17"/>
+                <w:szCs w:val="17"/>
+              </w:rPr>
+              <w:t xml:space="preserve">DoD FMR retrieval: BookRAG and PageIndex tried; hierarchical section → chunk retrieval kept</w:t>
+            </w:r>
+          </w:p>
+        </w:tc>
+        <w:tc>
+          <w:tcPr>
+            <w:tcW w:type="dxa" w:w="1050"/>
+            <w:tcBorders>
+              <w:top w:val="single" w:color="BFC7D5" w:sz="4"/>
+              <w:left w:val="single" w:color="BFC7D5" w:sz="4"/>
+              <w:bottom w:val="single" w:color="BFC7D5" w:sz="4"/>
+              <w:right w:val="single" w:color="BFC7D5" w:sz="4"/>
+            </w:tcBorders>
+            <w:tcMar>
+              <w:top w:type="dxa" w:w="60"/>
+              <w:left w:type="dxa" w:w="90"/>
+              <w:bottom w:type="dxa" w:w="60"/>
+              <w:right w:type="dxa" w:w="90"/>
+            </w:tcMar>
+          </w:tcPr>
+          <w:p>
+            <w:r>
+              <w:rPr>
+                <w:b w:val="false"/>
+                <w:bCs w:val="false"/>
+                <w:color w:val="222222"/>
+                <w:sz w:val="17"/>
+                <w:szCs w:val="17"/>
+              </w:rPr>
+              <w:t xml:space="preserve">7,300-page regulation; performance</w:t>
+            </w:r>
+          </w:p>
+        </w:tc>
+        <w:tc>
+          <w:tcPr>
+            <w:tcW w:type="dxa" w:w="1050"/>
+            <w:tcBorders>
+              <w:top w:val="single" w:color="BFC7D5" w:sz="4"/>
+              <w:left w:val="single" w:color="BFC7D5" w:sz="4"/>
+              <w:bottom w:val="single" w:color="BFC7D5" w:sz="4"/>
+              <w:right w:val="single" w:color="BFC7D5" w:sz="4"/>
+            </w:tcBorders>
+            <w:tcMar>
+              <w:top w:type="dxa" w:w="60"/>
+              <w:left w:type="dxa" w:w="90"/>
+              <w:bottom w:type="dxa" w:w="60"/>
+              <w:right w:type="dxa" w:w="90"/>
+            </w:tcMar>
+          </w:tcPr>
+          <w:p>
+            <w:r>
+              <w:rPr>
+                <w:b w:val="false"/>
+                <w:bCs w:val="false"/>
+                <w:color w:val="222222"/>
+                <w:sz w:val="17"/>
+                <w:szCs w:val="17"/>
+              </w:rPr>
+              <w:t xml:space="preserve">Client A; Client B (Bahrain)</w:t>
+            </w:r>
+          </w:p>
+        </w:tc>
+        <w:tc>
+          <w:tcPr>
+            <w:tcW w:type="dxa" w:w="1351"/>
+            <w:tcBorders>
+              <w:top w:val="single" w:color="BFC7D5" w:sz="4"/>
+              <w:left w:val="single" w:color="BFC7D5" w:sz="4"/>
+              <w:bottom w:val="single" w:color="BFC7D5" w:sz="4"/>
+              <w:right w:val="single" w:color="BFC7D5" w:sz="4"/>
+            </w:tcBorders>
+            <w:tcMar>
+              <w:top w:type="dxa" w:w="60"/>
+              <w:left w:type="dxa" w:w="90"/>
+              <w:bottom w:type="dxa" w:w="60"/>
+              <w:right w:type="dxa" w:w="90"/>
+            </w:tcMar>
+          </w:tcPr>
+          <w:p>
+            <w:r>
+              <w:rPr>
+                <w:b w:val="false"/>
+                <w:bCs w:val="false"/>
+                <w:color w:val="222222"/>
+                <w:sz w:val="17"/>
+                <w:szCs w:val="17"/>
+              </w:rPr>
+              <w:t xml:space="preserve">EM26-19 review log › CR-2026-02; review record CR-2026-02</w:t>
+            </w:r>
+          </w:p>
+        </w:tc>
+        <w:tc>
+          <w:tcPr>
+            <w:tcW w:type="dxa" w:w="1000"/>
+            <w:tcBorders>
+              <w:top w:val="single" w:color="BFC7D5" w:sz="4"/>
+              <w:left w:val="single" w:color="BFC7D5" w:sz="4"/>
+              <w:bottom w:val="single" w:color="BFC7D5" w:sz="4"/>
+              <w:right w:val="single" w:color="BFC7D5" w:sz="4"/>
+            </w:tcBorders>
+            <w:tcMar>
+              <w:top w:type="dxa" w:w="60"/>
+              <w:left w:type="dxa" w:w="90"/>
+              <w:bottom w:type="dxa" w:w="60"/>
+              <w:right w:type="dxa" w:w="90"/>
+            </w:tcMar>
+          </w:tcPr>
+          <w:p>
+            <w:r>
+              <w:rPr>
+                <w:b w:val="false"/>
+                <w:bCs w:val="false"/>
+                <w:color w:val="222222"/>
+                <w:sz w:val="17"/>
+                <w:szCs w:val="17"/>
+              </w:rPr>
+              <w:t xml:space="preserve">Retrieval design; BookRAG switched off</w:t>
+            </w:r>
+          </w:p>
+        </w:tc>
+        <w:tc>
+          <w:tcPr>
+            <w:tcW w:type="dxa" w:w="850"/>
+            <w:tcBorders>
+              <w:top w:val="single" w:color="BFC7D5" w:sz="4"/>
+              <w:left w:val="single" w:color="BFC7D5" w:sz="4"/>
+              <w:bottom w:val="single" w:color="BFC7D5" w:sz="4"/>
+              <w:right w:val="single" w:color="BFC7D5" w:sz="4"/>
+            </w:tcBorders>
+            <w:tcMar>
+              <w:top w:type="dxa" w:w="60"/>
+              <w:left w:type="dxa" w:w="90"/>
+              <w:bottom w:type="dxa" w:w="60"/>
+              <w:right w:type="dxa" w:w="90"/>
+            </w:tcMar>
+          </w:tcPr>
+          <w:p>
+            <w:r>
+              <w:rPr>
+                <w:b w:val="false"/>
+                <w:bCs w:val="false"/>
+                <w:color w:val="222222"/>
+                <w:sz w:val="17"/>
+                <w:szCs w:val="17"/>
+              </w:rPr>
+              <w:t xml:space="preserve">Accepted</w:t>
+            </w:r>
+          </w:p>
+        </w:tc>
+        <w:tc>
+          <w:tcPr>
+            <w:tcW w:type="dxa" w:w="1200"/>
+            <w:tcBorders>
+              <w:top w:val="single" w:color="BFC7D5" w:sz="4"/>
+              <w:left w:val="single" w:color="BFC7D5" w:sz="4"/>
+              <w:bottom w:val="single" w:color="BFC7D5" w:sz="4"/>
+              <w:right w:val="single" w:color="BFC7D5" w:sz="4"/>
+            </w:tcBorders>
+            <w:tcMar>
+              <w:top w:type="dxa" w:w="60"/>
+              <w:left w:type="dxa" w:w="90"/>
+              <w:bottom w:type="dxa" w:w="60"/>
+              <w:right w:type="dxa" w:w="90"/>
+            </w:tcMar>
+          </w:tcPr>
+          <w:p>
+            <w:r>
+              <w:rPr>
+                <w:b w:val="false"/>
+                <w:bCs w:val="false"/>
+                <w:color w:val="222222"/>
+                <w:sz w:val="17"/>
+                <w:szCs w:val="17"/>
+              </w:rPr>
+              <w:t xml:space="preserve">18715c7 — v1.1.0; 2decb99 — v1.3.0</w:t>
+            </w:r>
+          </w:p>
+        </w:tc>
+        <w:tc>
+          <w:tcPr>
+            <w:tcW w:type="dxa" w:w="1000"/>
+            <w:tcBorders>
+              <w:top w:val="single" w:color="BFC7D5" w:sz="4"/>
+              <w:left w:val="single" w:color="BFC7D5" w:sz="4"/>
+              <w:bottom w:val="single" w:color="BFC7D5" w:sz="4"/>
+              <w:right w:val="single" w:color="BFC7D5" w:sz="4"/>
+            </w:tcBorders>
+            <w:tcMar>
+              <w:top w:type="dxa" w:w="60"/>
+              <w:left w:type="dxa" w:w="90"/>
+              <w:bottom w:type="dxa" w:w="60"/>
+              <w:right w:type="dxa" w:w="90"/>
+            </w:tcMar>
+          </w:tcPr>
+          <w:p>
+            <w:r>
+              <w:rPr>
+                <w:b w:val="false"/>
+                <w:bCs w:val="false"/>
+                <w:color w:val="222222"/>
+                <w:sz w:val="17"/>
+                <w:szCs w:val="17"/>
+              </w:rPr>
+              <w:t xml:space="preserve">Golden suite 50/52 (BookRAG 43/52)</w:t>
+            </w:r>
+          </w:p>
+        </w:tc>
+        <w:tc>
+          <w:tcPr>
+            <w:tcW w:type="dxa" w:w="958"/>
+            <w:tcBorders>
+              <w:top w:val="single" w:color="BFC7D5" w:sz="4"/>
+              <w:left w:val="single" w:color="BFC7D5" w:sz="4"/>
+              <w:bottom w:val="single" w:color="BFC7D5" w:sz="4"/>
+              <w:right w:val="single" w:color="BFC7D5" w:sz="4"/>
+            </w:tcBorders>
+            <w:tcMar>
+              <w:top w:type="dxa" w:w="60"/>
+              <w:left w:type="dxa" w:w="90"/>
+              <w:bottom w:type="dxa" w:w="60"/>
+              <w:right w:type="dxa" w:w="90"/>
+            </w:tcMar>
+          </w:tcPr>
+          <w:p>
+            <w:r>
+              <w:rPr>
+                <w:b w:val="false"/>
+                <w:bCs w:val="false"/>
+                <w:color w:val="222222"/>
+                <w:sz w:val="17"/>
+                <w:szCs w:val="17"/>
+              </w:rPr>
+              <w:t xml:space="preserve">Closed</w:t>
             </w:r>
           </w:p>
         </w:tc>
@@ -2311,7 +3075,7 @@
       <w:tr>
         <w:tc>
           <w:tcPr>
-            <w:tcW w:type="dxa" w:w="932"/>
+            <w:tcW w:type="dxa" w:w="950"/>
             <w:tcBorders>
               <w:top w:val="single" w:color="BFC7D5" w:sz="4"/>
               <w:left w:val="single" w:color="BFC7D5" w:sz="4"/>
@@ -2340,7 +3104,7 @@
         </w:tc>
         <w:tc>
           <w:tcPr>
-            <w:tcW w:type="dxa" w:w="932"/>
+            <w:tcW w:type="dxa" w:w="750"/>
             <w:tcBorders>
               <w:top w:val="single" w:color="BFC7D5" w:sz="4"/>
               <w:left w:val="single" w:color="BFC7D5" w:sz="4"/>
@@ -2369,65 +3133,94 @@
         </w:tc>
         <w:tc>
           <w:tcPr>
-            <w:tcW w:type="dxa" w:w="1212"/>
-            <w:tcBorders>
-              <w:top w:val="single" w:color="BFC7D5" w:sz="4"/>
-              <w:left w:val="single" w:color="BFC7D5" w:sz="4"/>
-              <w:bottom w:val="single" w:color="BFC7D5" w:sz="4"/>
-              <w:right w:val="single" w:color="BFC7D5" w:sz="4"/>
-            </w:tcBorders>
-            <w:tcMar>
-              <w:top w:type="dxa" w:w="60"/>
-              <w:left w:type="dxa" w:w="90"/>
-              <w:bottom w:type="dxa" w:w="60"/>
-              <w:right w:type="dxa" w:w="90"/>
-            </w:tcMar>
-          </w:tcPr>
-          <w:p>
-            <w:r>
-              <w:rPr>
-                <w:b w:val="false"/>
-                <w:bCs w:val="false"/>
-                <w:color w:val="222222"/>
-                <w:sz w:val="17"/>
-                <w:szCs w:val="17"/>
-              </w:rPr>
-              <w:t xml:space="preserve">FR-LT-01, FR-LT-02</w:t>
-            </w:r>
-          </w:p>
-        </w:tc>
-        <w:tc>
-          <w:tcPr>
-            <w:tcW w:type="dxa" w:w="3543"/>
-            <w:tcBorders>
-              <w:top w:val="single" w:color="BFC7D5" w:sz="4"/>
-              <w:left w:val="single" w:color="BFC7D5" w:sz="4"/>
-              <w:bottom w:val="single" w:color="BFC7D5" w:sz="4"/>
-              <w:right w:val="single" w:color="BFC7D5" w:sz="4"/>
-            </w:tcBorders>
-            <w:tcMar>
-              <w:top w:type="dxa" w:w="60"/>
-              <w:left w:type="dxa" w:w="90"/>
-              <w:bottom w:type="dxa" w:w="60"/>
-              <w:right w:type="dxa" w:w="90"/>
-            </w:tcMar>
-          </w:tcPr>
-          <w:p>
-            <w:r>
-              <w:rPr>
-                <w:b w:val="false"/>
-                <w:bCs w:val="false"/>
-                <w:color w:val="222222"/>
-                <w:sz w:val="17"/>
-                <w:szCs w:val="17"/>
-              </w:rPr>
-              <w:t xml:space="preserve">Transcript accuracy and speed: Whisper → Nemotron; Parakeet final with fallback; chat Ollama → TensorRT-LLM</w:t>
-            </w:r>
-          </w:p>
-        </w:tc>
-        <w:tc>
-          <w:tcPr>
-            <w:tcW w:type="dxa" w:w="1491"/>
+            <w:tcW w:type="dxa" w:w="1050"/>
+            <w:tcBorders>
+              <w:top w:val="single" w:color="BFC7D5" w:sz="4"/>
+              <w:left w:val="single" w:color="BFC7D5" w:sz="4"/>
+              <w:bottom w:val="single" w:color="BFC7D5" w:sz="4"/>
+              <w:right w:val="single" w:color="BFC7D5" w:sz="4"/>
+            </w:tcBorders>
+            <w:tcMar>
+              <w:top w:type="dxa" w:w="60"/>
+              <w:left w:type="dxa" w:w="90"/>
+              <w:bottom w:type="dxa" w:w="60"/>
+              <w:right w:type="dxa" w:w="90"/>
+            </w:tcMar>
+          </w:tcPr>
+          <w:p>
+            <w:r>
+              <w:rPr>
+                <w:b w:val="false"/>
+                <w:bCs w:val="false"/>
+                <w:color w:val="222222"/>
+                <w:sz w:val="17"/>
+                <w:szCs w:val="17"/>
+              </w:rPr>
+              <w:t xml:space="preserve">FR-LT-01, FR-LT-02; NFR-P01, NFR-P06</w:t>
+            </w:r>
+          </w:p>
+        </w:tc>
+        <w:tc>
+          <w:tcPr>
+            <w:tcW w:type="dxa" w:w="1751"/>
+            <w:tcBorders>
+              <w:top w:val="single" w:color="BFC7D5" w:sz="4"/>
+              <w:left w:val="single" w:color="BFC7D5" w:sz="4"/>
+              <w:bottom w:val="single" w:color="BFC7D5" w:sz="4"/>
+              <w:right w:val="single" w:color="BFC7D5" w:sz="4"/>
+            </w:tcBorders>
+            <w:tcMar>
+              <w:top w:type="dxa" w:w="60"/>
+              <w:left w:type="dxa" w:w="90"/>
+              <w:bottom w:type="dxa" w:w="60"/>
+              <w:right w:type="dxa" w:w="90"/>
+            </w:tcMar>
+          </w:tcPr>
+          <w:p>
+            <w:r>
+              <w:rPr>
+                <w:b w:val="false"/>
+                <w:bCs w:val="false"/>
+                <w:color w:val="222222"/>
+                <w:sz w:val="17"/>
+                <w:szCs w:val="17"/>
+              </w:rPr>
+              <w:t xml:space="preserve">Live transcript: better speech model with fallback; chat from Ollama to TensorRT-LLM</w:t>
+            </w:r>
+          </w:p>
+        </w:tc>
+        <w:tc>
+          <w:tcPr>
+            <w:tcW w:type="dxa" w:w="1050"/>
+            <w:tcBorders>
+              <w:top w:val="single" w:color="BFC7D5" w:sz="4"/>
+              <w:left w:val="single" w:color="BFC7D5" w:sz="4"/>
+              <w:bottom w:val="single" w:color="BFC7D5" w:sz="4"/>
+              <w:right w:val="single" w:color="BFC7D5" w:sz="4"/>
+            </w:tcBorders>
+            <w:tcMar>
+              <w:top w:type="dxa" w:w="60"/>
+              <w:left w:type="dxa" w:w="90"/>
+              <w:bottom w:type="dxa" w:w="60"/>
+              <w:right w:type="dxa" w:w="90"/>
+            </w:tcMar>
+          </w:tcPr>
+          <w:p>
+            <w:r>
+              <w:rPr>
+                <w:b w:val="false"/>
+                <w:bCs w:val="false"/>
+                <w:color w:val="222222"/>
+                <w:sz w:val="17"/>
+                <w:szCs w:val="17"/>
+              </w:rPr>
+              <w:t xml:space="preserve">Client feedback: accuracy and speed</w:t>
+            </w:r>
+          </w:p>
+        </w:tc>
+        <w:tc>
+          <w:tcPr>
+            <w:tcW w:type="dxa" w:w="1050"/>
             <w:tcBorders>
               <w:top w:val="single" w:color="BFC7D5" w:sz="4"/>
               <w:left w:val="single" w:color="BFC7D5" w:sz="4"/>
@@ -2456,65 +3249,123 @@
         </w:tc>
         <w:tc>
           <w:tcPr>
-            <w:tcW w:type="dxa" w:w="1025"/>
-            <w:tcBorders>
-              <w:top w:val="single" w:color="BFC7D5" w:sz="4"/>
-              <w:left w:val="single" w:color="BFC7D5" w:sz="4"/>
-              <w:bottom w:val="single" w:color="BFC7D5" w:sz="4"/>
-              <w:right w:val="single" w:color="BFC7D5" w:sz="4"/>
-            </w:tcBorders>
-            <w:tcMar>
-              <w:top w:type="dxa" w:w="60"/>
-              <w:left w:type="dxa" w:w="90"/>
-              <w:bottom w:type="dxa" w:w="60"/>
-              <w:right w:type="dxa" w:w="90"/>
-            </w:tcMar>
-          </w:tcPr>
-          <w:p>
-            <w:r>
-              <w:rPr>
-                <w:b w:val="false"/>
-                <w:bCs w:val="false"/>
-                <w:color w:val="222222"/>
-                <w:sz w:val="17"/>
-                <w:szCs w:val="17"/>
-              </w:rPr>
-              <w:t xml:space="preserve">CR-2026-06</w:t>
-            </w:r>
-          </w:p>
-        </w:tc>
-        <w:tc>
-          <w:tcPr>
-            <w:tcW w:type="dxa" w:w="2237"/>
-            <w:tcBorders>
-              <w:top w:val="single" w:color="BFC7D5" w:sz="4"/>
-              <w:left w:val="single" w:color="BFC7D5" w:sz="4"/>
-              <w:bottom w:val="single" w:color="BFC7D5" w:sz="4"/>
-              <w:right w:val="single" w:color="BFC7D5" w:sz="4"/>
-            </w:tcBorders>
-            <w:tcMar>
-              <w:top w:type="dxa" w:w="60"/>
-              <w:left w:type="dxa" w:w="90"/>
-              <w:bottom w:type="dxa" w:w="60"/>
-              <w:right w:type="dxa" w:w="90"/>
-            </w:tcMar>
-          </w:tcPr>
-          <w:p>
-            <w:r>
-              <w:rPr>
-                <w:b w:val="false"/>
-                <w:bCs w:val="false"/>
-                <w:color w:val="222222"/>
-                <w:sz w:val="17"/>
-                <w:szCs w:val="17"/>
-              </w:rPr>
-              <w:t xml:space="preserve">d89aeda (04-08); b6a70d8 (06-26); 80375c6 (07-29)</w:t>
-            </w:r>
-          </w:p>
-        </w:tc>
-        <w:tc>
-          <w:tcPr>
-            <w:tcW w:type="dxa" w:w="1588"/>
+            <w:tcW w:type="dxa" w:w="1351"/>
+            <w:tcBorders>
+              <w:top w:val="single" w:color="BFC7D5" w:sz="4"/>
+              <w:left w:val="single" w:color="BFC7D5" w:sz="4"/>
+              <w:bottom w:val="single" w:color="BFC7D5" w:sz="4"/>
+              <w:right w:val="single" w:color="BFC7D5" w:sz="4"/>
+            </w:tcBorders>
+            <w:tcMar>
+              <w:top w:type="dxa" w:w="60"/>
+              <w:left w:type="dxa" w:w="90"/>
+              <w:bottom w:type="dxa" w:w="60"/>
+              <w:right w:type="dxa" w:w="90"/>
+            </w:tcMar>
+          </w:tcPr>
+          <w:p>
+            <w:r>
+              <w:rPr>
+                <w:b w:val="false"/>
+                <w:bCs w:val="false"/>
+                <w:color w:val="222222"/>
+                <w:sz w:val="17"/>
+                <w:szCs w:val="17"/>
+              </w:rPr>
+              <w:t xml:space="preserve">EM26-19 review log › CR-2026-06; review record CR-2026-06</w:t>
+            </w:r>
+          </w:p>
+        </w:tc>
+        <w:tc>
+          <w:tcPr>
+            <w:tcW w:type="dxa" w:w="1000"/>
+            <w:tcBorders>
+              <w:top w:val="single" w:color="BFC7D5" w:sz="4"/>
+              <w:left w:val="single" w:color="BFC7D5" w:sz="4"/>
+              <w:bottom w:val="single" w:color="BFC7D5" w:sz="4"/>
+              <w:right w:val="single" w:color="BFC7D5" w:sz="4"/>
+            </w:tcBorders>
+            <w:tcMar>
+              <w:top w:type="dxa" w:w="60"/>
+              <w:left w:type="dxa" w:w="90"/>
+              <w:bottom w:type="dxa" w:w="60"/>
+              <w:right w:type="dxa" w:w="90"/>
+            </w:tcMar>
+          </w:tcPr>
+          <w:p>
+            <w:r>
+              <w:rPr>
+                <w:b w:val="false"/>
+                <w:bCs w:val="false"/>
+                <w:color w:val="222222"/>
+                <w:sz w:val="17"/>
+                <w:szCs w:val="17"/>
+              </w:rPr>
+              <w:t xml:space="preserve">Speech recognition and LLM serving changed</w:t>
+            </w:r>
+          </w:p>
+        </w:tc>
+        <w:tc>
+          <w:tcPr>
+            <w:tcW w:type="dxa" w:w="850"/>
+            <w:tcBorders>
+              <w:top w:val="single" w:color="BFC7D5" w:sz="4"/>
+              <w:left w:val="single" w:color="BFC7D5" w:sz="4"/>
+              <w:bottom w:val="single" w:color="BFC7D5" w:sz="4"/>
+              <w:right w:val="single" w:color="BFC7D5" w:sz="4"/>
+            </w:tcBorders>
+            <w:tcMar>
+              <w:top w:type="dxa" w:w="60"/>
+              <w:left w:type="dxa" w:w="90"/>
+              <w:bottom w:type="dxa" w:w="60"/>
+              <w:right w:type="dxa" w:w="90"/>
+            </w:tcMar>
+          </w:tcPr>
+          <w:p>
+            <w:r>
+              <w:rPr>
+                <w:b w:val="false"/>
+                <w:bCs w:val="false"/>
+                <w:color w:val="222222"/>
+                <w:sz w:val="17"/>
+                <w:szCs w:val="17"/>
+              </w:rPr>
+              <w:t xml:space="preserve">Accepted</w:t>
+            </w:r>
+          </w:p>
+        </w:tc>
+        <w:tc>
+          <w:tcPr>
+            <w:tcW w:type="dxa" w:w="1200"/>
+            <w:tcBorders>
+              <w:top w:val="single" w:color="BFC7D5" w:sz="4"/>
+              <w:left w:val="single" w:color="BFC7D5" w:sz="4"/>
+              <w:bottom w:val="single" w:color="BFC7D5" w:sz="4"/>
+              <w:right w:val="single" w:color="BFC7D5" w:sz="4"/>
+            </w:tcBorders>
+            <w:tcMar>
+              <w:top w:type="dxa" w:w="60"/>
+              <w:left w:type="dxa" w:w="90"/>
+              <w:bottom w:type="dxa" w:w="60"/>
+              <w:right w:type="dxa" w:w="90"/>
+            </w:tcMar>
+          </w:tcPr>
+          <w:p>
+            <w:r>
+              <w:rPr>
+                <w:b w:val="false"/>
+                <w:bCs w:val="false"/>
+                <w:color w:val="222222"/>
+                <w:sz w:val="17"/>
+                <w:szCs w:val="17"/>
+              </w:rPr>
+              <w:t xml:space="preserve">d89aeda — v1.1.0; b6a70d8 — v1.2.0; 80375c6 — v1.3.0</w:t>
+            </w:r>
+          </w:p>
+        </w:tc>
+        <w:tc>
+          <w:tcPr>
+            <w:tcW w:type="dxa" w:w="1000"/>
             <w:tcBorders>
               <w:top w:val="single" w:color="BFC7D5" w:sz="4"/>
               <w:left w:val="single" w:color="BFC7D5" w:sz="4"/>
@@ -2538,6 +3389,35 @@
                 <w:szCs w:val="17"/>
               </w:rPr>
               <w:t xml:space="preserve">Voice end-to-end test; acceptance run 4</w:t>
+            </w:r>
+          </w:p>
+        </w:tc>
+        <w:tc>
+          <w:tcPr>
+            <w:tcW w:type="dxa" w:w="958"/>
+            <w:tcBorders>
+              <w:top w:val="single" w:color="BFC7D5" w:sz="4"/>
+              <w:left w:val="single" w:color="BFC7D5" w:sz="4"/>
+              <w:bottom w:val="single" w:color="BFC7D5" w:sz="4"/>
+              <w:right w:val="single" w:color="BFC7D5" w:sz="4"/>
+            </w:tcBorders>
+            <w:tcMar>
+              <w:top w:type="dxa" w:w="60"/>
+              <w:left w:type="dxa" w:w="90"/>
+              <w:bottom w:type="dxa" w:w="60"/>
+              <w:right w:type="dxa" w:w="90"/>
+            </w:tcMar>
+          </w:tcPr>
+          <w:p>
+            <w:r>
+              <w:rPr>
+                <w:b w:val="false"/>
+                <w:bCs w:val="false"/>
+                <w:color w:val="222222"/>
+                <w:sz w:val="17"/>
+                <w:szCs w:val="17"/>
+              </w:rPr>
+              <w:t xml:space="preserve">Closed</w:t>
             </w:r>
           </w:p>
         </w:tc>
@@ -2545,7 +3425,7 @@
       <w:tr>
         <w:tc>
           <w:tcPr>
-            <w:tcW w:type="dxa" w:w="932"/>
+            <w:tcW w:type="dxa" w:w="950"/>
             <w:tcBorders>
               <w:top w:val="single" w:color="BFC7D5" w:sz="4"/>
               <w:left w:val="single" w:color="BFC7D5" w:sz="4"/>
@@ -2574,7 +3454,7 @@
         </w:tc>
         <w:tc>
           <w:tcPr>
-            <w:tcW w:type="dxa" w:w="932"/>
+            <w:tcW w:type="dxa" w:w="750"/>
             <w:tcBorders>
               <w:top w:val="single" w:color="BFC7D5" w:sz="4"/>
               <w:left w:val="single" w:color="BFC7D5" w:sz="4"/>
@@ -2603,152 +3483,239 @@
         </w:tc>
         <w:tc>
           <w:tcPr>
-            <w:tcW w:type="dxa" w:w="1212"/>
-            <w:tcBorders>
-              <w:top w:val="single" w:color="BFC7D5" w:sz="4"/>
-              <w:left w:val="single" w:color="BFC7D5" w:sz="4"/>
-              <w:bottom w:val="single" w:color="BFC7D5" w:sz="4"/>
-              <w:right w:val="single" w:color="BFC7D5" w:sz="4"/>
-            </w:tcBorders>
-            <w:tcMar>
-              <w:top w:type="dxa" w:w="60"/>
-              <w:left w:type="dxa" w:w="90"/>
-              <w:bottom w:type="dxa" w:w="60"/>
-              <w:right w:type="dxa" w:w="90"/>
-            </w:tcMar>
-          </w:tcPr>
-          <w:p>
-            <w:r>
-              <w:rPr>
-                <w:b w:val="false"/>
-                <w:bCs w:val="false"/>
-                <w:color w:val="222222"/>
-                <w:sz w:val="17"/>
-                <w:szCs w:val="17"/>
-              </w:rPr>
-              <w:t xml:space="preserve">FR-SA-01…03</w:t>
-            </w:r>
-          </w:p>
-        </w:tc>
-        <w:tc>
-          <w:tcPr>
-            <w:tcW w:type="dxa" w:w="3543"/>
-            <w:tcBorders>
-              <w:top w:val="single" w:color="BFC7D5" w:sz="4"/>
-              <w:left w:val="single" w:color="BFC7D5" w:sz="4"/>
-              <w:bottom w:val="single" w:color="BFC7D5" w:sz="4"/>
-              <w:right w:val="single" w:color="BFC7D5" w:sz="4"/>
-            </w:tcBorders>
-            <w:tcMar>
-              <w:top w:type="dxa" w:w="60"/>
-              <w:left w:type="dxa" w:w="90"/>
-              <w:bottom w:type="dxa" w:w="60"/>
-              <w:right w:type="dxa" w:w="90"/>
-            </w:tcMar>
-          </w:tcPr>
-          <w:p>
-            <w:r>
-              <w:rPr>
-                <w:b w:val="false"/>
-                <w:bCs w:val="false"/>
-                <w:color w:val="222222"/>
-                <w:sz w:val="17"/>
-                <w:szCs w:val="17"/>
-              </w:rPr>
-              <w:t xml:space="preserve">New listen-only mode that never replies</w:t>
-            </w:r>
-          </w:p>
-        </w:tc>
-        <w:tc>
-          <w:tcPr>
-            <w:tcW w:type="dxa" w:w="1491"/>
-            <w:tcBorders>
-              <w:top w:val="single" w:color="BFC7D5" w:sz="4"/>
-              <w:left w:val="single" w:color="BFC7D5" w:sz="4"/>
-              <w:bottom w:val="single" w:color="BFC7D5" w:sz="4"/>
-              <w:right w:val="single" w:color="BFC7D5" w:sz="4"/>
-            </w:tcBorders>
-            <w:tcMar>
-              <w:top w:type="dxa" w:w="60"/>
-              <w:left w:type="dxa" w:w="90"/>
-              <w:bottom w:type="dxa" w:w="60"/>
-              <w:right w:type="dxa" w:w="90"/>
-            </w:tcMar>
-          </w:tcPr>
-          <w:p>
-            <w:r>
-              <w:rPr>
-                <w:b w:val="false"/>
-                <w:bCs w:val="false"/>
-                <w:color w:val="222222"/>
-                <w:sz w:val="17"/>
-                <w:szCs w:val="17"/>
-              </w:rPr>
-              <w:t xml:space="preserve">Client C</w:t>
-            </w:r>
-          </w:p>
-        </w:tc>
-        <w:tc>
-          <w:tcPr>
-            <w:tcW w:type="dxa" w:w="1025"/>
-            <w:tcBorders>
-              <w:top w:val="single" w:color="BFC7D5" w:sz="4"/>
-              <w:left w:val="single" w:color="BFC7D5" w:sz="4"/>
-              <w:bottom w:val="single" w:color="BFC7D5" w:sz="4"/>
-              <w:right w:val="single" w:color="BFC7D5" w:sz="4"/>
-            </w:tcBorders>
-            <w:tcMar>
-              <w:top w:type="dxa" w:w="60"/>
-              <w:left w:type="dxa" w:w="90"/>
-              <w:bottom w:type="dxa" w:w="60"/>
-              <w:right w:type="dxa" w:w="90"/>
-            </w:tcMar>
-          </w:tcPr>
-          <w:p>
-            <w:r>
-              <w:rPr>
-                <w:b w:val="false"/>
-                <w:bCs w:val="false"/>
-                <w:color w:val="222222"/>
-                <w:sz w:val="17"/>
-                <w:szCs w:val="17"/>
-              </w:rPr>
-              <w:t xml:space="preserve">CR-2026-07</w:t>
-            </w:r>
-          </w:p>
-        </w:tc>
-        <w:tc>
-          <w:tcPr>
-            <w:tcW w:type="dxa" w:w="2237"/>
-            <w:tcBorders>
-              <w:top w:val="single" w:color="BFC7D5" w:sz="4"/>
-              <w:left w:val="single" w:color="BFC7D5" w:sz="4"/>
-              <w:bottom w:val="single" w:color="BFC7D5" w:sz="4"/>
-              <w:right w:val="single" w:color="BFC7D5" w:sz="4"/>
-            </w:tcBorders>
-            <w:tcMar>
-              <w:top w:type="dxa" w:w="60"/>
-              <w:left w:type="dxa" w:w="90"/>
-              <w:bottom w:type="dxa" w:w="60"/>
-              <w:right w:type="dxa" w:w="90"/>
-            </w:tcMar>
-          </w:tcPr>
-          <w:p>
-            <w:r>
-              <w:rPr>
-                <w:b w:val="false"/>
-                <w:bCs w:val="false"/>
-                <w:color w:val="222222"/>
-                <w:sz w:val="17"/>
-                <w:szCs w:val="17"/>
-              </w:rPr>
-              <w:t xml:space="preserve">ec9b180 (05-11); f75121b (06-27); 7f2658a (08-16)</w:t>
-            </w:r>
-          </w:p>
-        </w:tc>
-        <w:tc>
-          <w:tcPr>
-            <w:tcW w:type="dxa" w:w="1588"/>
+            <w:tcW w:type="dxa" w:w="1050"/>
+            <w:tcBorders>
+              <w:top w:val="single" w:color="BFC7D5" w:sz="4"/>
+              <w:left w:val="single" w:color="BFC7D5" w:sz="4"/>
+              <w:bottom w:val="single" w:color="BFC7D5" w:sz="4"/>
+              <w:right w:val="single" w:color="BFC7D5" w:sz="4"/>
+            </w:tcBorders>
+            <w:tcMar>
+              <w:top w:type="dxa" w:w="60"/>
+              <w:left w:type="dxa" w:w="90"/>
+              <w:bottom w:type="dxa" w:w="60"/>
+              <w:right w:type="dxa" w:w="90"/>
+            </w:tcMar>
+          </w:tcPr>
+          <w:p>
+            <w:r>
+              <w:rPr>
+                <w:b w:val="false"/>
+                <w:bCs w:val="false"/>
+                <w:color w:val="222222"/>
+                <w:sz w:val="17"/>
+                <w:szCs w:val="17"/>
+              </w:rPr>
+              <w:t xml:space="preserve">FR-SA-01 … 03</w:t>
+            </w:r>
+          </w:p>
+        </w:tc>
+        <w:tc>
+          <w:tcPr>
+            <w:tcW w:type="dxa" w:w="1751"/>
+            <w:tcBorders>
+              <w:top w:val="single" w:color="BFC7D5" w:sz="4"/>
+              <w:left w:val="single" w:color="BFC7D5" w:sz="4"/>
+              <w:bottom w:val="single" w:color="BFC7D5" w:sz="4"/>
+              <w:right w:val="single" w:color="BFC7D5" w:sz="4"/>
+            </w:tcBorders>
+            <w:tcMar>
+              <w:top w:type="dxa" w:w="60"/>
+              <w:left w:type="dxa" w:w="90"/>
+              <w:bottom w:type="dxa" w:w="60"/>
+              <w:right w:type="dxa" w:w="90"/>
+            </w:tcMar>
+          </w:tcPr>
+          <w:p>
+            <w:r>
+              <w:rPr>
+                <w:b w:val="false"/>
+                <w:bCs w:val="false"/>
+                <w:color w:val="222222"/>
+                <w:sz w:val="17"/>
+                <w:szCs w:val="17"/>
+              </w:rPr>
+              <w:t xml:space="preserve">New requirement: listen-only Silent Assistant that puts data on screen and never replies</w:t>
+            </w:r>
+          </w:p>
+        </w:tc>
+        <w:tc>
+          <w:tcPr>
+            <w:tcW w:type="dxa" w:w="1050"/>
+            <w:tcBorders>
+              <w:top w:val="single" w:color="BFC7D5" w:sz="4"/>
+              <w:left w:val="single" w:color="BFC7D5" w:sz="4"/>
+              <w:bottom w:val="single" w:color="BFC7D5" w:sz="4"/>
+              <w:right w:val="single" w:color="BFC7D5" w:sz="4"/>
+            </w:tcBorders>
+            <w:tcMar>
+              <w:top w:type="dxa" w:w="60"/>
+              <w:left w:type="dxa" w:w="90"/>
+              <w:bottom w:type="dxa" w:w="60"/>
+              <w:right w:type="dxa" w:w="90"/>
+            </w:tcMar>
+          </w:tcPr>
+          <w:p>
+            <w:r>
+              <w:rPr>
+                <w:b w:val="false"/>
+                <w:bCs w:val="false"/>
+                <w:color w:val="222222"/>
+                <w:sz w:val="17"/>
+                <w:szCs w:val="17"/>
+              </w:rPr>
+              <w:t xml:space="preserve">Client request after the demonstration</w:t>
+            </w:r>
+          </w:p>
+        </w:tc>
+        <w:tc>
+          <w:tcPr>
+            <w:tcW w:type="dxa" w:w="1050"/>
+            <w:tcBorders>
+              <w:top w:val="single" w:color="BFC7D5" w:sz="4"/>
+              <w:left w:val="single" w:color="BFC7D5" w:sz="4"/>
+              <w:bottom w:val="single" w:color="BFC7D5" w:sz="4"/>
+              <w:right w:val="single" w:color="BFC7D5" w:sz="4"/>
+            </w:tcBorders>
+            <w:tcMar>
+              <w:top w:type="dxa" w:w="60"/>
+              <w:left w:type="dxa" w:w="90"/>
+              <w:bottom w:type="dxa" w:w="60"/>
+              <w:right w:type="dxa" w:w="90"/>
+            </w:tcMar>
+          </w:tcPr>
+          <w:p>
+            <w:r>
+              <w:rPr>
+                <w:b w:val="false"/>
+                <w:bCs w:val="false"/>
+                <w:color w:val="222222"/>
+                <w:sz w:val="17"/>
+                <w:szCs w:val="17"/>
+              </w:rPr>
+              <w:t xml:space="preserve">Client C (law firm)</w:t>
+            </w:r>
+          </w:p>
+        </w:tc>
+        <w:tc>
+          <w:tcPr>
+            <w:tcW w:type="dxa" w:w="1351"/>
+            <w:tcBorders>
+              <w:top w:val="single" w:color="BFC7D5" w:sz="4"/>
+              <w:left w:val="single" w:color="BFC7D5" w:sz="4"/>
+              <w:bottom w:val="single" w:color="BFC7D5" w:sz="4"/>
+              <w:right w:val="single" w:color="BFC7D5" w:sz="4"/>
+            </w:tcBorders>
+            <w:tcMar>
+              <w:top w:type="dxa" w:w="60"/>
+              <w:left w:type="dxa" w:w="90"/>
+              <w:bottom w:type="dxa" w:w="60"/>
+              <w:right w:type="dxa" w:w="90"/>
+            </w:tcMar>
+          </w:tcPr>
+          <w:p>
+            <w:r>
+              <w:rPr>
+                <w:b w:val="false"/>
+                <w:bCs w:val="false"/>
+                <w:color w:val="222222"/>
+                <w:sz w:val="17"/>
+                <w:szCs w:val="17"/>
+              </w:rPr>
+              <w:t xml:space="preserve">EM26-19 review log › CR-2026-07; review record CR-2026-07</w:t>
+            </w:r>
+          </w:p>
+        </w:tc>
+        <w:tc>
+          <w:tcPr>
+            <w:tcW w:type="dxa" w:w="1000"/>
+            <w:tcBorders>
+              <w:top w:val="single" w:color="BFC7D5" w:sz="4"/>
+              <w:left w:val="single" w:color="BFC7D5" w:sz="4"/>
+              <w:bottom w:val="single" w:color="BFC7D5" w:sz="4"/>
+              <w:right w:val="single" w:color="BFC7D5" w:sz="4"/>
+            </w:tcBorders>
+            <w:tcMar>
+              <w:top w:type="dxa" w:w="60"/>
+              <w:left w:type="dxa" w:w="90"/>
+              <w:bottom w:type="dxa" w:w="60"/>
+              <w:right w:type="dxa" w:w="90"/>
+            </w:tcMar>
+          </w:tcPr>
+          <w:p>
+            <w:r>
+              <w:rPr>
+                <w:b w:val="false"/>
+                <w:bCs w:val="false"/>
+                <w:color w:val="222222"/>
+                <w:sz w:val="17"/>
+                <w:szCs w:val="17"/>
+              </w:rPr>
+              <w:t xml:space="preserve">New module beside live transcription</w:t>
+            </w:r>
+          </w:p>
+        </w:tc>
+        <w:tc>
+          <w:tcPr>
+            <w:tcW w:type="dxa" w:w="850"/>
+            <w:tcBorders>
+              <w:top w:val="single" w:color="BFC7D5" w:sz="4"/>
+              <w:left w:val="single" w:color="BFC7D5" w:sz="4"/>
+              <w:bottom w:val="single" w:color="BFC7D5" w:sz="4"/>
+              <w:right w:val="single" w:color="BFC7D5" w:sz="4"/>
+            </w:tcBorders>
+            <w:tcMar>
+              <w:top w:type="dxa" w:w="60"/>
+              <w:left w:type="dxa" w:w="90"/>
+              <w:bottom w:type="dxa" w:w="60"/>
+              <w:right w:type="dxa" w:w="90"/>
+            </w:tcMar>
+          </w:tcPr>
+          <w:p>
+            <w:r>
+              <w:rPr>
+                <w:b w:val="false"/>
+                <w:bCs w:val="false"/>
+                <w:color w:val="222222"/>
+                <w:sz w:val="17"/>
+                <w:szCs w:val="17"/>
+              </w:rPr>
+              <w:t xml:space="preserve">Accepted</w:t>
+            </w:r>
+          </w:p>
+        </w:tc>
+        <w:tc>
+          <w:tcPr>
+            <w:tcW w:type="dxa" w:w="1200"/>
+            <w:tcBorders>
+              <w:top w:val="single" w:color="BFC7D5" w:sz="4"/>
+              <w:left w:val="single" w:color="BFC7D5" w:sz="4"/>
+              <w:bottom w:val="single" w:color="BFC7D5" w:sz="4"/>
+              <w:right w:val="single" w:color="BFC7D5" w:sz="4"/>
+            </w:tcBorders>
+            <w:tcMar>
+              <w:top w:type="dxa" w:w="60"/>
+              <w:left w:type="dxa" w:w="90"/>
+              <w:bottom w:type="dxa" w:w="60"/>
+              <w:right w:type="dxa" w:w="90"/>
+            </w:tcMar>
+          </w:tcPr>
+          <w:p>
+            <w:r>
+              <w:rPr>
+                <w:b w:val="false"/>
+                <w:bCs w:val="false"/>
+                <w:color w:val="222222"/>
+                <w:sz w:val="17"/>
+                <w:szCs w:val="17"/>
+              </w:rPr>
+              <w:t xml:space="preserve">ec9b180 — v1.2.0; 7f2658a — v1.3.0</w:t>
+            </w:r>
+          </w:p>
+        </w:tc>
+        <w:tc>
+          <w:tcPr>
+            <w:tcW w:type="dxa" w:w="1000"/>
             <w:tcBorders>
               <w:top w:val="single" w:color="BFC7D5" w:sz="4"/>
               <w:left w:val="single" w:color="BFC7D5" w:sz="4"/>
@@ -2772,6 +3739,35 @@
                 <w:szCs w:val="17"/>
               </w:rPr>
               <w:t xml:space="preserve">Scenario harness</w:t>
+            </w:r>
+          </w:p>
+        </w:tc>
+        <w:tc>
+          <w:tcPr>
+            <w:tcW w:type="dxa" w:w="958"/>
+            <w:tcBorders>
+              <w:top w:val="single" w:color="BFC7D5" w:sz="4"/>
+              <w:left w:val="single" w:color="BFC7D5" w:sz="4"/>
+              <w:bottom w:val="single" w:color="BFC7D5" w:sz="4"/>
+              <w:right w:val="single" w:color="BFC7D5" w:sz="4"/>
+            </w:tcBorders>
+            <w:tcMar>
+              <w:top w:type="dxa" w:w="60"/>
+              <w:left w:type="dxa" w:w="90"/>
+              <w:bottom w:type="dxa" w:w="60"/>
+              <w:right w:type="dxa" w:w="90"/>
+            </w:tcMar>
+          </w:tcPr>
+          <w:p>
+            <w:r>
+              <w:rPr>
+                <w:b w:val="false"/>
+                <w:bCs w:val="false"/>
+                <w:color w:val="222222"/>
+                <w:sz w:val="17"/>
+                <w:szCs w:val="17"/>
+              </w:rPr>
+              <w:t xml:space="preserve">Closed</w:t>
             </w:r>
           </w:p>
         </w:tc>
@@ -2779,7 +3775,7 @@
       <w:tr>
         <w:tc>
           <w:tcPr>
-            <w:tcW w:type="dxa" w:w="932"/>
+            <w:tcW w:type="dxa" w:w="950"/>
             <w:tcBorders>
               <w:top w:val="single" w:color="BFC7D5" w:sz="4"/>
               <w:left w:val="single" w:color="BFC7D5" w:sz="4"/>
@@ -2808,7 +3804,7 @@
         </w:tc>
         <w:tc>
           <w:tcPr>
-            <w:tcW w:type="dxa" w:w="932"/>
+            <w:tcW w:type="dxa" w:w="750"/>
             <w:tcBorders>
               <w:top w:val="single" w:color="BFC7D5" w:sz="4"/>
               <w:left w:val="single" w:color="BFC7D5" w:sz="4"/>
@@ -2837,152 +3833,239 @@
         </w:tc>
         <w:tc>
           <w:tcPr>
-            <w:tcW w:type="dxa" w:w="1212"/>
-            <w:tcBorders>
-              <w:top w:val="single" w:color="BFC7D5" w:sz="4"/>
-              <w:left w:val="single" w:color="BFC7D5" w:sz="4"/>
-              <w:bottom w:val="single" w:color="BFC7D5" w:sz="4"/>
-              <w:right w:val="single" w:color="BFC7D5" w:sz="4"/>
-            </w:tcBorders>
-            <w:tcMar>
-              <w:top w:type="dxa" w:w="60"/>
-              <w:left w:type="dxa" w:w="90"/>
-              <w:bottom w:type="dxa" w:w="60"/>
-              <w:right w:type="dxa" w:w="90"/>
-            </w:tcMar>
-          </w:tcPr>
-          <w:p>
-            <w:r>
-              <w:rPr>
-                <w:b w:val="false"/>
-                <w:bCs w:val="false"/>
-                <w:color w:val="222222"/>
-                <w:sz w:val="17"/>
-                <w:szCs w:val="17"/>
-              </w:rPr>
-              <w:t xml:space="preserve">FR-DS-01…04</w:t>
-            </w:r>
-          </w:p>
-        </w:tc>
-        <w:tc>
-          <w:tcPr>
-            <w:tcW w:type="dxa" w:w="3543"/>
-            <w:tcBorders>
-              <w:top w:val="single" w:color="BFC7D5" w:sz="4"/>
-              <w:left w:val="single" w:color="BFC7D5" w:sz="4"/>
-              <w:bottom w:val="single" w:color="BFC7D5" w:sz="4"/>
-              <w:right w:val="single" w:color="BFC7D5" w:sz="4"/>
-            </w:tcBorders>
-            <w:tcMar>
-              <w:top w:type="dxa" w:w="60"/>
-              <w:left w:type="dxa" w:w="90"/>
-              <w:bottom w:type="dxa" w:w="60"/>
-              <w:right w:type="dxa" w:w="90"/>
-            </w:tcMar>
-          </w:tcPr>
-          <w:p>
-            <w:r>
-              <w:rPr>
-                <w:b w:val="false"/>
-                <w:bCs w:val="false"/>
-                <w:color w:val="222222"/>
-                <w:sz w:val="17"/>
-                <w:szCs w:val="17"/>
-              </w:rPr>
-              <w:t xml:space="preserve">New document studio with and without templates</w:t>
-            </w:r>
-          </w:p>
-        </w:tc>
-        <w:tc>
-          <w:tcPr>
-            <w:tcW w:type="dxa" w:w="1491"/>
-            <w:tcBorders>
-              <w:top w:val="single" w:color="BFC7D5" w:sz="4"/>
-              <w:left w:val="single" w:color="BFC7D5" w:sz="4"/>
-              <w:bottom w:val="single" w:color="BFC7D5" w:sz="4"/>
-              <w:right w:val="single" w:color="BFC7D5" w:sz="4"/>
-            </w:tcBorders>
-            <w:tcMar>
-              <w:top w:type="dxa" w:w="60"/>
-              <w:left w:type="dxa" w:w="90"/>
-              <w:bottom w:type="dxa" w:w="60"/>
-              <w:right w:type="dxa" w:w="90"/>
-            </w:tcMar>
-          </w:tcPr>
-          <w:p>
-            <w:r>
-              <w:rPr>
-                <w:b w:val="false"/>
-                <w:bCs w:val="false"/>
-                <w:color w:val="222222"/>
-                <w:sz w:val="17"/>
-                <w:szCs w:val="17"/>
-              </w:rPr>
-              <w:t xml:space="preserve">Client D</w:t>
-            </w:r>
-          </w:p>
-        </w:tc>
-        <w:tc>
-          <w:tcPr>
-            <w:tcW w:type="dxa" w:w="1025"/>
-            <w:tcBorders>
-              <w:top w:val="single" w:color="BFC7D5" w:sz="4"/>
-              <w:left w:val="single" w:color="BFC7D5" w:sz="4"/>
-              <w:bottom w:val="single" w:color="BFC7D5" w:sz="4"/>
-              <w:right w:val="single" w:color="BFC7D5" w:sz="4"/>
-            </w:tcBorders>
-            <w:tcMar>
-              <w:top w:type="dxa" w:w="60"/>
-              <w:left w:type="dxa" w:w="90"/>
-              <w:bottom w:type="dxa" w:w="60"/>
-              <w:right w:type="dxa" w:w="90"/>
-            </w:tcMar>
-          </w:tcPr>
-          <w:p>
-            <w:r>
-              <w:rPr>
-                <w:b w:val="false"/>
-                <w:bCs w:val="false"/>
-                <w:color w:val="222222"/>
-                <w:sz w:val="17"/>
-                <w:szCs w:val="17"/>
-              </w:rPr>
-              <w:t xml:space="preserve">CR-2026-09</w:t>
-            </w:r>
-          </w:p>
-        </w:tc>
-        <w:tc>
-          <w:tcPr>
-            <w:tcW w:type="dxa" w:w="2237"/>
-            <w:tcBorders>
-              <w:top w:val="single" w:color="BFC7D5" w:sz="4"/>
-              <w:left w:val="single" w:color="BFC7D5" w:sz="4"/>
-              <w:bottom w:val="single" w:color="BFC7D5" w:sz="4"/>
-              <w:right w:val="single" w:color="BFC7D5" w:sz="4"/>
-            </w:tcBorders>
-            <w:tcMar>
-              <w:top w:type="dxa" w:w="60"/>
-              <w:left w:type="dxa" w:w="90"/>
-              <w:bottom w:type="dxa" w:w="60"/>
-              <w:right w:type="dxa" w:w="90"/>
-            </w:tcMar>
-          </w:tcPr>
-          <w:p>
-            <w:r>
-              <w:rPr>
-                <w:b w:val="false"/>
-                <w:bCs w:val="false"/>
-                <w:color w:val="222222"/>
-                <w:sz w:val="17"/>
-                <w:szCs w:val="17"/>
-              </w:rPr>
-              <w:t xml:space="preserve">2d23f40 (06-20); 66356f9 (06-27)</w:t>
-            </w:r>
-          </w:p>
-        </w:tc>
-        <w:tc>
-          <w:tcPr>
-            <w:tcW w:type="dxa" w:w="1588"/>
+            <w:tcW w:type="dxa" w:w="1050"/>
+            <w:tcBorders>
+              <w:top w:val="single" w:color="BFC7D5" w:sz="4"/>
+              <w:left w:val="single" w:color="BFC7D5" w:sz="4"/>
+              <w:bottom w:val="single" w:color="BFC7D5" w:sz="4"/>
+              <w:right w:val="single" w:color="BFC7D5" w:sz="4"/>
+            </w:tcBorders>
+            <w:tcMar>
+              <w:top w:type="dxa" w:w="60"/>
+              <w:left w:type="dxa" w:w="90"/>
+              <w:bottom w:type="dxa" w:w="60"/>
+              <w:right w:type="dxa" w:w="90"/>
+            </w:tcMar>
+          </w:tcPr>
+          <w:p>
+            <w:r>
+              <w:rPr>
+                <w:b w:val="false"/>
+                <w:bCs w:val="false"/>
+                <w:color w:val="222222"/>
+                <w:sz w:val="17"/>
+                <w:szCs w:val="17"/>
+              </w:rPr>
+              <w:t xml:space="preserve">FR-DS-01 … 04</w:t>
+            </w:r>
+          </w:p>
+        </w:tc>
+        <w:tc>
+          <w:tcPr>
+            <w:tcW w:type="dxa" w:w="1751"/>
+            <w:tcBorders>
+              <w:top w:val="single" w:color="BFC7D5" w:sz="4"/>
+              <w:left w:val="single" w:color="BFC7D5" w:sz="4"/>
+              <w:bottom w:val="single" w:color="BFC7D5" w:sz="4"/>
+              <w:right w:val="single" w:color="BFC7D5" w:sz="4"/>
+            </w:tcBorders>
+            <w:tcMar>
+              <w:top w:type="dxa" w:w="60"/>
+              <w:left w:type="dxa" w:w="90"/>
+              <w:bottom w:type="dxa" w:w="60"/>
+              <w:right w:type="dxa" w:w="90"/>
+            </w:tcMar>
+          </w:tcPr>
+          <w:p>
+            <w:r>
+              <w:rPr>
+                <w:b w:val="false"/>
+                <w:bCs w:val="false"/>
+                <w:color w:val="222222"/>
+                <w:sz w:val="17"/>
+                <w:szCs w:val="17"/>
+              </w:rPr>
+              <w:t xml:space="preserve">New requirement: Document Studio — PPT and PDF locally, with and without a template</w:t>
+            </w:r>
+          </w:p>
+        </w:tc>
+        <w:tc>
+          <w:tcPr>
+            <w:tcW w:type="dxa" w:w="1050"/>
+            <w:tcBorders>
+              <w:top w:val="single" w:color="BFC7D5" w:sz="4"/>
+              <w:left w:val="single" w:color="BFC7D5" w:sz="4"/>
+              <w:bottom w:val="single" w:color="BFC7D5" w:sz="4"/>
+              <w:right w:val="single" w:color="BFC7D5" w:sz="4"/>
+            </w:tcBorders>
+            <w:tcMar>
+              <w:top w:type="dxa" w:w="60"/>
+              <w:left w:type="dxa" w:w="90"/>
+              <w:bottom w:type="dxa" w:w="60"/>
+              <w:right w:type="dxa" w:w="90"/>
+            </w:tcMar>
+          </w:tcPr>
+          <w:p>
+            <w:r>
+              <w:rPr>
+                <w:b w:val="false"/>
+                <w:bCs w:val="false"/>
+                <w:color w:val="222222"/>
+                <w:sz w:val="17"/>
+                <w:szCs w:val="17"/>
+              </w:rPr>
+              <w:t xml:space="preserve">Client requirement (mediator contract)</w:t>
+            </w:r>
+          </w:p>
+        </w:tc>
+        <w:tc>
+          <w:tcPr>
+            <w:tcW w:type="dxa" w:w="1050"/>
+            <w:tcBorders>
+              <w:top w:val="single" w:color="BFC7D5" w:sz="4"/>
+              <w:left w:val="single" w:color="BFC7D5" w:sz="4"/>
+              <w:bottom w:val="single" w:color="BFC7D5" w:sz="4"/>
+              <w:right w:val="single" w:color="BFC7D5" w:sz="4"/>
+            </w:tcBorders>
+            <w:tcMar>
+              <w:top w:type="dxa" w:w="60"/>
+              <w:left w:type="dxa" w:w="90"/>
+              <w:bottom w:type="dxa" w:w="60"/>
+              <w:right w:type="dxa" w:w="90"/>
+            </w:tcMar>
+          </w:tcPr>
+          <w:p>
+            <w:r>
+              <w:rPr>
+                <w:b w:val="false"/>
+                <w:bCs w:val="false"/>
+                <w:color w:val="222222"/>
+                <w:sz w:val="17"/>
+                <w:szCs w:val="17"/>
+              </w:rPr>
+              <w:t xml:space="preserve">Client D (Gulf region)</w:t>
+            </w:r>
+          </w:p>
+        </w:tc>
+        <w:tc>
+          <w:tcPr>
+            <w:tcW w:type="dxa" w:w="1351"/>
+            <w:tcBorders>
+              <w:top w:val="single" w:color="BFC7D5" w:sz="4"/>
+              <w:left w:val="single" w:color="BFC7D5" w:sz="4"/>
+              <w:bottom w:val="single" w:color="BFC7D5" w:sz="4"/>
+              <w:right w:val="single" w:color="BFC7D5" w:sz="4"/>
+            </w:tcBorders>
+            <w:tcMar>
+              <w:top w:type="dxa" w:w="60"/>
+              <w:left w:type="dxa" w:w="90"/>
+              <w:bottom w:type="dxa" w:w="60"/>
+              <w:right w:type="dxa" w:w="90"/>
+            </w:tcMar>
+          </w:tcPr>
+          <w:p>
+            <w:r>
+              <w:rPr>
+                <w:b w:val="false"/>
+                <w:bCs w:val="false"/>
+                <w:color w:val="222222"/>
+                <w:sz w:val="17"/>
+                <w:szCs w:val="17"/>
+              </w:rPr>
+              <w:t xml:space="preserve">EM26-19 review log › CR-2026-09; review record CR-2026-09</w:t>
+            </w:r>
+          </w:p>
+        </w:tc>
+        <w:tc>
+          <w:tcPr>
+            <w:tcW w:type="dxa" w:w="1000"/>
+            <w:tcBorders>
+              <w:top w:val="single" w:color="BFC7D5" w:sz="4"/>
+              <w:left w:val="single" w:color="BFC7D5" w:sz="4"/>
+              <w:bottom w:val="single" w:color="BFC7D5" w:sz="4"/>
+              <w:right w:val="single" w:color="BFC7D5" w:sz="4"/>
+            </w:tcBorders>
+            <w:tcMar>
+              <w:top w:type="dxa" w:w="60"/>
+              <w:left w:type="dxa" w:w="90"/>
+              <w:bottom w:type="dxa" w:w="60"/>
+              <w:right w:type="dxa" w:w="90"/>
+            </w:tcMar>
+          </w:tcPr>
+          <w:p>
+            <w:r>
+              <w:rPr>
+                <w:b w:val="false"/>
+                <w:bCs w:val="false"/>
+                <w:color w:val="222222"/>
+                <w:sz w:val="17"/>
+                <w:szCs w:val="17"/>
+              </w:rPr>
+              <w:t xml:space="preserve">New module; on-device image model</w:t>
+            </w:r>
+          </w:p>
+        </w:tc>
+        <w:tc>
+          <w:tcPr>
+            <w:tcW w:type="dxa" w:w="850"/>
+            <w:tcBorders>
+              <w:top w:val="single" w:color="BFC7D5" w:sz="4"/>
+              <w:left w:val="single" w:color="BFC7D5" w:sz="4"/>
+              <w:bottom w:val="single" w:color="BFC7D5" w:sz="4"/>
+              <w:right w:val="single" w:color="BFC7D5" w:sz="4"/>
+            </w:tcBorders>
+            <w:tcMar>
+              <w:top w:type="dxa" w:w="60"/>
+              <w:left w:type="dxa" w:w="90"/>
+              <w:bottom w:type="dxa" w:w="60"/>
+              <w:right w:type="dxa" w:w="90"/>
+            </w:tcMar>
+          </w:tcPr>
+          <w:p>
+            <w:r>
+              <w:rPr>
+                <w:b w:val="false"/>
+                <w:bCs w:val="false"/>
+                <w:color w:val="222222"/>
+                <w:sz w:val="17"/>
+                <w:szCs w:val="17"/>
+              </w:rPr>
+              <w:t xml:space="preserve">Accepted</w:t>
+            </w:r>
+          </w:p>
+        </w:tc>
+        <w:tc>
+          <w:tcPr>
+            <w:tcW w:type="dxa" w:w="1200"/>
+            <w:tcBorders>
+              <w:top w:val="single" w:color="BFC7D5" w:sz="4"/>
+              <w:left w:val="single" w:color="BFC7D5" w:sz="4"/>
+              <w:bottom w:val="single" w:color="BFC7D5" w:sz="4"/>
+              <w:right w:val="single" w:color="BFC7D5" w:sz="4"/>
+            </w:tcBorders>
+            <w:tcMar>
+              <w:top w:type="dxa" w:w="60"/>
+              <w:left w:type="dxa" w:w="90"/>
+              <w:bottom w:type="dxa" w:w="60"/>
+              <w:right w:type="dxa" w:w="90"/>
+            </w:tcMar>
+          </w:tcPr>
+          <w:p>
+            <w:r>
+              <w:rPr>
+                <w:b w:val="false"/>
+                <w:bCs w:val="false"/>
+                <w:color w:val="222222"/>
+                <w:sz w:val="17"/>
+                <w:szCs w:val="17"/>
+              </w:rPr>
+              <w:t xml:space="preserve">2d23f40, 66356f9 — v1.2.0</w:t>
+            </w:r>
+          </w:p>
+        </w:tc>
+        <w:tc>
+          <w:tcPr>
+            <w:tcW w:type="dxa" w:w="1000"/>
             <w:tcBorders>
               <w:top w:val="single" w:color="BFC7D5" w:sz="4"/>
               <w:left w:val="single" w:color="BFC7D5" w:sz="4"/>
@@ -3006,6 +4089,35 @@
                 <w:szCs w:val="17"/>
               </w:rPr>
               <w:t xml:space="preserve">TC-EM-DGEN-110 (run 4)</w:t>
+            </w:r>
+          </w:p>
+        </w:tc>
+        <w:tc>
+          <w:tcPr>
+            <w:tcW w:type="dxa" w:w="958"/>
+            <w:tcBorders>
+              <w:top w:val="single" w:color="BFC7D5" w:sz="4"/>
+              <w:left w:val="single" w:color="BFC7D5" w:sz="4"/>
+              <w:bottom w:val="single" w:color="BFC7D5" w:sz="4"/>
+              <w:right w:val="single" w:color="BFC7D5" w:sz="4"/>
+            </w:tcBorders>
+            <w:tcMar>
+              <w:top w:type="dxa" w:w="60"/>
+              <w:left w:type="dxa" w:w="90"/>
+              <w:bottom w:type="dxa" w:w="60"/>
+              <w:right w:type="dxa" w:w="90"/>
+            </w:tcMar>
+          </w:tcPr>
+          <w:p>
+            <w:r>
+              <w:rPr>
+                <w:b w:val="false"/>
+                <w:bCs w:val="false"/>
+                <w:color w:val="222222"/>
+                <w:sz w:val="17"/>
+                <w:szCs w:val="17"/>
+              </w:rPr>
+              <w:t xml:space="preserve">Closed</w:t>
             </w:r>
           </w:p>
         </w:tc>
@@ -3021,7 +4133,913 @@
         <w:pStyle w:val="Heading1"/>
       </w:pPr>
       <w:r>
-        <w:t xml:space="preserve">3. How a change is handled</w:t>
+        <w:t xml:space="preserve">3. Requirements added from internal reviews</w:t>
+      </w:r>
+    </w:p>
+    <w:tbl>
+      <w:tblPr>
+        <w:tblW w:type="dxa" w:w="12960"/>
+        <w:tblBorders>
+          <w:top w:val="single" w:color="auto" w:sz="4"/>
+          <w:left w:val="single" w:color="auto" w:sz="4"/>
+          <w:bottom w:val="single" w:color="auto" w:sz="4"/>
+          <w:right w:val="single" w:color="auto" w:sz="4"/>
+          <w:insideH w:val="single" w:color="auto" w:sz="4"/>
+          <w:insideV w:val="single" w:color="auto" w:sz="4"/>
+        </w:tblBorders>
+      </w:tblPr>
+      <w:tblGrid>
+        <w:gridCol w:w="870"/>
+        <w:gridCol w:w="4352"/>
+        <w:gridCol w:w="1644"/>
+        <w:gridCol w:w="2321"/>
+        <w:gridCol w:w="2224"/>
+        <w:gridCol w:w="1549"/>
+      </w:tblGrid>
+      <w:tr>
+        <w:trPr>
+          <w:tblHeader/>
+        </w:trPr>
+        <w:tc>
+          <w:tcPr>
+            <w:tcW w:type="dxa" w:w="870"/>
+            <w:tcBorders>
+              <w:top w:val="single" w:color="BFC7D5" w:sz="4"/>
+              <w:left w:val="single" w:color="BFC7D5" w:sz="4"/>
+              <w:bottom w:val="single" w:color="BFC7D5" w:sz="4"/>
+              <w:right w:val="single" w:color="BFC7D5" w:sz="4"/>
+            </w:tcBorders>
+            <w:shd w:fill="1F3A5F" w:color="auto" w:val="clear"/>
+            <w:tcMar>
+              <w:top w:type="dxa" w:w="60"/>
+              <w:left w:type="dxa" w:w="90"/>
+              <w:bottom w:type="dxa" w:w="60"/>
+              <w:right w:type="dxa" w:w="90"/>
+            </w:tcMar>
+          </w:tcPr>
+          <w:p>
+            <w:r>
+              <w:rPr>
+                <w:b/>
+                <w:bCs/>
+                <w:color w:val="FFFFFF"/>
+                <w:sz w:val="17"/>
+                <w:szCs w:val="17"/>
+              </w:rPr>
+              <w:t xml:space="preserve">Date</w:t>
+            </w:r>
+          </w:p>
+        </w:tc>
+        <w:tc>
+          <w:tcPr>
+            <w:tcW w:type="dxa" w:w="4352"/>
+            <w:tcBorders>
+              <w:top w:val="single" w:color="BFC7D5" w:sz="4"/>
+              <w:left w:val="single" w:color="BFC7D5" w:sz="4"/>
+              <w:bottom w:val="single" w:color="BFC7D5" w:sz="4"/>
+              <w:right w:val="single" w:color="BFC7D5" w:sz="4"/>
+            </w:tcBorders>
+            <w:shd w:fill="1F3A5F" w:color="auto" w:val="clear"/>
+            <w:tcMar>
+              <w:top w:type="dxa" w:w="60"/>
+              <w:left w:type="dxa" w:w="90"/>
+              <w:bottom w:type="dxa" w:w="60"/>
+              <w:right w:type="dxa" w:w="90"/>
+            </w:tcMar>
+          </w:tcPr>
+          <w:p>
+            <w:r>
+              <w:rPr>
+                <w:b/>
+                <w:bCs/>
+                <w:color w:val="FFFFFF"/>
+                <w:sz w:val="17"/>
+                <w:szCs w:val="17"/>
+              </w:rPr>
+              <w:t xml:space="preserve">Requirement</w:t>
+            </w:r>
+          </w:p>
+        </w:tc>
+        <w:tc>
+          <w:tcPr>
+            <w:tcW w:type="dxa" w:w="1644"/>
+            <w:tcBorders>
+              <w:top w:val="single" w:color="BFC7D5" w:sz="4"/>
+              <w:left w:val="single" w:color="BFC7D5" w:sz="4"/>
+              <w:bottom w:val="single" w:color="BFC7D5" w:sz="4"/>
+              <w:right w:val="single" w:color="BFC7D5" w:sz="4"/>
+            </w:tcBorders>
+            <w:shd w:fill="1F3A5F" w:color="auto" w:val="clear"/>
+            <w:tcMar>
+              <w:top w:type="dxa" w:w="60"/>
+              <w:left w:type="dxa" w:w="90"/>
+              <w:bottom w:type="dxa" w:w="60"/>
+              <w:right w:type="dxa" w:w="90"/>
+            </w:tcMar>
+          </w:tcPr>
+          <w:p>
+            <w:r>
+              <w:rPr>
+                <w:b/>
+                <w:bCs/>
+                <w:color w:val="FFFFFF"/>
+                <w:sz w:val="17"/>
+                <w:szCs w:val="17"/>
+              </w:rPr>
+              <w:t xml:space="preserve">Raised by</w:t>
+            </w:r>
+          </w:p>
+        </w:tc>
+        <w:tc>
+          <w:tcPr>
+            <w:tcW w:type="dxa" w:w="2321"/>
+            <w:tcBorders>
+              <w:top w:val="single" w:color="BFC7D5" w:sz="4"/>
+              <w:left w:val="single" w:color="BFC7D5" w:sz="4"/>
+              <w:bottom w:val="single" w:color="BFC7D5" w:sz="4"/>
+              <w:right w:val="single" w:color="BFC7D5" w:sz="4"/>
+            </w:tcBorders>
+            <w:shd w:fill="1F3A5F" w:color="auto" w:val="clear"/>
+            <w:tcMar>
+              <w:top w:type="dxa" w:w="60"/>
+              <w:left w:type="dxa" w:w="90"/>
+              <w:bottom w:type="dxa" w:w="60"/>
+              <w:right w:type="dxa" w:w="90"/>
+            </w:tcMar>
+          </w:tcPr>
+          <w:p>
+            <w:r>
+              <w:rPr>
+                <w:b/>
+                <w:bCs/>
+                <w:color w:val="FFFFFF"/>
+                <w:sz w:val="17"/>
+                <w:szCs w:val="17"/>
+              </w:rPr>
+              <w:t xml:space="preserve">Meeting recorded in</w:t>
+            </w:r>
+          </w:p>
+        </w:tc>
+        <w:tc>
+          <w:tcPr>
+            <w:tcW w:type="dxa" w:w="2224"/>
+            <w:tcBorders>
+              <w:top w:val="single" w:color="BFC7D5" w:sz="4"/>
+              <w:left w:val="single" w:color="BFC7D5" w:sz="4"/>
+              <w:bottom w:val="single" w:color="BFC7D5" w:sz="4"/>
+              <w:right w:val="single" w:color="BFC7D5" w:sz="4"/>
+            </w:tcBorders>
+            <w:shd w:fill="1F3A5F" w:color="auto" w:val="clear"/>
+            <w:tcMar>
+              <w:top w:type="dxa" w:w="60"/>
+              <w:left w:type="dxa" w:w="90"/>
+              <w:bottom w:type="dxa" w:w="60"/>
+              <w:right w:type="dxa" w:w="90"/>
+            </w:tcMar>
+          </w:tcPr>
+          <w:p>
+            <w:r>
+              <w:rPr>
+                <w:b/>
+                <w:bCs/>
+                <w:color w:val="FFFFFF"/>
+                <w:sz w:val="17"/>
+                <w:szCs w:val="17"/>
+              </w:rPr>
+              <w:t xml:space="preserve">Implemented</w:t>
+            </w:r>
+          </w:p>
+        </w:tc>
+        <w:tc>
+          <w:tcPr>
+            <w:tcW w:type="dxa" w:w="1549"/>
+            <w:tcBorders>
+              <w:top w:val="single" w:color="BFC7D5" w:sz="4"/>
+              <w:left w:val="single" w:color="BFC7D5" w:sz="4"/>
+              <w:bottom w:val="single" w:color="BFC7D5" w:sz="4"/>
+              <w:right w:val="single" w:color="BFC7D5" w:sz="4"/>
+            </w:tcBorders>
+            <w:shd w:fill="1F3A5F" w:color="auto" w:val="clear"/>
+            <w:tcMar>
+              <w:top w:type="dxa" w:w="60"/>
+              <w:left w:type="dxa" w:w="90"/>
+              <w:bottom w:type="dxa" w:w="60"/>
+              <w:right w:type="dxa" w:w="90"/>
+            </w:tcMar>
+          </w:tcPr>
+          <w:p>
+            <w:r>
+              <w:rPr>
+                <w:b/>
+                <w:bCs/>
+                <w:color w:val="FFFFFF"/>
+                <w:sz w:val="17"/>
+                <w:szCs w:val="17"/>
+              </w:rPr>
+              <w:t xml:space="preserve">Verified</w:t>
+            </w:r>
+          </w:p>
+        </w:tc>
+      </w:tr>
+      <w:tr>
+        <w:tc>
+          <w:tcPr>
+            <w:tcW w:type="dxa" w:w="870"/>
+            <w:tcBorders>
+              <w:top w:val="single" w:color="BFC7D5" w:sz="4"/>
+              <w:left w:val="single" w:color="BFC7D5" w:sz="4"/>
+              <w:bottom w:val="single" w:color="BFC7D5" w:sz="4"/>
+              <w:right w:val="single" w:color="BFC7D5" w:sz="4"/>
+            </w:tcBorders>
+            <w:tcMar>
+              <w:top w:type="dxa" w:w="60"/>
+              <w:left w:type="dxa" w:w="90"/>
+              <w:bottom w:type="dxa" w:w="60"/>
+              <w:right w:type="dxa" w:w="90"/>
+            </w:tcMar>
+          </w:tcPr>
+          <w:p>
+            <w:r>
+              <w:rPr>
+                <w:b w:val="false"/>
+                <w:bCs w:val="false"/>
+                <w:color w:val="222222"/>
+                <w:sz w:val="17"/>
+                <w:szCs w:val="17"/>
+              </w:rPr>
+              <w:t xml:space="preserve">2026-04</w:t>
+            </w:r>
+          </w:p>
+        </w:tc>
+        <w:tc>
+          <w:tcPr>
+            <w:tcW w:type="dxa" w:w="4352"/>
+            <w:tcBorders>
+              <w:top w:val="single" w:color="BFC7D5" w:sz="4"/>
+              <w:left w:val="single" w:color="BFC7D5" w:sz="4"/>
+              <w:bottom w:val="single" w:color="BFC7D5" w:sz="4"/>
+              <w:right w:val="single" w:color="BFC7D5" w:sz="4"/>
+            </w:tcBorders>
+            <w:tcMar>
+              <w:top w:type="dxa" w:w="60"/>
+              <w:left w:type="dxa" w:w="90"/>
+              <w:bottom w:type="dxa" w:w="60"/>
+              <w:right w:type="dxa" w:w="90"/>
+            </w:tcMar>
+          </w:tcPr>
+          <w:p>
+            <w:r>
+              <w:rPr>
+                <w:b w:val="false"/>
+                <w:bCs w:val="false"/>
+                <w:color w:val="222222"/>
+                <w:sz w:val="17"/>
+                <w:szCs w:val="17"/>
+              </w:rPr>
+              <w:t xml:space="preserve">FR-PL-06 — reach a deployed unit with no network (boot-time hotspot and landing page)</w:t>
+            </w:r>
+          </w:p>
+        </w:tc>
+        <w:tc>
+          <w:tcPr>
+            <w:tcW w:type="dxa" w:w="1644"/>
+            <w:tcBorders>
+              <w:top w:val="single" w:color="BFC7D5" w:sz="4"/>
+              <w:left w:val="single" w:color="BFC7D5" w:sz="4"/>
+              <w:bottom w:val="single" w:color="BFC7D5" w:sz="4"/>
+              <w:right w:val="single" w:color="BFC7D5" w:sz="4"/>
+            </w:tcBorders>
+            <w:tcMar>
+              <w:top w:type="dxa" w:w="60"/>
+              <w:left w:type="dxa" w:w="90"/>
+              <w:bottom w:type="dxa" w:w="60"/>
+              <w:right w:type="dxa" w:w="90"/>
+            </w:tcMar>
+          </w:tcPr>
+          <w:p>
+            <w:r>
+              <w:rPr>
+                <w:b w:val="false"/>
+                <w:bCs w:val="false"/>
+                <w:color w:val="222222"/>
+                <w:sz w:val="17"/>
+                <w:szCs w:val="17"/>
+              </w:rPr>
+              <w:t xml:space="preserve">Alexander Peter (Project Lead)</w:t>
+            </w:r>
+          </w:p>
+        </w:tc>
+        <w:tc>
+          <w:tcPr>
+            <w:tcW w:type="dxa" w:w="2321"/>
+            <w:tcBorders>
+              <w:top w:val="single" w:color="BFC7D5" w:sz="4"/>
+              <w:left w:val="single" w:color="BFC7D5" w:sz="4"/>
+              <w:bottom w:val="single" w:color="BFC7D5" w:sz="4"/>
+              <w:right w:val="single" w:color="BFC7D5" w:sz="4"/>
+            </w:tcBorders>
+            <w:tcMar>
+              <w:top w:type="dxa" w:w="60"/>
+              <w:left w:type="dxa" w:w="90"/>
+              <w:bottom w:type="dxa" w:w="60"/>
+              <w:right w:type="dxa" w:w="90"/>
+            </w:tcMar>
+          </w:tcPr>
+          <w:p>
+            <w:r>
+              <w:rPr>
+                <w:b w:val="false"/>
+                <w:bCs w:val="false"/>
+                <w:color w:val="222222"/>
+                <w:sz w:val="17"/>
+                <w:szCs w:val="17"/>
+              </w:rPr>
+              <w:t xml:space="preserve">EM26-19 review log › CR-2026-05; review record CR-2026-05</w:t>
+            </w:r>
+          </w:p>
+        </w:tc>
+        <w:tc>
+          <w:tcPr>
+            <w:tcW w:type="dxa" w:w="2224"/>
+            <w:tcBorders>
+              <w:top w:val="single" w:color="BFC7D5" w:sz="4"/>
+              <w:left w:val="single" w:color="BFC7D5" w:sz="4"/>
+              <w:bottom w:val="single" w:color="BFC7D5" w:sz="4"/>
+              <w:right w:val="single" w:color="BFC7D5" w:sz="4"/>
+            </w:tcBorders>
+            <w:tcMar>
+              <w:top w:type="dxa" w:w="60"/>
+              <w:left w:type="dxa" w:w="90"/>
+              <w:bottom w:type="dxa" w:w="60"/>
+              <w:right w:type="dxa" w:w="90"/>
+            </w:tcMar>
+          </w:tcPr>
+          <w:p>
+            <w:r>
+              <w:rPr>
+                <w:b w:val="false"/>
+                <w:bCs w:val="false"/>
+                <w:color w:val="222222"/>
+                <w:sz w:val="17"/>
+                <w:szCs w:val="17"/>
+              </w:rPr>
+              <w:t xml:space="preserve">Deployment unit; configuration to version control (AC-26)</w:t>
+            </w:r>
+          </w:p>
+        </w:tc>
+        <w:tc>
+          <w:tcPr>
+            <w:tcW w:type="dxa" w:w="1549"/>
+            <w:tcBorders>
+              <w:top w:val="single" w:color="BFC7D5" w:sz="4"/>
+              <w:left w:val="single" w:color="BFC7D5" w:sz="4"/>
+              <w:bottom w:val="single" w:color="BFC7D5" w:sz="4"/>
+              <w:right w:val="single" w:color="BFC7D5" w:sz="4"/>
+            </w:tcBorders>
+            <w:tcMar>
+              <w:top w:type="dxa" w:w="60"/>
+              <w:left w:type="dxa" w:w="90"/>
+              <w:bottom w:type="dxa" w:w="60"/>
+              <w:right w:type="dxa" w:w="90"/>
+            </w:tcMar>
+          </w:tcPr>
+          <w:p>
+            <w:r>
+              <w:rPr>
+                <w:b w:val="false"/>
+                <w:bCs w:val="false"/>
+                <w:color w:val="222222"/>
+                <w:sz w:val="17"/>
+                <w:szCs w:val="17"/>
+              </w:rPr>
+              <w:t xml:space="preserve">Demonstrated on the unit</w:t>
+            </w:r>
+          </w:p>
+        </w:tc>
+      </w:tr>
+      <w:tr>
+        <w:tc>
+          <w:tcPr>
+            <w:tcW w:type="dxa" w:w="870"/>
+            <w:tcBorders>
+              <w:top w:val="single" w:color="BFC7D5" w:sz="4"/>
+              <w:left w:val="single" w:color="BFC7D5" w:sz="4"/>
+              <w:bottom w:val="single" w:color="BFC7D5" w:sz="4"/>
+              <w:right w:val="single" w:color="BFC7D5" w:sz="4"/>
+            </w:tcBorders>
+            <w:tcMar>
+              <w:top w:type="dxa" w:w="60"/>
+              <w:left w:type="dxa" w:w="90"/>
+              <w:bottom w:type="dxa" w:w="60"/>
+              <w:right w:type="dxa" w:w="90"/>
+            </w:tcMar>
+          </w:tcPr>
+          <w:p>
+            <w:r>
+              <w:rPr>
+                <w:b w:val="false"/>
+                <w:bCs w:val="false"/>
+                <w:color w:val="222222"/>
+                <w:sz w:val="17"/>
+                <w:szCs w:val="17"/>
+              </w:rPr>
+              <w:t xml:space="preserve">2026-05</w:t>
+            </w:r>
+          </w:p>
+        </w:tc>
+        <w:tc>
+          <w:tcPr>
+            <w:tcW w:type="dxa" w:w="4352"/>
+            <w:tcBorders>
+              <w:top w:val="single" w:color="BFC7D5" w:sz="4"/>
+              <w:left w:val="single" w:color="BFC7D5" w:sz="4"/>
+              <w:bottom w:val="single" w:color="BFC7D5" w:sz="4"/>
+              <w:right w:val="single" w:color="BFC7D5" w:sz="4"/>
+            </w:tcBorders>
+            <w:tcMar>
+              <w:top w:type="dxa" w:w="60"/>
+              <w:left w:type="dxa" w:w="90"/>
+              <w:bottom w:type="dxa" w:w="60"/>
+              <w:right w:type="dxa" w:w="90"/>
+            </w:tcMar>
+          </w:tcPr>
+          <w:p>
+            <w:r>
+              <w:rPr>
+                <w:b w:val="false"/>
+                <w:bCs w:val="false"/>
+                <w:color w:val="222222"/>
+                <w:sz w:val="17"/>
+                <w:szCs w:val="17"/>
+              </w:rPr>
+              <w:t xml:space="preserve">FR-BR-01, FR-BR-02 — group discussions with speaker separation and a meeting report</w:t>
+            </w:r>
+          </w:p>
+        </w:tc>
+        <w:tc>
+          <w:tcPr>
+            <w:tcW w:type="dxa" w:w="1644"/>
+            <w:tcBorders>
+              <w:top w:val="single" w:color="BFC7D5" w:sz="4"/>
+              <w:left w:val="single" w:color="BFC7D5" w:sz="4"/>
+              <w:bottom w:val="single" w:color="BFC7D5" w:sz="4"/>
+              <w:right w:val="single" w:color="BFC7D5" w:sz="4"/>
+            </w:tcBorders>
+            <w:tcMar>
+              <w:top w:type="dxa" w:w="60"/>
+              <w:left w:type="dxa" w:w="90"/>
+              <w:bottom w:type="dxa" w:w="60"/>
+              <w:right w:type="dxa" w:w="90"/>
+            </w:tcMar>
+          </w:tcPr>
+          <w:p>
+            <w:r>
+              <w:rPr>
+                <w:b w:val="false"/>
+                <w:bCs w:val="false"/>
+                <w:color w:val="222222"/>
+                <w:sz w:val="17"/>
+                <w:szCs w:val="17"/>
+              </w:rPr>
+              <w:t xml:space="preserve">EchoMind team</w:t>
+            </w:r>
+          </w:p>
+        </w:tc>
+        <w:tc>
+          <w:tcPr>
+            <w:tcW w:type="dxa" w:w="2321"/>
+            <w:tcBorders>
+              <w:top w:val="single" w:color="BFC7D5" w:sz="4"/>
+              <w:left w:val="single" w:color="BFC7D5" w:sz="4"/>
+              <w:bottom w:val="single" w:color="BFC7D5" w:sz="4"/>
+              <w:right w:val="single" w:color="BFC7D5" w:sz="4"/>
+            </w:tcBorders>
+            <w:tcMar>
+              <w:top w:type="dxa" w:w="60"/>
+              <w:left w:type="dxa" w:w="90"/>
+              <w:bottom w:type="dxa" w:w="60"/>
+              <w:right w:type="dxa" w:w="90"/>
+            </w:tcMar>
+          </w:tcPr>
+          <w:p>
+            <w:r>
+              <w:rPr>
+                <w:b w:val="false"/>
+                <w:bCs w:val="false"/>
+                <w:color w:val="222222"/>
+                <w:sz w:val="17"/>
+                <w:szCs w:val="17"/>
+              </w:rPr>
+              <w:t xml:space="preserve">EM26-19 review log › CR-2026-08; review record CR-2026-08</w:t>
+            </w:r>
+          </w:p>
+        </w:tc>
+        <w:tc>
+          <w:tcPr>
+            <w:tcW w:type="dxa" w:w="2224"/>
+            <w:tcBorders>
+              <w:top w:val="single" w:color="BFC7D5" w:sz="4"/>
+              <w:left w:val="single" w:color="BFC7D5" w:sz="4"/>
+              <w:bottom w:val="single" w:color="BFC7D5" w:sz="4"/>
+              <w:right w:val="single" w:color="BFC7D5" w:sz="4"/>
+            </w:tcBorders>
+            <w:tcMar>
+              <w:top w:type="dxa" w:w="60"/>
+              <w:left w:type="dxa" w:w="90"/>
+              <w:bottom w:type="dxa" w:w="60"/>
+              <w:right w:type="dxa" w:w="90"/>
+            </w:tcMar>
+          </w:tcPr>
+          <w:p>
+            <w:r>
+              <w:rPr>
+                <w:b w:val="false"/>
+                <w:bCs w:val="false"/>
+                <w:color w:val="222222"/>
+                <w:sz w:val="17"/>
+                <w:szCs w:val="17"/>
+              </w:rPr>
+              <w:t xml:space="preserve">f540976, cf463aa, e1a337b — v1.2.0</w:t>
+            </w:r>
+          </w:p>
+        </w:tc>
+        <w:tc>
+          <w:tcPr>
+            <w:tcW w:type="dxa" w:w="1549"/>
+            <w:tcBorders>
+              <w:top w:val="single" w:color="BFC7D5" w:sz="4"/>
+              <w:left w:val="single" w:color="BFC7D5" w:sz="4"/>
+              <w:bottom w:val="single" w:color="BFC7D5" w:sz="4"/>
+              <w:right w:val="single" w:color="BFC7D5" w:sz="4"/>
+            </w:tcBorders>
+            <w:tcMar>
+              <w:top w:type="dxa" w:w="60"/>
+              <w:left w:type="dxa" w:w="90"/>
+              <w:bottom w:type="dxa" w:w="60"/>
+              <w:right w:type="dxa" w:w="90"/>
+            </w:tcMar>
+          </w:tcPr>
+          <w:p>
+            <w:r>
+              <w:rPr>
+                <w:b w:val="false"/>
+                <w:bCs w:val="false"/>
+                <w:color w:val="222222"/>
+                <w:sz w:val="17"/>
+                <w:szCs w:val="17"/>
+              </w:rPr>
+              <w:t xml:space="preserve">TC-EM-BRD-111 (run 4)</w:t>
+            </w:r>
+          </w:p>
+        </w:tc>
+      </w:tr>
+    </w:tbl>
+    <w:p>
+      <w:pPr>
+        <w:spacing w:after="120"/>
+      </w:pPr>
+    </w:p>
+    <w:p>
+      <w:pPr>
+        <w:pStyle w:val="Heading1"/>
+      </w:pPr>
+      <w:r>
+        <w:t xml:space="preserve">4. Requested, not yet accepted</w:t>
+      </w:r>
+    </w:p>
+    <w:tbl>
+      <w:tblPr>
+        <w:tblW w:type="dxa" w:w="12960"/>
+        <w:tblBorders>
+          <w:top w:val="single" w:color="auto" w:sz="4"/>
+          <w:left w:val="single" w:color="auto" w:sz="4"/>
+          <w:bottom w:val="single" w:color="auto" w:sz="4"/>
+          <w:right w:val="single" w:color="auto" w:sz="4"/>
+          <w:insideH w:val="single" w:color="auto" w:sz="4"/>
+          <w:insideV w:val="single" w:color="auto" w:sz="4"/>
+        </w:tblBorders>
+      </w:tblPr>
+      <w:tblGrid>
+        <w:gridCol w:w="870"/>
+        <w:gridCol w:w="4835"/>
+        <w:gridCol w:w="2321"/>
+        <w:gridCol w:w="2514"/>
+        <w:gridCol w:w="2420"/>
+      </w:tblGrid>
+      <w:tr>
+        <w:trPr>
+          <w:tblHeader/>
+        </w:trPr>
+        <w:tc>
+          <w:tcPr>
+            <w:tcW w:type="dxa" w:w="870"/>
+            <w:tcBorders>
+              <w:top w:val="single" w:color="BFC7D5" w:sz="4"/>
+              <w:left w:val="single" w:color="BFC7D5" w:sz="4"/>
+              <w:bottom w:val="single" w:color="BFC7D5" w:sz="4"/>
+              <w:right w:val="single" w:color="BFC7D5" w:sz="4"/>
+            </w:tcBorders>
+            <w:shd w:fill="1F3A5F" w:color="auto" w:val="clear"/>
+            <w:tcMar>
+              <w:top w:type="dxa" w:w="60"/>
+              <w:left w:type="dxa" w:w="90"/>
+              <w:bottom w:type="dxa" w:w="60"/>
+              <w:right w:type="dxa" w:w="90"/>
+            </w:tcMar>
+          </w:tcPr>
+          <w:p>
+            <w:r>
+              <w:rPr>
+                <w:b/>
+                <w:bCs/>
+                <w:color w:val="FFFFFF"/>
+                <w:sz w:val="17"/>
+                <w:szCs w:val="17"/>
+              </w:rPr>
+              <w:t xml:space="preserve">Date</w:t>
+            </w:r>
+          </w:p>
+        </w:tc>
+        <w:tc>
+          <w:tcPr>
+            <w:tcW w:type="dxa" w:w="4835"/>
+            <w:tcBorders>
+              <w:top w:val="single" w:color="BFC7D5" w:sz="4"/>
+              <w:left w:val="single" w:color="BFC7D5" w:sz="4"/>
+              <w:bottom w:val="single" w:color="BFC7D5" w:sz="4"/>
+              <w:right w:val="single" w:color="BFC7D5" w:sz="4"/>
+            </w:tcBorders>
+            <w:shd w:fill="1F3A5F" w:color="auto" w:val="clear"/>
+            <w:tcMar>
+              <w:top w:type="dxa" w:w="60"/>
+              <w:left w:type="dxa" w:w="90"/>
+              <w:bottom w:type="dxa" w:w="60"/>
+              <w:right w:type="dxa" w:w="90"/>
+            </w:tcMar>
+          </w:tcPr>
+          <w:p>
+            <w:r>
+              <w:rPr>
+                <w:b/>
+                <w:bCs/>
+                <w:color w:val="FFFFFF"/>
+                <w:sz w:val="17"/>
+                <w:szCs w:val="17"/>
+              </w:rPr>
+              <w:t xml:space="preserve">Request</w:t>
+            </w:r>
+          </w:p>
+        </w:tc>
+        <w:tc>
+          <w:tcPr>
+            <w:tcW w:type="dxa" w:w="2321"/>
+            <w:tcBorders>
+              <w:top w:val="single" w:color="BFC7D5" w:sz="4"/>
+              <w:left w:val="single" w:color="BFC7D5" w:sz="4"/>
+              <w:bottom w:val="single" w:color="BFC7D5" w:sz="4"/>
+              <w:right w:val="single" w:color="BFC7D5" w:sz="4"/>
+            </w:tcBorders>
+            <w:shd w:fill="1F3A5F" w:color="auto" w:val="clear"/>
+            <w:tcMar>
+              <w:top w:type="dxa" w:w="60"/>
+              <w:left w:type="dxa" w:w="90"/>
+              <w:bottom w:type="dxa" w:w="60"/>
+              <w:right w:type="dxa" w:w="90"/>
+            </w:tcMar>
+          </w:tcPr>
+          <w:p>
+            <w:r>
+              <w:rPr>
+                <w:b/>
+                <w:bCs/>
+                <w:color w:val="FFFFFF"/>
+                <w:sz w:val="17"/>
+                <w:szCs w:val="17"/>
+              </w:rPr>
+              <w:t xml:space="preserve">Client</w:t>
+            </w:r>
+          </w:p>
+        </w:tc>
+        <w:tc>
+          <w:tcPr>
+            <w:tcW w:type="dxa" w:w="2514"/>
+            <w:tcBorders>
+              <w:top w:val="single" w:color="BFC7D5" w:sz="4"/>
+              <w:left w:val="single" w:color="BFC7D5" w:sz="4"/>
+              <w:bottom w:val="single" w:color="BFC7D5" w:sz="4"/>
+              <w:right w:val="single" w:color="BFC7D5" w:sz="4"/>
+            </w:tcBorders>
+            <w:shd w:fill="1F3A5F" w:color="auto" w:val="clear"/>
+            <w:tcMar>
+              <w:top w:type="dxa" w:w="60"/>
+              <w:left w:type="dxa" w:w="90"/>
+              <w:bottom w:type="dxa" w:w="60"/>
+              <w:right w:type="dxa" w:w="90"/>
+            </w:tcMar>
+          </w:tcPr>
+          <w:p>
+            <w:r>
+              <w:rPr>
+                <w:b/>
+                <w:bCs/>
+                <w:color w:val="FFFFFF"/>
+                <w:sz w:val="17"/>
+                <w:szCs w:val="17"/>
+              </w:rPr>
+              <w:t xml:space="preserve">Recorded in</w:t>
+            </w:r>
+          </w:p>
+        </w:tc>
+        <w:tc>
+          <w:tcPr>
+            <w:tcW w:type="dxa" w:w="2420"/>
+            <w:tcBorders>
+              <w:top w:val="single" w:color="BFC7D5" w:sz="4"/>
+              <w:left w:val="single" w:color="BFC7D5" w:sz="4"/>
+              <w:bottom w:val="single" w:color="BFC7D5" w:sz="4"/>
+              <w:right w:val="single" w:color="BFC7D5" w:sz="4"/>
+            </w:tcBorders>
+            <w:shd w:fill="1F3A5F" w:color="auto" w:val="clear"/>
+            <w:tcMar>
+              <w:top w:type="dxa" w:w="60"/>
+              <w:left w:type="dxa" w:w="90"/>
+              <w:bottom w:type="dxa" w:w="60"/>
+              <w:right w:type="dxa" w:w="90"/>
+            </w:tcMar>
+          </w:tcPr>
+          <w:p>
+            <w:r>
+              <w:rPr>
+                <w:b/>
+                <w:bCs/>
+                <w:color w:val="FFFFFF"/>
+                <w:sz w:val="17"/>
+                <w:szCs w:val="17"/>
+              </w:rPr>
+              <w:t xml:space="preserve">Status</w:t>
+            </w:r>
+          </w:p>
+        </w:tc>
+      </w:tr>
+      <w:tr>
+        <w:tc>
+          <w:tcPr>
+            <w:tcW w:type="dxa" w:w="870"/>
+            <w:tcBorders>
+              <w:top w:val="single" w:color="BFC7D5" w:sz="4"/>
+              <w:left w:val="single" w:color="BFC7D5" w:sz="4"/>
+              <w:bottom w:val="single" w:color="BFC7D5" w:sz="4"/>
+              <w:right w:val="single" w:color="BFC7D5" w:sz="4"/>
+            </w:tcBorders>
+            <w:tcMar>
+              <w:top w:type="dxa" w:w="60"/>
+              <w:left w:type="dxa" w:w="90"/>
+              <w:bottom w:type="dxa" w:w="60"/>
+              <w:right w:type="dxa" w:w="90"/>
+            </w:tcMar>
+          </w:tcPr>
+          <w:p>
+            <w:r>
+              <w:rPr>
+                <w:b w:val="false"/>
+                <w:bCs w:val="false"/>
+                <w:color w:val="222222"/>
+                <w:sz w:val="17"/>
+                <w:szCs w:val="17"/>
+              </w:rPr>
+              <w:t xml:space="preserve">2026-08</w:t>
+            </w:r>
+          </w:p>
+        </w:tc>
+        <w:tc>
+          <w:tcPr>
+            <w:tcW w:type="dxa" w:w="4835"/>
+            <w:tcBorders>
+              <w:top w:val="single" w:color="BFC7D5" w:sz="4"/>
+              <w:left w:val="single" w:color="BFC7D5" w:sz="4"/>
+              <w:bottom w:val="single" w:color="BFC7D5" w:sz="4"/>
+              <w:right w:val="single" w:color="BFC7D5" w:sz="4"/>
+            </w:tcBorders>
+            <w:tcMar>
+              <w:top w:type="dxa" w:w="60"/>
+              <w:left w:type="dxa" w:w="90"/>
+              <w:bottom w:type="dxa" w:w="60"/>
+              <w:right w:type="dxa" w:w="90"/>
+            </w:tcMar>
+          </w:tcPr>
+          <w:p>
+            <w:r>
+              <w:rPr>
+                <w:b w:val="false"/>
+                <w:bCs w:val="false"/>
+                <w:color w:val="222222"/>
+                <w:sz w:val="17"/>
+                <w:szCs w:val="17"/>
+              </w:rPr>
+              <w:t xml:space="preserve">EchoMind IoT — agritech sensors; vehicle inspection</w:t>
+            </w:r>
+          </w:p>
+        </w:tc>
+        <w:tc>
+          <w:tcPr>
+            <w:tcW w:type="dxa" w:w="2321"/>
+            <w:tcBorders>
+              <w:top w:val="single" w:color="BFC7D5" w:sz="4"/>
+              <w:left w:val="single" w:color="BFC7D5" w:sz="4"/>
+              <w:bottom w:val="single" w:color="BFC7D5" w:sz="4"/>
+              <w:right w:val="single" w:color="BFC7D5" w:sz="4"/>
+            </w:tcBorders>
+            <w:tcMar>
+              <w:top w:type="dxa" w:w="60"/>
+              <w:left w:type="dxa" w:w="90"/>
+              <w:bottom w:type="dxa" w:w="60"/>
+              <w:right w:type="dxa" w:w="90"/>
+            </w:tcMar>
+          </w:tcPr>
+          <w:p>
+            <w:r>
+              <w:rPr>
+                <w:b w:val="false"/>
+                <w:bCs w:val="false"/>
+                <w:color w:val="222222"/>
+                <w:sz w:val="17"/>
+                <w:szCs w:val="17"/>
+              </w:rPr>
+              <w:t xml:space="preserve">Client E (Asia-Pacific)</w:t>
+            </w:r>
+          </w:p>
+        </w:tc>
+        <w:tc>
+          <w:tcPr>
+            <w:tcW w:type="dxa" w:w="2514"/>
+            <w:tcBorders>
+              <w:top w:val="single" w:color="BFC7D5" w:sz="4"/>
+              <w:left w:val="single" w:color="BFC7D5" w:sz="4"/>
+              <w:bottom w:val="single" w:color="BFC7D5" w:sz="4"/>
+              <w:right w:val="single" w:color="BFC7D5" w:sz="4"/>
+            </w:tcBorders>
+            <w:tcMar>
+              <w:top w:type="dxa" w:w="60"/>
+              <w:left w:type="dxa" w:w="90"/>
+              <w:bottom w:type="dxa" w:w="60"/>
+              <w:right w:type="dxa" w:w="90"/>
+            </w:tcMar>
+          </w:tcPr>
+          <w:p>
+            <w:r>
+              <w:rPr>
+                <w:b w:val="false"/>
+                <w:bCs w:val="false"/>
+                <w:color w:val="222222"/>
+                <w:sz w:val="17"/>
+                <w:szCs w:val="17"/>
+              </w:rPr>
+              <w:t xml:space="preserve">EM26-28 CON-2026-04</w:t>
+            </w:r>
+          </w:p>
+        </w:tc>
+        <w:tc>
+          <w:tcPr>
+            <w:tcW w:type="dxa" w:w="2420"/>
+            <w:tcBorders>
+              <w:top w:val="single" w:color="BFC7D5" w:sz="4"/>
+              <w:left w:val="single" w:color="BFC7D5" w:sz="4"/>
+              <w:bottom w:val="single" w:color="BFC7D5" w:sz="4"/>
+              <w:right w:val="single" w:color="BFC7D5" w:sz="4"/>
+            </w:tcBorders>
+            <w:tcMar>
+              <w:top w:type="dxa" w:w="60"/>
+              <w:left w:type="dxa" w:w="90"/>
+              <w:bottom w:type="dxa" w:w="60"/>
+              <w:right w:type="dxa" w:w="90"/>
+            </w:tcMar>
+          </w:tcPr>
+          <w:p>
+            <w:r>
+              <w:rPr>
+                <w:b w:val="false"/>
+                <w:bCs w:val="false"/>
+                <w:color w:val="222222"/>
+                <w:sz w:val="17"/>
+                <w:szCs w:val="17"/>
+              </w:rPr>
+              <w:t xml:space="preserve">Requirements and contract in evaluation</w:t>
+            </w:r>
+          </w:p>
+        </w:tc>
+      </w:tr>
+    </w:tbl>
+    <w:p>
+      <w:pPr>
+        <w:spacing w:after="120"/>
+      </w:pPr>
+    </w:p>
+    <w:p>
+      <w:pPr>
+        <w:pStyle w:val="Heading1"/>
+      </w:pPr>
+      <w:r>
+        <w:t xml:space="preserve">5. How a change is handled</w:t>
       </w:r>
     </w:p>
     <w:p>
@@ -3034,7 +5052,7 @@
         <w:spacing w:after="60"/>
       </w:pPr>
       <w:r>
-        <w:t xml:space="preserve">The request is raised in a client or design review and recorded in EM26-19.</w:t>
+        <w:t xml:space="preserve">Raised in a client or design meeting; the meeting is recorded as a review in EM26-19 with the decision and actions.</w:t>
       </w:r>
     </w:p>
     <w:p>
@@ -3047,7 +5065,7 @@
         <w:spacing w:after="60"/>
       </w:pPr>
       <w:r>
-        <w:t xml:space="preserve">Impact on scope, schedule and other requirements is assessed; significant changes use FRM-02 and REG-07 (SOP-06 §6).</w:t>
+        <w:t xml:space="preserve">Impact on scope, design and schedule assessed; significant changes use FRM-02 and the change register REG-07 (SOP-06 §6).</w:t>
       </w:r>
     </w:p>
     <w:p>
@@ -3060,7 +5078,7 @@
         <w:spacing w:after="60"/>
       </w:pPr>
       <w:r>
-        <w:t xml:space="preserve">The requirement registers (EM26-20, EM26-21) are updated; the change is delivered in the next version and verified by its test.</w:t>
+        <w:t xml:space="preserve">Requirement registers EM26-20 / EM26-21 updated; delivered in the next version; verified by its test.</w:t>
       </w:r>
     </w:p>
     <w:sectPr>

</xml_diff>